<commit_message>
fix: modelos de O.S fiéis ao original (layout, logos e artes oficiais)
</commit_message>
<xml_diff>
--- a/backend/templates/OS_CONSTRUCAO.docx
+++ b/backend/templates/OS_CONSTRUCAO.docx
@@ -4,40 +4,645 @@
   <w:body>
     <w:p>
       <w:pPr>
-        <w:jc w:val="center"/>
+        <w:autoSpaceDN w:val="0"/>
+        <w:autoSpaceDE w:val="0"/>
+        <w:widowControl/>
+        <w:spacing w:line="142" w:lineRule="exact" w:before="0" w:after="0"/>
+        <w:ind w:left="0" w:right="0"/>
       </w:pPr>
-      <w:r>
-        <w:rPr>
-          <w:rFonts w:ascii="Arial" w:hAnsi="Arial"/>
-          <w:b/>
-          <w:sz w:val="32"/>
-        </w:rPr>
-        <w:t>ORDEM DE SERVIÇO</w:t>
-      </w:r>
     </w:p>
     <w:tbl>
       <w:tblPr>
-        <w:tblStyle w:val="TableGrid"/>
         <w:tblW w:type="auto" w:w="0"/>
-        <w:jc w:val="center"/>
+        <w:tblLayout w:type="fixed"/>
         <w:tblLook w:firstColumn="1" w:firstRow="1" w:lastColumn="0" w:lastRow="0" w:noHBand="0" w:noVBand="1" w:val="04A0"/>
+        <w:tblInd w:w="0.0" w:type="dxa"/>
       </w:tblPr>
       <w:tblGrid>
-        <w:gridCol w:w="5100"/>
-        <w:gridCol w:w="5100"/>
+        <w:gridCol w:w="1420"/>
+        <w:gridCol w:w="1420"/>
+        <w:gridCol w:w="1420"/>
+        <w:gridCol w:w="1420"/>
+        <w:gridCol w:w="1420"/>
+        <w:gridCol w:w="1420"/>
+        <w:gridCol w:w="1420"/>
+        <w:gridCol w:w="1420"/>
       </w:tblGrid>
       <w:tr>
+        <w:trPr>
+          <w:trHeight w:hRule="exact" w:val="804"/>
+        </w:trPr>
         <w:tc>
           <w:tcPr>
-            <w:tcW w:type="dxa" w:w="5100"/>
+            <w:tcW w:type="dxa" w:w="2802"/>
+            <w:gridSpan w:val="2"/>
+            <w:tcBorders>
+              <w:bottom w:sz="2.2639999389648438" w:val="single" w:color="#000000"/>
+            </w:tcBorders>
+            <w:tcMar>
+              <w:start w:w="0" w:type="dxa"/>
+              <w:end w:w="0" w:type="dxa"/>
+            </w:tcMar>
+            <w:tcMar>
+              <w:start w:w="0" w:type="dxa"/>
+              <w:end w:w="0" w:type="dxa"/>
+            </w:tcMar>
           </w:tcPr>
           <w:p>
-            <w:r/>
+            <w:pPr>
+              <w:autoSpaceDN w:val="0"/>
+              <w:autoSpaceDE w:val="0"/>
+              <w:widowControl/>
+              <w:spacing w:line="240" w:lineRule="auto" w:before="0" w:after="0"/>
+              <w:ind w:left="4" w:right="0" w:firstLine="0"/>
+              <w:jc w:val="left"/>
+            </w:pPr>
+            <w:r>
+              <w:drawing>
+                <wp:inline xmlns:a="http://schemas.openxmlformats.org/drawingml/2006/main" xmlns:pic="http://schemas.openxmlformats.org/drawingml/2006/picture">
+                  <wp:extent cx="1250950" cy="370840"/>
+                  <wp:docPr id="1" name="Picture 1"/>
+                  <wp:cNvGraphicFramePr>
+                    <a:graphicFrameLocks noChangeAspect="1"/>
+                  </wp:cNvGraphicFramePr>
+                  <a:graphic>
+                    <a:graphicData uri="http://schemas.openxmlformats.org/drawingml/2006/picture">
+                      <pic:pic>
+                        <pic:nvPicPr>
+                          <pic:cNvPr id="0" name="image.png"/>
+                          <pic:cNvPicPr/>
+                        </pic:nvPicPr>
+                        <pic:blipFill>
+                          <a:blip r:embed="rId9"/>
+                          <a:stretch>
+                            <a:fillRect/>
+                          </a:stretch>
+                        </pic:blipFill>
+                        <pic:spPr>
+                          <a:xfrm>
+                            <a:off x="0" y="0"/>
+                            <a:ext cx="1250950" cy="370840"/>
+                          </a:xfrm>
+                          <a:prstGeom prst="rect"/>
+                        </pic:spPr>
+                      </pic:pic>
+                    </a:graphicData>
+                  </a:graphic>
+                </wp:inline>
+              </w:drawing>
+            </w:r>
+          </w:p>
+        </w:tc>
+        <w:tc>
+          <w:tcPr>
+            <w:tcW w:type="dxa" w:w="5198"/>
+            <w:gridSpan w:val="3"/>
+            <w:tcBorders>
+              <w:bottom w:sz="2.2639999389648438" w:val="single" w:color="#000000"/>
+            </w:tcBorders>
+            <w:tcMar>
+              <w:start w:w="0" w:type="dxa"/>
+              <w:end w:w="0" w:type="dxa"/>
+            </w:tcMar>
+            <w:tcMar>
+              <w:start w:w="0" w:type="dxa"/>
+              <w:end w:w="0" w:type="dxa"/>
+            </w:tcMar>
+            <w:tcMar>
+              <w:start w:w="0" w:type="dxa"/>
+              <w:end w:w="0" w:type="dxa"/>
+            </w:tcMar>
+          </w:tcPr>
+          <w:p>
+            <w:pPr>
+              <w:autoSpaceDN w:val="0"/>
+              <w:autoSpaceDE w:val="0"/>
+              <w:widowControl/>
+              <w:spacing w:line="418" w:lineRule="exact" w:before="72" w:after="0"/>
+              <w:ind w:left="0" w:right="838" w:firstLine="0"/>
+              <w:jc w:val="right"/>
+            </w:pPr>
             <w:r>
               <w:rPr>
-                <w:rFonts w:ascii="Arial" w:hAnsi="Arial"/>
+                <w:rFonts w:ascii="" w:hAnsi="" w:eastAsia=""/>
                 <w:b/>
-                <w:sz w:val="22"/>
+                <w:i w:val="0"/>
+                <w:color w:val="303030"/>
+                <w:sz w:val="36"/>
+              </w:rPr>
+              <w:t>Ordem de Serviço</w:t>
+            </w:r>
+          </w:p>
+        </w:tc>
+        <w:tc>
+          <w:tcPr>
+            <w:tcW w:type="dxa" w:w="1224"/>
+            <w:tcBorders>
+              <w:bottom w:sz="2.2639999389648438" w:val="single" w:color="#000000"/>
+            </w:tcBorders>
+            <w:tcMar>
+              <w:start w:w="0" w:type="dxa"/>
+              <w:end w:w="0" w:type="dxa"/>
+            </w:tcMar>
+          </w:tcPr>
+          <w:p/>
+        </w:tc>
+        <w:tc>
+          <w:tcPr>
+            <w:tcW w:type="dxa" w:w="1438"/>
+            <w:tcBorders>
+              <w:bottom w:sz="2.2639999389648438" w:val="single" w:color="#000000"/>
+            </w:tcBorders>
+            <w:tcMar>
+              <w:start w:w="0" w:type="dxa"/>
+              <w:end w:w="0" w:type="dxa"/>
+            </w:tcMar>
+          </w:tcPr>
+          <w:p/>
+        </w:tc>
+        <w:tc>
+          <w:tcPr>
+            <w:tcW w:type="dxa" w:w="682"/>
+            <w:tcBorders>
+              <w:bottom w:sz="2.2639999389648438" w:val="single" w:color="#000000"/>
+            </w:tcBorders>
+            <w:tcMar>
+              <w:start w:w="0" w:type="dxa"/>
+              <w:end w:w="0" w:type="dxa"/>
+            </w:tcMar>
+          </w:tcPr>
+          <w:p/>
+        </w:tc>
+      </w:tr>
+      <w:tr>
+        <w:trPr>
+          <w:trHeight w:hRule="exact" w:val="466"/>
+        </w:trPr>
+        <w:tc>
+          <w:tcPr>
+            <w:tcW w:type="dxa" w:w="2802"/>
+            <w:gridSpan w:val="2"/>
+            <w:tcBorders>
+              <w:top w:sz="2.2639999389648438" w:val="single" w:color="#000000"/>
+              <w:bottom w:sz="2.2639999389648438" w:val="single" w:color="#C0C0C0"/>
+            </w:tcBorders>
+            <w:tcMar>
+              <w:start w:w="0" w:type="dxa"/>
+              <w:end w:w="0" w:type="dxa"/>
+            </w:tcMar>
+            <w:tcMar>
+              <w:start w:w="0" w:type="dxa"/>
+              <w:end w:w="0" w:type="dxa"/>
+            </w:tcMar>
+          </w:tcPr>
+          <w:p>
+            <w:pPr>
+              <w:autoSpaceDN w:val="0"/>
+              <w:autoSpaceDE w:val="0"/>
+              <w:widowControl/>
+              <w:spacing w:line="280" w:lineRule="exact" w:before="182" w:after="0"/>
+              <w:ind w:left="162" w:right="0" w:firstLine="0"/>
+              <w:jc w:val="left"/>
+            </w:pPr>
+            <w:r>
+              <w:rPr>
+                <w:rFonts w:ascii="" w:hAnsi="" w:eastAsia=""/>
+                <w:b w:val="0"/>
+                <w:i w:val="0"/>
+                <w:color w:val="303030"/>
+                <w:sz w:val="18"/>
+              </w:rPr>
+              <w:t>Ord.Serv. {{codigo}}</w:t>
+            </w:r>
+          </w:p>
+        </w:tc>
+        <w:tc>
+          <w:tcPr>
+            <w:tcW w:type="dxa" w:w="1690"/>
+            <w:tcBorders>
+              <w:top w:sz="2.2639999389648438" w:val="single" w:color="#000000"/>
+              <w:end w:sz="2.2639999389648438" w:val="single" w:color="#C0C0C0"/>
+              <w:bottom w:sz="2.2639999389648438" w:val="single" w:color="#C0C0C0"/>
+            </w:tcBorders>
+            <w:tcMar>
+              <w:start w:w="0" w:type="dxa"/>
+              <w:end w:w="0" w:type="dxa"/>
+            </w:tcMar>
+          </w:tcPr>
+          <w:p>
+            <w:pPr>
+              <w:autoSpaceDN w:val="0"/>
+              <w:autoSpaceDE w:val="0"/>
+              <w:widowControl/>
+              <w:spacing w:line="208" w:lineRule="exact" w:before="186" w:after="0"/>
+              <w:ind w:left="0" w:right="116" w:firstLine="0"/>
+              <w:jc w:val="right"/>
+            </w:pPr>
+            <w:r>
+              <w:rPr>
+                <w:rFonts w:ascii="" w:hAnsi="" w:eastAsia=""/>
+                <w:b w:val="0"/>
+                <w:i w:val="0"/>
+                <w:color w:val="303030"/>
+                <w:sz w:val="18"/>
+              </w:rPr>
+              <w:t>Equipe</w:t>
+            </w:r>
+          </w:p>
+        </w:tc>
+        <w:tc>
+          <w:tcPr>
+            <w:tcW w:type="dxa" w:w="2216"/>
+            <w:tcBorders>
+              <w:start w:sz="2.2639999389648438" w:val="single" w:color="#C0C0C0"/>
+              <w:top w:sz="2.2639999389648438" w:val="single" w:color="#000000"/>
+              <w:end w:sz="2.2639999389648438" w:val="single" w:color="#C0C0C0"/>
+              <w:bottom w:sz="2.2639999389648438" w:val="single" w:color="#C0C0C0"/>
+            </w:tcBorders>
+            <w:tcMar>
+              <w:start w:w="0" w:type="dxa"/>
+              <w:end w:w="0" w:type="dxa"/>
+            </w:tcMar>
+          </w:tcPr>
+          <w:p>
+            <w:pPr>
+              <w:autoSpaceDN w:val="0"/>
+              <w:autoSpaceDE w:val="0"/>
+              <w:widowControl/>
+              <w:spacing w:line="208" w:lineRule="exact" w:before="186" w:after="0"/>
+              <w:ind w:left="50" w:right="0" w:firstLine="0"/>
+              <w:jc w:val="left"/>
+            </w:pPr>
+            <w:r>
+              <w:rPr>
+                <w:rFonts w:ascii="" w:hAnsi="" w:eastAsia=""/>
+                <w:b w:val="0"/>
+                <w:i w:val="0"/>
+                <w:color w:val="303030"/>
+                <w:sz w:val="18"/>
+              </w:rPr>
+              <w:t>{{equipe}}</w:t>
+            </w:r>
+          </w:p>
+        </w:tc>
+        <w:tc>
+          <w:tcPr>
+            <w:tcW w:type="dxa" w:w="1292"/>
+            <w:tcBorders>
+              <w:start w:sz="2.2639999389648438" w:val="single" w:color="#C0C0C0"/>
+              <w:top w:sz="2.2639999389648438" w:val="single" w:color="#000000"/>
+              <w:bottom w:sz="2.2639999389648438" w:val="single" w:color="#C0C0C0"/>
+            </w:tcBorders>
+            <w:tcMar>
+              <w:start w:w="0" w:type="dxa"/>
+              <w:end w:w="0" w:type="dxa"/>
+            </w:tcMar>
+          </w:tcPr>
+          <w:p>
+            <w:pPr>
+              <w:autoSpaceDN w:val="0"/>
+              <w:autoSpaceDE w:val="0"/>
+              <w:widowControl/>
+              <w:spacing w:line="208" w:lineRule="exact" w:before="186" w:after="0"/>
+              <w:ind w:left="288" w:right="0" w:firstLine="0"/>
+              <w:jc w:val="left"/>
+            </w:pPr>
+            <w:r>
+              <w:rPr>
+                <w:rFonts w:ascii="" w:hAnsi="" w:eastAsia=""/>
+                <w:b w:val="0"/>
+                <w:i w:val="0"/>
+                <w:color w:val="303030"/>
+                <w:sz w:val="18"/>
+              </w:rPr>
+              <w:t>ID Obra</w:t>
+            </w:r>
+          </w:p>
+        </w:tc>
+        <w:tc>
+          <w:tcPr>
+            <w:tcW w:type="dxa" w:w="1224"/>
+            <w:tcBorders>
+              <w:top w:sz="2.2639999389648438" w:val="single" w:color="#000000"/>
+              <w:bottom w:sz="2.2639999389648438" w:val="single" w:color="#C0C0C0"/>
+            </w:tcBorders>
+            <w:tcMar>
+              <w:start w:w="0" w:type="dxa"/>
+              <w:end w:w="0" w:type="dxa"/>
+            </w:tcMar>
+          </w:tcPr>
+          <w:p>
+            <w:pPr>
+              <w:autoSpaceDN w:val="0"/>
+              <w:autoSpaceDE w:val="0"/>
+              <w:widowControl/>
+              <w:spacing w:line="208" w:lineRule="exact" w:before="186" w:after="0"/>
+              <w:ind w:left="0" w:right="488" w:firstLine="0"/>
+              <w:jc w:val="right"/>
+            </w:pPr>
+            <w:r>
+              <w:rPr>
+                <w:rFonts w:ascii="" w:hAnsi="" w:eastAsia=""/>
+                <w:b w:val="0"/>
+                <w:i w:val="0"/>
+                <w:color w:val="303030"/>
+                <w:sz w:val="18"/>
+              </w:rPr>
+              <w:t>{{id_obra}}</w:t>
+            </w:r>
+          </w:p>
+        </w:tc>
+        <w:tc>
+          <w:tcPr>
+            <w:tcW w:type="dxa" w:w="1438"/>
+            <w:tcBorders>
+              <w:top w:sz="2.2639999389648438" w:val="single" w:color="#000000"/>
+              <w:bottom w:sz="2.2639999389648438" w:val="single" w:color="#C0C0C0"/>
+            </w:tcBorders>
+            <w:tcMar>
+              <w:start w:w="0" w:type="dxa"/>
+              <w:end w:w="0" w:type="dxa"/>
+            </w:tcMar>
+          </w:tcPr>
+          <w:p>
+            <w:pPr>
+              <w:autoSpaceDN w:val="0"/>
+              <w:autoSpaceDE w:val="0"/>
+              <w:widowControl/>
+              <w:spacing w:line="208" w:lineRule="exact" w:before="186" w:after="0"/>
+              <w:ind w:left="0" w:right="198" w:firstLine="0"/>
+              <w:jc w:val="right"/>
+            </w:pPr>
+            <w:r>
+              <w:rPr>
+                <w:rFonts w:ascii="" w:hAnsi="" w:eastAsia=""/>
+                <w:b w:val="0"/>
+                <w:i w:val="0"/>
+                <w:color w:val="303030"/>
+                <w:sz w:val="18"/>
+              </w:rPr>
+              <w:t>Agência</w:t>
+            </w:r>
+          </w:p>
+        </w:tc>
+        <w:tc>
+          <w:tcPr>
+            <w:tcW w:type="dxa" w:w="682"/>
+            <w:tcBorders>
+              <w:top w:sz="2.2639999389648438" w:val="single" w:color="#000000"/>
+              <w:bottom w:sz="2.2639999389648438" w:val="single" w:color="#C0C0C0"/>
+            </w:tcBorders>
+            <w:tcMar>
+              <w:start w:w="0" w:type="dxa"/>
+              <w:end w:w="0" w:type="dxa"/>
+            </w:tcMar>
+          </w:tcPr>
+          <w:p>
+            <w:pPr>
+              <w:autoSpaceDN w:val="0"/>
+              <w:autoSpaceDE w:val="0"/>
+              <w:widowControl/>
+              <w:spacing w:line="208" w:lineRule="exact" w:before="186" w:after="0"/>
+              <w:ind w:left="18" w:right="0" w:firstLine="0"/>
+              <w:jc w:val="left"/>
+            </w:pPr>
+            <w:r>
+              <w:rPr>
+                <w:rFonts w:ascii="" w:hAnsi="" w:eastAsia=""/>
+                <w:b w:val="0"/>
+                <w:i w:val="0"/>
+                <w:color w:val="303030"/>
+                <w:sz w:val="18"/>
+              </w:rPr>
+              <w:t>{{agencia}}</w:t>
+            </w:r>
+          </w:p>
+        </w:tc>
+      </w:tr>
+      <w:tr>
+        <w:trPr>
+          <w:trHeight w:hRule="exact" w:val="510"/>
+        </w:trPr>
+        <w:tc>
+          <w:tcPr>
+            <w:tcW w:type="dxa" w:w="968"/>
+            <w:tcBorders>
+              <w:top w:sz="2.2639999389648438" w:val="single" w:color="#C0C0C0"/>
+              <w:end w:sz="2.2639999389648438" w:val="single" w:color="#C0C0C0"/>
+              <w:bottom w:sz="2.2639999389648438" w:val="single" w:color="#C0C0C0"/>
+            </w:tcBorders>
+            <w:tcMar>
+              <w:start w:w="0" w:type="dxa"/>
+              <w:end w:w="0" w:type="dxa"/>
+            </w:tcMar>
+          </w:tcPr>
+          <w:p>
+            <w:pPr>
+              <w:autoSpaceDN w:val="0"/>
+              <w:autoSpaceDE w:val="0"/>
+              <w:widowControl/>
+              <w:spacing w:line="208" w:lineRule="exact" w:before="234" w:after="0"/>
+              <w:ind w:left="0" w:right="148" w:firstLine="0"/>
+              <w:jc w:val="right"/>
+            </w:pPr>
+            <w:r>
+              <w:rPr>
+                <w:rFonts w:ascii="" w:hAnsi="" w:eastAsia=""/>
+                <w:b w:val="0"/>
+                <w:i w:val="0"/>
+                <w:color w:val="303030"/>
+                <w:sz w:val="18"/>
+              </w:rPr>
+              <w:t>Data</w:t>
+            </w:r>
+          </w:p>
+        </w:tc>
+        <w:tc>
+          <w:tcPr>
+            <w:tcW w:type="dxa" w:w="1834"/>
+            <w:tcBorders>
+              <w:start w:sz="2.2639999389648438" w:val="single" w:color="#C0C0C0"/>
+              <w:top w:sz="2.2639999389648438" w:val="single" w:color="#C0C0C0"/>
+              <w:bottom w:sz="2.2639999389648438" w:val="single" w:color="#C0C0C0"/>
+            </w:tcBorders>
+            <w:tcMar>
+              <w:start w:w="0" w:type="dxa"/>
+              <w:end w:w="0" w:type="dxa"/>
+            </w:tcMar>
+          </w:tcPr>
+          <w:p>
+            <w:pPr>
+              <w:autoSpaceDN w:val="0"/>
+              <w:autoSpaceDE w:val="0"/>
+              <w:widowControl/>
+              <w:spacing w:line="208" w:lineRule="exact" w:before="234" w:after="0"/>
+              <w:ind w:left="52" w:right="0" w:firstLine="0"/>
+              <w:jc w:val="left"/>
+            </w:pPr>
+            <w:r>
+              <w:rPr>
+                <w:rFonts w:ascii="" w:hAnsi="" w:eastAsia=""/>
+                <w:b w:val="0"/>
+                <w:i w:val="0"/>
+                <w:color w:val="303030"/>
+                <w:sz w:val="18"/>
+              </w:rPr>
+              <w:t>{{data}}</w:t>
+            </w:r>
+          </w:p>
+        </w:tc>
+        <w:tc>
+          <w:tcPr>
+            <w:tcW w:type="dxa" w:w="1690"/>
+            <w:tcBorders>
+              <w:top w:sz="2.2639999389648438" w:val="single" w:color="#C0C0C0"/>
+              <w:end w:sz="2.2639999389648438" w:val="single" w:color="#C0C0C0"/>
+              <w:bottom w:sz="2.2639999389648438" w:val="single" w:color="#C0C0C0"/>
+            </w:tcBorders>
+            <w:tcMar>
+              <w:start w:w="0" w:type="dxa"/>
+              <w:end w:w="0" w:type="dxa"/>
+            </w:tcMar>
+          </w:tcPr>
+          <w:p>
+            <w:pPr>
+              <w:autoSpaceDN w:val="0"/>
+              <w:autoSpaceDE w:val="0"/>
+              <w:widowControl/>
+              <w:spacing w:line="208" w:lineRule="exact" w:before="234" w:after="0"/>
+              <w:ind w:left="0" w:right="114" w:firstLine="0"/>
+              <w:jc w:val="right"/>
+            </w:pPr>
+            <w:r>
+              <w:rPr>
+                <w:rFonts w:ascii="" w:hAnsi="" w:eastAsia=""/>
+                <w:b w:val="0"/>
+                <w:i w:val="0"/>
+                <w:color w:val="303030"/>
+                <w:sz w:val="18"/>
+              </w:rPr>
+              <w:t>Encarregado</w:t>
+            </w:r>
+          </w:p>
+        </w:tc>
+        <w:tc>
+          <w:tcPr>
+            <w:tcW w:type="dxa" w:w="3508"/>
+            <w:gridSpan w:val="2"/>
+            <w:tcBorders>
+              <w:start w:sz="2.2639999389648438" w:val="single" w:color="#C0C0C0"/>
+              <w:top w:sz="2.2639999389648438" w:val="single" w:color="#C0C0C0"/>
+              <w:bottom w:sz="2.2639999389648438" w:val="single" w:color="#C0C0C0"/>
+            </w:tcBorders>
+            <w:tcMar>
+              <w:start w:w="0" w:type="dxa"/>
+              <w:end w:w="0" w:type="dxa"/>
+            </w:tcMar>
+            <w:tcMar>
+              <w:start w:w="0" w:type="dxa"/>
+              <w:end w:w="0" w:type="dxa"/>
+            </w:tcMar>
+          </w:tcPr>
+          <w:p>
+            <w:pPr>
+              <w:autoSpaceDN w:val="0"/>
+              <w:autoSpaceDE w:val="0"/>
+              <w:widowControl/>
+              <w:spacing w:line="208" w:lineRule="exact" w:before="234" w:after="0"/>
+              <w:ind w:left="50" w:right="0" w:firstLine="0"/>
+              <w:jc w:val="left"/>
+            </w:pPr>
+            <w:r>
+              <w:rPr>
+                <w:rFonts w:ascii="" w:hAnsi="" w:eastAsia=""/>
+                <w:b w:val="0"/>
+                <w:i w:val="0"/>
+                <w:color w:val="303030"/>
+                <w:sz w:val="18"/>
+              </w:rPr>
+              <w:t>{{encarregado}}</w:t>
+            </w:r>
+          </w:p>
+        </w:tc>
+        <w:tc>
+          <w:tcPr>
+            <w:tcW w:type="dxa" w:w="1224"/>
+            <w:tcBorders>
+              <w:top w:sz="2.2639999389648438" w:val="single" w:color="#C0C0C0"/>
+              <w:bottom w:sz="2.2639999389648438" w:val="single" w:color="#C0C0C0"/>
+            </w:tcBorders>
+            <w:tcMar>
+              <w:start w:w="0" w:type="dxa"/>
+              <w:end w:w="0" w:type="dxa"/>
+            </w:tcMar>
+          </w:tcPr>
+          <w:p/>
+        </w:tc>
+        <w:tc>
+          <w:tcPr>
+            <w:tcW w:type="dxa" w:w="1438"/>
+            <w:tcBorders>
+              <w:top w:sz="2.2639999389648438" w:val="single" w:color="#C0C0C0"/>
+              <w:bottom w:sz="2.2639999389648438" w:val="single" w:color="#C0C0C0"/>
+            </w:tcBorders>
+            <w:tcMar>
+              <w:start w:w="0" w:type="dxa"/>
+              <w:end w:w="0" w:type="dxa"/>
+            </w:tcMar>
+          </w:tcPr>
+          <w:p/>
+        </w:tc>
+        <w:tc>
+          <w:tcPr>
+            <w:tcW w:type="dxa" w:w="682"/>
+            <w:tcBorders>
+              <w:top w:sz="2.2639999389648438" w:val="single" w:color="#C0C0C0"/>
+              <w:bottom w:sz="2.2639999389648438" w:val="single" w:color="#C0C0C0"/>
+            </w:tcBorders>
+            <w:tcMar>
+              <w:start w:w="0" w:type="dxa"/>
+              <w:end w:w="0" w:type="dxa"/>
+            </w:tcMar>
+          </w:tcPr>
+          <w:p/>
+        </w:tc>
+      </w:tr>
+      <w:tr>
+        <w:trPr>
+          <w:trHeight w:hRule="exact" w:val="460"/>
+        </w:trPr>
+        <w:tc>
+          <w:tcPr>
+            <w:tcW w:type="dxa" w:w="2802"/>
+            <w:tcBorders>
+              <w:top w:sz="2.2639999389648438" w:val="single" w:color="#C0C0C0"/>
+              <w:bottom w:sz="2.2639999389648438" w:val="single" w:color="#C0C0C0"/>
+            </w:tcBorders>
+            <w:tcMar>
+              <w:start w:w="0" w:type="dxa"/>
+              <w:end w:w="0" w:type="dxa"/>
+            </w:tcMar>
+            <w:tcMar>
+              <w:start w:w="0" w:type="dxa"/>
+              <w:end w:w="0" w:type="dxa"/>
+            </w:tcMar>
+          </w:tcPr>
+          <w:p>
+            <w:pPr>
+              <w:autoSpaceDN w:val="0"/>
+              <w:autoSpaceDE w:val="0"/>
+              <w:widowControl/>
+              <w:spacing w:line="210" w:lineRule="exact" w:before="184" w:after="0"/>
+              <w:ind w:left="434" w:right="0" w:firstLine="0"/>
+              <w:jc w:val="left"/>
+            </w:pPr>
+            <w:r>
+              <w:rPr>
+                <w:rFonts w:ascii="" w:hAnsi="" w:eastAsia=""/>
+                <w:b w:val="0"/>
+                <w:i w:val="0"/>
+                <w:color w:val="303030"/>
+                <w:sz w:val="18"/>
               </w:rPr>
               <w:t>Obra</w:t>
             </w:r>
@@ -45,339 +650,166 @@
         </w:tc>
         <w:tc>
           <w:tcPr>
-            <w:tcW w:type="dxa" w:w="5100"/>
+            <w:tcW w:type="dxa" w:w="2802"/>
+            <w:tcBorders>
+              <w:top w:sz="2.2639999389648438" w:val="single" w:color="#C0C0C0"/>
+              <w:bottom w:sz="2.2639999389648438" w:val="single" w:color="#C0C0C0"/>
+            </w:tcBorders>
+            <w:tcMar>
+              <w:start w:w="0" w:type="dxa"/>
+              <w:end w:w="0" w:type="dxa"/>
+            </w:tcMar>
+            <w:tcMar>
+              <w:start w:w="0" w:type="dxa"/>
+              <w:end w:w="0" w:type="dxa"/>
+            </w:tcMar>
           </w:tcPr>
           <w:p>
-            <w:r/>
             <w:r>
-              <w:rPr>
-                <w:rFonts w:ascii="Arial" w:hAnsi="Arial"/>
-                <w:b w:val="0"/>
-                <w:sz w:val="22"/>
-              </w:rPr>
               <w:t>{{obra}}</w:t>
-            </w:r>
-          </w:p>
-        </w:tc>
-      </w:tr>
-      <w:tr>
-        <w:tc>
-          <w:tcPr>
-            <w:tcW w:type="dxa" w:w="5100"/>
-          </w:tcPr>
-          <w:p>
-            <w:r/>
-            <w:r>
-              <w:rPr>
-                <w:rFonts w:ascii="Arial" w:hAnsi="Arial"/>
-                <w:b/>
-                <w:sz w:val="22"/>
-              </w:rPr>
-              <w:t>Agência CDA</w:t>
             </w:r>
           </w:p>
         </w:tc>
         <w:tc>
           <w:tcPr>
-            <w:tcW w:type="dxa" w:w="5100"/>
+            <w:tcW w:type="dxa" w:w="5198"/>
+            <w:gridSpan w:val="3"/>
+            <w:tcBorders>
+              <w:top w:sz="2.2639999389648438" w:val="single" w:color="#C0C0C0"/>
+              <w:bottom w:sz="2.2639999389648438" w:val="single" w:color="#C0C0C0"/>
+            </w:tcBorders>
+            <w:tcMar>
+              <w:start w:w="0" w:type="dxa"/>
+              <w:end w:w="0" w:type="dxa"/>
+            </w:tcMar>
+            <w:tcMar>
+              <w:start w:w="0" w:type="dxa"/>
+              <w:end w:w="0" w:type="dxa"/>
+            </w:tcMar>
+            <w:tcMar>
+              <w:start w:w="0" w:type="dxa"/>
+              <w:end w:w="0" w:type="dxa"/>
+            </w:tcMar>
           </w:tcPr>
           <w:p>
-            <w:r/>
+            <w:pPr>
+              <w:autoSpaceDN w:val="0"/>
+              <w:autoSpaceDE w:val="0"/>
+              <w:widowControl/>
+              <w:spacing w:line="210" w:lineRule="exact" w:before="184" w:after="0"/>
+              <w:ind w:left="0" w:right="100" w:firstLine="0"/>
+              <w:jc w:val="right"/>
+            </w:pPr>
             <w:r>
               <w:rPr>
-                <w:rFonts w:ascii="Arial" w:hAnsi="Arial"/>
+                <w:rFonts w:ascii="" w:hAnsi="" w:eastAsia=""/>
                 <w:b w:val="0"/>
-                <w:sz w:val="22"/>
+                <w:i w:val="0"/>
+                <w:color w:val="303030"/>
+                <w:sz w:val="18"/>
               </w:rPr>
-              <w:t>{{agencia}}</w:t>
-            </w:r>
-          </w:p>
-        </w:tc>
-      </w:tr>
-      <w:tr>
-        <w:tc>
-          <w:tcPr>
-            <w:tcW w:type="dxa" w:w="5100"/>
-          </w:tcPr>
-          <w:p>
-            <w:r/>
-            <w:r>
-              <w:rPr>
-                <w:rFonts w:ascii="Arial" w:hAnsi="Arial"/>
-                <w:b/>
-                <w:sz w:val="22"/>
-              </w:rPr>
-              <w:t>Data</w:t>
+              <w:t>{{atividade}}</w:t>
             </w:r>
           </w:p>
         </w:tc>
         <w:tc>
           <w:tcPr>
-            <w:tcW w:type="dxa" w:w="5100"/>
+            <w:tcW w:type="dxa" w:w="1224"/>
+            <w:tcBorders>
+              <w:top w:sz="2.2639999389648438" w:val="single" w:color="#C0C0C0"/>
+              <w:bottom w:sz="2.2639999389648438" w:val="single" w:color="#C0C0C0"/>
+            </w:tcBorders>
+            <w:tcMar>
+              <w:start w:w="0" w:type="dxa"/>
+              <w:end w:w="0" w:type="dxa"/>
+            </w:tcMar>
           </w:tcPr>
           <w:p>
-            <w:r/>
+            <w:pPr>
+              <w:autoSpaceDN w:val="0"/>
+              <w:autoSpaceDE w:val="0"/>
+              <w:widowControl/>
+              <w:spacing w:line="210" w:lineRule="exact" w:before="184" w:after="0"/>
+              <w:ind w:left="118" w:right="0" w:firstLine="0"/>
+              <w:jc w:val="left"/>
+            </w:pPr>
             <w:r>
               <w:rPr>
-                <w:rFonts w:ascii="Arial" w:hAnsi="Arial"/>
+                <w:rFonts w:ascii="" w:hAnsi="" w:eastAsia=""/>
                 <w:b w:val="0"/>
-                <w:sz w:val="22"/>
+                <w:i w:val="0"/>
+                <w:color w:val="303030"/>
+                <w:sz w:val="18"/>
               </w:rPr>
-              <w:t>{{data}}</w:t>
-            </w:r>
-          </w:p>
-        </w:tc>
-      </w:tr>
-      <w:tr>
-        <w:tc>
-          <w:tcPr>
-            <w:tcW w:type="dxa" w:w="5100"/>
-          </w:tcPr>
-          <w:p>
-            <w:r/>
-            <w:r>
-              <w:rPr>
-                <w:rFonts w:ascii="Arial" w:hAnsi="Arial"/>
-                <w:b/>
-                <w:sz w:val="22"/>
-              </w:rPr>
-              <w:t>Equipe</w:t>
+              <w:t>CONSTRUÇÃO</w:t>
             </w:r>
           </w:p>
         </w:tc>
         <w:tc>
           <w:tcPr>
-            <w:tcW w:type="dxa" w:w="5100"/>
+            <w:tcW w:type="dxa" w:w="1438"/>
+            <w:tcBorders>
+              <w:top w:sz="2.2639999389648438" w:val="single" w:color="#C0C0C0"/>
+              <w:bottom w:sz="2.2639999389648438" w:val="single" w:color="#C0C0C0"/>
+            </w:tcBorders>
+            <w:tcMar>
+              <w:start w:w="0" w:type="dxa"/>
+              <w:end w:w="0" w:type="dxa"/>
+            </w:tcMar>
           </w:tcPr>
-          <w:p>
-            <w:r/>
-            <w:r>
-              <w:rPr>
-                <w:rFonts w:ascii="Arial" w:hAnsi="Arial"/>
-                <w:b w:val="0"/>
-                <w:sz w:val="22"/>
-              </w:rPr>
-              <w:t>{{equipe}}</w:t>
-            </w:r>
-          </w:p>
+          <w:p/>
+        </w:tc>
+        <w:tc>
+          <w:tcPr>
+            <w:tcW w:type="dxa" w:w="682"/>
+            <w:tcBorders>
+              <w:top w:sz="2.2639999389648438" w:val="single" w:color="#C0C0C0"/>
+              <w:bottom w:sz="2.2639999389648438" w:val="single" w:color="#C0C0C0"/>
+            </w:tcBorders>
+            <w:tcMar>
+              <w:start w:w="0" w:type="dxa"/>
+              <w:end w:w="0" w:type="dxa"/>
+            </w:tcMar>
+          </w:tcPr>
+          <w:p/>
         </w:tc>
       </w:tr>
       <w:tr>
+        <w:trPr>
+          <w:trHeight w:hRule="exact" w:val="420"/>
+        </w:trPr>
         <w:tc>
           <w:tcPr>
-            <w:tcW w:type="dxa" w:w="5100"/>
+            <w:tcW w:type="dxa" w:w="2802"/>
+            <w:tcBorders>
+              <w:top w:sz="2.2639999389648438" w:val="single" w:color="#C0C0C0"/>
+              <w:bottom w:sz="2.2639999389648438" w:val="single" w:color="#C0C0C0"/>
+            </w:tcBorders>
+            <w:tcMar>
+              <w:start w:w="0" w:type="dxa"/>
+              <w:end w:w="0" w:type="dxa"/>
+            </w:tcMar>
+            <w:tcMar>
+              <w:start w:w="0" w:type="dxa"/>
+              <w:end w:w="0" w:type="dxa"/>
+            </w:tcMar>
           </w:tcPr>
           <w:p>
-            <w:r/>
+            <w:pPr>
+              <w:autoSpaceDN w:val="0"/>
+              <w:autoSpaceDE w:val="0"/>
+              <w:widowControl/>
+              <w:spacing w:line="210" w:lineRule="exact" w:before="144" w:after="0"/>
+              <w:ind w:left="396" w:right="0" w:firstLine="0"/>
+              <w:jc w:val="left"/>
+            </w:pPr>
             <w:r>
               <w:rPr>
-                <w:rFonts w:ascii="Arial" w:hAnsi="Arial"/>
-                <w:b/>
-                <w:sz w:val="22"/>
-              </w:rPr>
-              <w:t>Encarregado</w:t>
-            </w:r>
-          </w:p>
-        </w:tc>
-        <w:tc>
-          <w:tcPr>
-            <w:tcW w:type="dxa" w:w="5100"/>
-          </w:tcPr>
-          <w:p>
-            <w:r/>
-            <w:r>
-              <w:rPr>
-                <w:rFonts w:ascii="Arial" w:hAnsi="Arial"/>
+                <w:rFonts w:ascii="" w:hAnsi="" w:eastAsia=""/>
                 <w:b w:val="0"/>
-                <w:sz w:val="22"/>
-              </w:rPr>
-              <w:t>{{encarregado}}</w:t>
-            </w:r>
-          </w:p>
-        </w:tc>
-      </w:tr>
-      <w:tr>
-        <w:tc>
-          <w:tcPr>
-            <w:tcW w:type="dxa" w:w="5100"/>
-          </w:tcPr>
-          <w:p>
-            <w:r/>
-            <w:r>
-              <w:rPr>
-                <w:rFonts w:ascii="Arial" w:hAnsi="Arial"/>
-                <w:b/>
-                <w:sz w:val="22"/>
-              </w:rPr>
-              <w:t>Município</w:t>
-            </w:r>
-          </w:p>
-        </w:tc>
-        <w:tc>
-          <w:tcPr>
-            <w:tcW w:type="dxa" w:w="5100"/>
-          </w:tcPr>
-          <w:p>
-            <w:r/>
-            <w:r>
-              <w:rPr>
-                <w:rFonts w:ascii="Arial" w:hAnsi="Arial"/>
-                <w:b w:val="0"/>
-                <w:sz w:val="22"/>
-              </w:rPr>
-              <w:t>{{municipio}}</w:t>
-            </w:r>
-          </w:p>
-        </w:tc>
-      </w:tr>
-      <w:tr>
-        <w:tc>
-          <w:tcPr>
-            <w:tcW w:type="dxa" w:w="5100"/>
-          </w:tcPr>
-          <w:p>
-            <w:r/>
-            <w:r>
-              <w:rPr>
-                <w:rFonts w:ascii="Arial" w:hAnsi="Arial"/>
-                <w:b/>
-                <w:sz w:val="22"/>
-              </w:rPr>
-              <w:t>Serviço a Executar</w:t>
-            </w:r>
-          </w:p>
-        </w:tc>
-        <w:tc>
-          <w:tcPr>
-            <w:tcW w:type="dxa" w:w="5100"/>
-          </w:tcPr>
-          <w:p>
-            <w:r/>
-            <w:r>
-              <w:rPr>
-                <w:rFonts w:ascii="Arial" w:hAnsi="Arial"/>
-                <w:b w:val="0"/>
-                <w:sz w:val="22"/>
-              </w:rPr>
-              <w:t>{{servico}}</w:t>
-            </w:r>
-          </w:p>
-        </w:tc>
-      </w:tr>
-      <w:tr>
-        <w:tc>
-          <w:tcPr>
-            <w:tcW w:type="dxa" w:w="5100"/>
-          </w:tcPr>
-          <w:p>
-            <w:r/>
-            <w:r>
-              <w:rPr>
-                <w:rFonts w:ascii="Arial" w:hAnsi="Arial"/>
-                <w:b/>
-                <w:sz w:val="22"/>
-              </w:rPr>
-              <w:t>Atividade</w:t>
-            </w:r>
-          </w:p>
-        </w:tc>
-        <w:tc>
-          <w:tcPr>
-            <w:tcW w:type="dxa" w:w="5100"/>
-          </w:tcPr>
-          <w:p>
-            <w:r/>
-            <w:r>
-              <w:rPr>
-                <w:rFonts w:ascii="Arial" w:hAnsi="Arial"/>
-                <w:b w:val="0"/>
-                <w:sz w:val="22"/>
-              </w:rPr>
-              <w:t>{{atividade}}</w:t>
-            </w:r>
-          </w:p>
-        </w:tc>
-      </w:tr>
-      <w:tr>
-        <w:tc>
-          <w:tcPr>
-            <w:tcW w:type="dxa" w:w="5100"/>
-          </w:tcPr>
-          <w:p>
-            <w:r/>
-            <w:r>
-              <w:rPr>
-                <w:rFonts w:ascii="Arial" w:hAnsi="Arial"/>
-                <w:b/>
-                <w:sz w:val="22"/>
-              </w:rPr>
-              <w:t>BT Energ.</w:t>
-            </w:r>
-          </w:p>
-        </w:tc>
-        <w:tc>
-          <w:tcPr>
-            <w:tcW w:type="dxa" w:w="5100"/>
-          </w:tcPr>
-          <w:p>
-            <w:r/>
-            <w:r>
-              <w:rPr>
-                <w:rFonts w:ascii="Arial" w:hAnsi="Arial"/>
-                <w:b w:val="0"/>
-                <w:sz w:val="22"/>
-              </w:rPr>
-              <w:t>[ {% if bt %}X{% endif %} ]</w:t>
-            </w:r>
-          </w:p>
-        </w:tc>
-      </w:tr>
-      <w:tr>
-        <w:tc>
-          <w:tcPr>
-            <w:tcW w:type="dxa" w:w="5100"/>
-          </w:tcPr>
-          <w:p>
-            <w:r/>
-            <w:r>
-              <w:rPr>
-                <w:rFonts w:ascii="Arial" w:hAnsi="Arial"/>
-                <w:b/>
-                <w:sz w:val="22"/>
-              </w:rPr>
-              <w:t>AT Energ. Bloqueio</w:t>
-            </w:r>
-          </w:p>
-        </w:tc>
-        <w:tc>
-          <w:tcPr>
-            <w:tcW w:type="dxa" w:w="5100"/>
-          </w:tcPr>
-          <w:p>
-            <w:r/>
-            <w:r>
-              <w:rPr>
-                <w:rFonts w:ascii="Arial" w:hAnsi="Arial"/>
-                <w:b w:val="0"/>
-                <w:sz w:val="22"/>
-              </w:rPr>
-              <w:t>[ {% if at %}X{% endif %} ]</w:t>
-            </w:r>
-          </w:p>
-        </w:tc>
-      </w:tr>
-      <w:tr>
-        <w:tc>
-          <w:tcPr>
-            <w:tcW w:type="dxa" w:w="5100"/>
-          </w:tcPr>
-          <w:p>
-            <w:r/>
-            <w:r>
-              <w:rPr>
-                <w:rFonts w:ascii="Arial" w:hAnsi="Arial"/>
-                <w:b/>
-                <w:sz w:val="22"/>
+                <w:i w:val="0"/>
+                <w:color w:val="303030"/>
+                <w:sz w:val="18"/>
               </w:rPr>
               <w:t>Local</w:t>
             </w:r>
@@ -385,256 +817,1165 @@
         </w:tc>
         <w:tc>
           <w:tcPr>
-            <w:tcW w:type="dxa" w:w="5100"/>
+            <w:tcW w:type="dxa" w:w="2802"/>
+            <w:tcBorders>
+              <w:top w:sz="2.2639999389648438" w:val="single" w:color="#C0C0C0"/>
+              <w:bottom w:sz="2.2639999389648438" w:val="single" w:color="#C0C0C0"/>
+            </w:tcBorders>
+            <w:tcMar>
+              <w:start w:w="0" w:type="dxa"/>
+              <w:end w:w="0" w:type="dxa"/>
+            </w:tcMar>
+            <w:tcMar>
+              <w:start w:w="0" w:type="dxa"/>
+              <w:end w:w="0" w:type="dxa"/>
+            </w:tcMar>
           </w:tcPr>
           <w:p>
-            <w:r/>
+            <w:r>
+              <w:t>{{local}}</w:t>
+            </w:r>
+          </w:p>
+        </w:tc>
+        <w:tc>
+          <w:tcPr>
+            <w:tcW w:type="dxa" w:w="5198"/>
+            <w:gridSpan w:val="3"/>
+            <w:tcBorders>
+              <w:top w:sz="2.2639999389648438" w:val="single" w:color="#C0C0C0"/>
+              <w:bottom w:sz="2.2639999389648438" w:val="single" w:color="#C0C0C0"/>
+            </w:tcBorders>
+            <w:tcMar>
+              <w:start w:w="0" w:type="dxa"/>
+              <w:end w:w="0" w:type="dxa"/>
+            </w:tcMar>
+            <w:tcMar>
+              <w:start w:w="0" w:type="dxa"/>
+              <w:end w:w="0" w:type="dxa"/>
+            </w:tcMar>
+            <w:tcMar>
+              <w:start w:w="0" w:type="dxa"/>
+              <w:end w:w="0" w:type="dxa"/>
+            </w:tcMar>
+          </w:tcPr>
+          <w:p>
+            <w:pPr>
+              <w:autoSpaceDN w:val="0"/>
+              <w:autoSpaceDE w:val="0"/>
+              <w:widowControl/>
+              <w:spacing w:line="210" w:lineRule="exact" w:before="144" w:after="0"/>
+              <w:ind w:left="0" w:right="98" w:firstLine="0"/>
+              <w:jc w:val="right"/>
+            </w:pPr>
             <w:r>
               <w:rPr>
-                <w:rFonts w:ascii="Arial" w:hAnsi="Arial"/>
+                <w:rFonts w:ascii="" w:hAnsi="" w:eastAsia=""/>
                 <w:b w:val="0"/>
-                <w:sz w:val="22"/>
+                <w:i w:val="0"/>
+                <w:color w:val="303030"/>
+                <w:sz w:val="18"/>
               </w:rPr>
-              <w:t>{{local}}</w:t>
+              <w:t>{{municipio}}</w:t>
+            </w:r>
+          </w:p>
+        </w:tc>
+        <w:tc>
+          <w:tcPr>
+            <w:tcW w:type="dxa" w:w="1224"/>
+            <w:tcBorders>
+              <w:top w:sz="2.2639999389648438" w:val="single" w:color="#C0C0C0"/>
+              <w:bottom w:sz="2.2639999389648438" w:val="single" w:color="#C0C0C0"/>
+            </w:tcBorders>
+            <w:tcMar>
+              <w:start w:w="0" w:type="dxa"/>
+              <w:end w:w="0" w:type="dxa"/>
+            </w:tcMar>
+          </w:tcPr>
+          <w:p>
+            <w:pPr>
+              <w:autoSpaceDN w:val="0"/>
+              <w:autoSpaceDE w:val="0"/>
+              <w:widowControl/>
+              <w:spacing w:line="210" w:lineRule="exact" w:before="144" w:after="0"/>
+              <w:ind w:left="118" w:right="0" w:firstLine="0"/>
+              <w:jc w:val="left"/>
+            </w:pPr>
+            <w:r>
+              <w:rPr>
+                <w:rFonts w:ascii="" w:hAnsi="" w:eastAsia=""/>
+                <w:b w:val="0"/>
+                <w:i w:val="0"/>
+                <w:color w:val="303030"/>
+                <w:sz w:val="18"/>
+              </w:rPr>
+              <w:t>Concórdia</w:t>
+            </w:r>
+          </w:p>
+        </w:tc>
+        <w:tc>
+          <w:tcPr>
+            <w:tcW w:type="dxa" w:w="1438"/>
+            <w:tcBorders>
+              <w:top w:sz="2.2639999389648438" w:val="single" w:color="#C0C0C0"/>
+              <w:bottom w:sz="2.2639999389648438" w:val="single" w:color="#C0C0C0"/>
+            </w:tcBorders>
+            <w:tcMar>
+              <w:start w:w="0" w:type="dxa"/>
+              <w:end w:w="0" w:type="dxa"/>
+            </w:tcMar>
+          </w:tcPr>
+          <w:p/>
+        </w:tc>
+        <w:tc>
+          <w:tcPr>
+            <w:tcW w:type="dxa" w:w="682"/>
+            <w:tcBorders>
+              <w:top w:sz="2.2639999389648438" w:val="single" w:color="#C0C0C0"/>
+              <w:bottom w:sz="2.2639999389648438" w:val="single" w:color="#C0C0C0"/>
+            </w:tcBorders>
+            <w:tcMar>
+              <w:start w:w="0" w:type="dxa"/>
+              <w:end w:w="0" w:type="dxa"/>
+            </w:tcMar>
+          </w:tcPr>
+          <w:p/>
+        </w:tc>
+      </w:tr>
+    </w:tbl>
+    <w:p>
+      <w:pPr>
+        <w:autoSpaceDN w:val="0"/>
+        <w:autoSpaceDE w:val="0"/>
+        <w:widowControl/>
+        <w:spacing w:line="208" w:lineRule="exact" w:before="478" w:after="360"/>
+        <w:ind w:left="76" w:right="0" w:firstLine="0"/>
+        <w:jc w:val="left"/>
+      </w:pPr>
+      <w:r>
+        <w:rPr>
+          <w:rFonts w:ascii="" w:hAnsi="" w:eastAsia=""/>
+          <w:b w:val="0"/>
+          <w:i w:val="0"/>
+          <w:color w:val="303030"/>
+          <w:sz w:val="18"/>
+        </w:rPr>
+        <w:t xml:space="preserve">Serviço a Executar </w:t>
+      </w:r>
+    </w:p>
+    <w:p>
+      <w:pPr>
+        <w:spacing w:line="240" w:lineRule="exact" w:before="0" w:after="0"/>
+      </w:pPr>
+      <w:r>
+        <w:t>{{servico}}</w:t>
+      </w:r>
+    </w:p>
+    <w:tbl>
+      <w:tblPr>
+        <w:tblW w:type="auto" w:w="0"/>
+        <w:tblLayout w:type="fixed"/>
+        <w:tblLook w:firstColumn="1" w:firstRow="1" w:lastColumn="0" w:lastRow="0" w:noHBand="0" w:noVBand="1" w:val="04A0"/>
+        <w:tblInd w:w="20.0" w:type="dxa"/>
+      </w:tblPr>
+      <w:tblGrid>
+        <w:gridCol w:w="1623"/>
+        <w:gridCol w:w="1623"/>
+        <w:gridCol w:w="1623"/>
+        <w:gridCol w:w="1623"/>
+        <w:gridCol w:w="1623"/>
+        <w:gridCol w:w="1623"/>
+        <w:gridCol w:w="1623"/>
+      </w:tblGrid>
+      <w:tr>
+        <w:trPr>
+          <w:trHeight w:hRule="exact" w:val="424"/>
+        </w:trPr>
+        <w:tc>
+          <w:tcPr>
+            <w:tcW w:type="dxa" w:w="960"/>
+            <w:tcBorders>
+              <w:top w:sz="2.2639999389648438" w:val="single" w:color="#C0C0C0"/>
+              <w:bottom w:sz="2.2639999389648438" w:val="single" w:color="#C0C0C0"/>
+            </w:tcBorders>
+            <w:tcMar>
+              <w:start w:w="0" w:type="dxa"/>
+              <w:end w:w="0" w:type="dxa"/>
+            </w:tcMar>
+          </w:tcPr>
+          <w:p>
+            <w:pPr>
+              <w:autoSpaceDN w:val="0"/>
+              <w:autoSpaceDE w:val="0"/>
+              <w:widowControl/>
+              <w:spacing w:line="208" w:lineRule="exact" w:before="146" w:after="0"/>
+              <w:ind w:left="0" w:right="0" w:firstLine="0"/>
+              <w:jc w:val="center"/>
+            </w:pPr>
+            <w:r>
+              <w:rPr>
+                <w:rFonts w:ascii="" w:hAnsi="" w:eastAsia=""/>
+                <w:b w:val="0"/>
+                <w:i w:val="0"/>
+                <w:color w:val="303030"/>
+                <w:sz w:val="18"/>
+              </w:rPr>
+              <w:t xml:space="preserve">BT Energ. </w:t>
+            </w:r>
+          </w:p>
+        </w:tc>
+        <w:tc>
+          <w:tcPr>
+            <w:tcW w:type="dxa" w:w="480"/>
+            <w:tcBorders>
+              <w:top w:sz="2.2639999389648438" w:val="single" w:color="#C0C0C0"/>
+              <w:bottom w:sz="2.2639999389648438" w:val="single" w:color="#C0C0C0"/>
+            </w:tcBorders>
+            <w:tcMar>
+              <w:start w:w="0" w:type="dxa"/>
+              <w:end w:w="0" w:type="dxa"/>
+            </w:tcMar>
+          </w:tcPr>
+          <w:p>
+            <w:pPr>
+              <w:autoSpaceDN w:val="0"/>
+              <w:autoSpaceDE w:val="0"/>
+              <w:widowControl/>
+              <w:spacing w:line="124" w:lineRule="exact" w:before="0" w:after="0"/>
+              <w:ind w:left="0" w:right="0"/>
+            </w:pPr>
+            <w:r>
+              <w:t>{% if bt %}X{% endif %}</w:t>
+            </w:r>
+          </w:p>
+          <w:tbl>
+            <w:tblPr>
+              <w:tblW w:type="auto" w:w="0"/>
+              <w:tblLayout w:type="fixed"/>
+              <w:tblLook w:firstColumn="1" w:firstRow="1" w:lastColumn="0" w:lastRow="0" w:noHBand="0" w:noVBand="1" w:val="04A0"/>
+              <w:tblInd w:w="124.00000000000006" w:type="dxa"/>
+            </w:tblPr>
+            <w:tblGrid>
+              <w:gridCol w:w="480"/>
+            </w:tblGrid>
+            <w:tr>
+              <w:trPr>
+                <w:trHeight w:hRule="exact" w:val="176"/>
+              </w:trPr>
+              <w:tc>
+                <w:tcPr>
+                  <w:tcW w:type="dxa" w:w="196"/>
+                  <w:tcBorders>
+                    <w:start w:sz="22.351999282836914" w:val="single" w:color="#939393"/>
+                    <w:top w:sz="22.351999282836914" w:val="single" w:color="#939393"/>
+                    <w:end w:sz="22.351999282836914" w:val="single" w:color="#939393"/>
+                    <w:bottom w:sz="22.351999282836914" w:val="single" w:color="#939393"/>
+                  </w:tcBorders>
+                  <w:shd w:fill="ffffff"/>
+                  <w:tcMar>
+                    <w:start w:w="0" w:type="dxa"/>
+                    <w:end w:w="0" w:type="dxa"/>
+                  </w:tcMar>
+                </w:tcPr>
+                <w:p/>
+              </w:tc>
+            </w:tr>
+          </w:tbl>
+          <w:p>
+            <w:pPr>
+              <w:autoSpaceDN w:val="0"/>
+              <w:autoSpaceDE w:val="0"/>
+              <w:widowControl/>
+              <w:spacing w:line="14" w:lineRule="exact" w:before="0" w:after="0"/>
+              <w:ind w:left="0" w:right="0"/>
+            </w:pPr>
+          </w:p>
+        </w:tc>
+        <w:tc>
+          <w:tcPr>
+            <w:tcW w:type="dxa" w:w="1000"/>
+            <w:tcBorders>
+              <w:top w:sz="2.2639999389648438" w:val="single" w:color="#C0C0C0"/>
+              <w:bottom w:sz="2.2639999389648438" w:val="single" w:color="#C0C0C0"/>
+            </w:tcBorders>
+            <w:tcMar>
+              <w:start w:w="0" w:type="dxa"/>
+              <w:end w:w="0" w:type="dxa"/>
+            </w:tcMar>
+          </w:tcPr>
+          <w:p/>
+        </w:tc>
+        <w:tc>
+          <w:tcPr>
+            <w:tcW w:type="dxa" w:w="500"/>
+            <w:tcBorders>
+              <w:top w:sz="2.2639999389648438" w:val="single" w:color="#C0C0C0"/>
+              <w:bottom w:sz="2.2639999389648438" w:val="single" w:color="#C0C0C0"/>
+            </w:tcBorders>
+            <w:tcMar>
+              <w:start w:w="0" w:type="dxa"/>
+              <w:end w:w="0" w:type="dxa"/>
+            </w:tcMar>
+          </w:tcPr>
+          <w:p/>
+        </w:tc>
+        <w:tc>
+          <w:tcPr>
+            <w:tcW w:type="dxa" w:w="1184"/>
+            <w:tcBorders>
+              <w:top w:sz="2.2639999389648438" w:val="single" w:color="#C0C0C0"/>
+              <w:bottom w:sz="2.2639999389648438" w:val="single" w:color="#C0C0C0"/>
+            </w:tcBorders>
+            <w:tcMar>
+              <w:start w:w="0" w:type="dxa"/>
+              <w:end w:w="0" w:type="dxa"/>
+            </w:tcMar>
+          </w:tcPr>
+          <w:p>
+            <w:pPr>
+              <w:autoSpaceDN w:val="0"/>
+              <w:autoSpaceDE w:val="0"/>
+              <w:widowControl/>
+              <w:spacing w:line="208" w:lineRule="exact" w:before="158" w:after="0"/>
+              <w:ind w:left="124" w:right="0" w:firstLine="0"/>
+              <w:jc w:val="left"/>
+            </w:pPr>
+            <w:r>
+              <w:rPr>
+                <w:rFonts w:ascii="" w:hAnsi="" w:eastAsia=""/>
+                <w:b w:val="0"/>
+                <w:i w:val="0"/>
+                <w:color w:val="303030"/>
+                <w:sz w:val="18"/>
+              </w:rPr>
+              <w:t>H.Desligar</w:t>
+            </w:r>
+          </w:p>
+        </w:tc>
+        <w:tc>
+          <w:tcPr>
+            <w:tcW w:type="dxa" w:w="648"/>
+            <w:tcBorders>
+              <w:top w:sz="2.2639999389648438" w:val="single" w:color="#C0C0C0"/>
+              <w:bottom w:sz="2.2639999389648438" w:val="single" w:color="#C0C0C0"/>
+            </w:tcBorders>
+            <w:tcMar>
+              <w:start w:w="0" w:type="dxa"/>
+              <w:end w:w="0" w:type="dxa"/>
+            </w:tcMar>
+          </w:tcPr>
+          <w:p>
+            <w:pPr>
+              <w:autoSpaceDN w:val="0"/>
+              <w:autoSpaceDE w:val="0"/>
+              <w:widowControl/>
+              <w:spacing w:line="208" w:lineRule="exact" w:before="146" w:after="0"/>
+              <w:ind w:left="0" w:right="0" w:firstLine="0"/>
+              <w:jc w:val="center"/>
+            </w:pPr>
+            <w:r>
+              <w:rPr>
+                <w:rFonts w:ascii="" w:hAnsi="" w:eastAsia=""/>
+                <w:b w:val="0"/>
+                <w:i w:val="0"/>
+                <w:color w:val="303030"/>
+                <w:sz w:val="18"/>
+              </w:rPr>
+              <w:t>{{h_desligar}}</w:t>
+            </w:r>
+          </w:p>
+        </w:tc>
+        <w:tc>
+          <w:tcPr>
+            <w:tcW w:type="dxa" w:w="6230"/>
+            <w:tcBorders>
+              <w:top w:sz="2.2639999389648438" w:val="single" w:color="#C0C0C0"/>
+              <w:bottom w:sz="2.2639999389648438" w:val="single" w:color="#C0C0C0"/>
+            </w:tcBorders>
+            <w:tcMar>
+              <w:start w:w="0" w:type="dxa"/>
+              <w:end w:w="0" w:type="dxa"/>
+            </w:tcMar>
+          </w:tcPr>
+          <w:p>
+            <w:pPr>
+              <w:autoSpaceDN w:val="0"/>
+              <w:autoSpaceDE w:val="0"/>
+              <w:widowControl/>
+              <w:spacing w:line="208" w:lineRule="exact" w:before="158" w:after="0"/>
+              <w:ind w:left="364" w:right="0" w:firstLine="0"/>
+              <w:jc w:val="left"/>
+            </w:pPr>
+            <w:r>
+              <w:rPr>
+                <w:rFonts w:ascii="" w:hAnsi="" w:eastAsia=""/>
+                <w:b w:val="0"/>
+                <w:i w:val="0"/>
+                <w:color w:val="303030"/>
+                <w:sz w:val="18"/>
+              </w:rPr>
+              <w:t>Alimentador {{alimentador}}</w:t>
             </w:r>
           </w:p>
         </w:tc>
       </w:tr>
       <w:tr>
+        <w:trPr>
+          <w:trHeight w:hRule="exact" w:val="400"/>
+        </w:trPr>
         <w:tc>
           <w:tcPr>
-            <w:tcW w:type="dxa" w:w="5100"/>
+            <w:tcW w:type="dxa" w:w="960"/>
+            <w:tcBorders>
+              <w:top w:sz="2.2639999389648438" w:val="single" w:color="#C0C0C0"/>
+              <w:bottom w:sz="2.2639999389648438" w:val="single" w:color="#C0C0C0"/>
+            </w:tcBorders>
+            <w:tcMar>
+              <w:start w:w="0" w:type="dxa"/>
+              <w:end w:w="0" w:type="dxa"/>
+            </w:tcMar>
           </w:tcPr>
           <w:p>
-            <w:r/>
+            <w:pPr>
+              <w:autoSpaceDN w:val="0"/>
+              <w:autoSpaceDE w:val="0"/>
+              <w:widowControl/>
+              <w:spacing w:line="208" w:lineRule="exact" w:before="122" w:after="0"/>
+              <w:ind w:left="0" w:right="0" w:firstLine="0"/>
+              <w:jc w:val="center"/>
+            </w:pPr>
             <w:r>
               <w:rPr>
-                <w:rFonts w:ascii="Arial" w:hAnsi="Arial"/>
-                <w:b/>
-                <w:sz w:val="22"/>
+                <w:rFonts w:ascii="" w:hAnsi="" w:eastAsia=""/>
+                <w:b w:val="0"/>
+                <w:i w:val="0"/>
+                <w:color w:val="303030"/>
+                <w:sz w:val="18"/>
               </w:rPr>
-              <w:t>H. Desligar</w:t>
+              <w:t xml:space="preserve">AT Energ. </w:t>
             </w:r>
           </w:p>
         </w:tc>
         <w:tc>
           <w:tcPr>
-            <w:tcW w:type="dxa" w:w="5100"/>
+            <w:tcW w:type="dxa" w:w="480"/>
+            <w:tcBorders>
+              <w:top w:sz="2.2639999389648438" w:val="single" w:color="#C0C0C0"/>
+              <w:bottom w:sz="2.2639999389648438" w:val="single" w:color="#C0C0C0"/>
+            </w:tcBorders>
+            <w:tcMar>
+              <w:start w:w="0" w:type="dxa"/>
+              <w:end w:w="0" w:type="dxa"/>
+            </w:tcMar>
           </w:tcPr>
           <w:p>
-            <w:r/>
+            <w:pPr>
+              <w:autoSpaceDN w:val="0"/>
+              <w:autoSpaceDE w:val="0"/>
+              <w:widowControl/>
+              <w:spacing w:line="102" w:lineRule="exact" w:before="0" w:after="0"/>
+              <w:ind w:left="0" w:right="0"/>
+            </w:pPr>
+            <w:r>
+              <w:t>{% if at %}X{% endif %}</w:t>
+            </w:r>
+          </w:p>
+          <w:tbl>
+            <w:tblPr>
+              <w:tblW w:type="auto" w:w="0"/>
+              <w:tblLayout w:type="fixed"/>
+              <w:tblLook w:firstColumn="1" w:firstRow="1" w:lastColumn="0" w:lastRow="0" w:noHBand="0" w:noVBand="1" w:val="04A0"/>
+              <w:tblInd w:w="124.00000000000006" w:type="dxa"/>
+            </w:tblPr>
+            <w:tblGrid>
+              <w:gridCol w:w="480"/>
+            </w:tblGrid>
+            <w:tr>
+              <w:trPr>
+                <w:trHeight w:hRule="exact" w:val="176"/>
+              </w:trPr>
+              <w:tc>
+                <w:tcPr>
+                  <w:tcW w:type="dxa" w:w="196"/>
+                  <w:tcBorders>
+                    <w:start w:sz="22.351999282836914" w:val="single" w:color="#939393"/>
+                    <w:top w:sz="22.351999282836914" w:val="single" w:color="#939393"/>
+                    <w:end w:sz="22.351999282836914" w:val="single" w:color="#939393"/>
+                    <w:bottom w:sz="22.351999282836914" w:val="single" w:color="#939393"/>
+                  </w:tcBorders>
+                  <w:shd w:fill="ffffff"/>
+                  <w:tcMar>
+                    <w:start w:w="0" w:type="dxa"/>
+                    <w:end w:w="0" w:type="dxa"/>
+                  </w:tcMar>
+                </w:tcPr>
+                <w:p/>
+              </w:tc>
+            </w:tr>
+          </w:tbl>
+          <w:p>
+            <w:pPr>
+              <w:autoSpaceDN w:val="0"/>
+              <w:autoSpaceDE w:val="0"/>
+              <w:widowControl/>
+              <w:spacing w:line="14" w:lineRule="exact" w:before="0" w:after="0"/>
+              <w:ind w:left="0" w:right="0"/>
+            </w:pPr>
+          </w:p>
+        </w:tc>
+        <w:tc>
+          <w:tcPr>
+            <w:tcW w:type="dxa" w:w="1000"/>
+            <w:tcBorders>
+              <w:top w:sz="2.2639999389648438" w:val="single" w:color="#C0C0C0"/>
+              <w:bottom w:sz="2.2639999389648438" w:val="single" w:color="#C0C0C0"/>
+            </w:tcBorders>
+            <w:tcMar>
+              <w:start w:w="0" w:type="dxa"/>
+              <w:end w:w="0" w:type="dxa"/>
+            </w:tcMar>
+          </w:tcPr>
+          <w:p>
+            <w:pPr>
+              <w:autoSpaceDN w:val="0"/>
+              <w:autoSpaceDE w:val="0"/>
+              <w:widowControl/>
+              <w:spacing w:line="208" w:lineRule="exact" w:before="122" w:after="0"/>
+              <w:ind w:left="0" w:right="0" w:firstLine="0"/>
+              <w:jc w:val="center"/>
+            </w:pPr>
             <w:r>
               <w:rPr>
-                <w:rFonts w:ascii="Arial" w:hAnsi="Arial"/>
+                <w:rFonts w:ascii="" w:hAnsi="" w:eastAsia=""/>
                 <w:b w:val="0"/>
-                <w:sz w:val="22"/>
+                <w:i w:val="0"/>
+                <w:color w:val="303030"/>
+                <w:sz w:val="18"/>
               </w:rPr>
-              <w:t>{{h_desligar}}</w:t>
-            </w:r>
-          </w:p>
-        </w:tc>
-      </w:tr>
-      <w:tr>
-        <w:tc>
-          <w:tcPr>
-            <w:tcW w:type="dxa" w:w="5100"/>
-          </w:tcPr>
-          <w:p>
-            <w:r/>
-            <w:r>
-              <w:rPr>
-                <w:rFonts w:ascii="Arial" w:hAnsi="Arial"/>
-                <w:b/>
-                <w:sz w:val="22"/>
-              </w:rPr>
-              <w:t>H. Religar</w:t>
+              <w:t xml:space="preserve">Bloqueio </w:t>
             </w:r>
           </w:p>
         </w:tc>
         <w:tc>
           <w:tcPr>
-            <w:tcW w:type="dxa" w:w="5100"/>
+            <w:tcW w:type="dxa" w:w="500"/>
+            <w:tcBorders>
+              <w:top w:sz="2.2639999389648438" w:val="single" w:color="#C0C0C0"/>
+              <w:bottom w:sz="2.2639999389648438" w:val="single" w:color="#C0C0C0"/>
+            </w:tcBorders>
+            <w:tcMar>
+              <w:start w:w="0" w:type="dxa"/>
+              <w:end w:w="0" w:type="dxa"/>
+            </w:tcMar>
           </w:tcPr>
           <w:p>
-            <w:r/>
+            <w:pPr>
+              <w:autoSpaceDN w:val="0"/>
+              <w:autoSpaceDE w:val="0"/>
+              <w:widowControl/>
+              <w:spacing w:line="102" w:lineRule="exact" w:before="0" w:after="0"/>
+              <w:ind w:left="0" w:right="0"/>
+            </w:pPr>
+          </w:p>
+          <w:tbl>
+            <w:tblPr>
+              <w:tblW w:type="auto" w:w="0"/>
+              <w:tblLayout w:type="fixed"/>
+              <w:tblLook w:firstColumn="1" w:firstRow="1" w:lastColumn="0" w:lastRow="0" w:noHBand="0" w:noVBand="1" w:val="04A0"/>
+              <w:tblInd w:w="166.00000000000023" w:type="dxa"/>
+            </w:tblPr>
+            <w:tblGrid>
+              <w:gridCol w:w="500"/>
+            </w:tblGrid>
+            <w:tr>
+              <w:trPr>
+                <w:trHeight w:hRule="exact" w:val="176"/>
+              </w:trPr>
+              <w:tc>
+                <w:tcPr>
+                  <w:tcW w:type="dxa" w:w="196"/>
+                  <w:tcBorders>
+                    <w:start w:sz="22.351999282836914" w:val="single" w:color="#939393"/>
+                    <w:top w:sz="22.351999282836914" w:val="single" w:color="#939393"/>
+                    <w:end w:sz="22.351999282836914" w:val="single" w:color="#939393"/>
+                    <w:bottom w:sz="22.351999282836914" w:val="single" w:color="#939393"/>
+                  </w:tcBorders>
+                  <w:shd w:fill="ffffff"/>
+                  <w:tcMar>
+                    <w:start w:w="0" w:type="dxa"/>
+                    <w:end w:w="0" w:type="dxa"/>
+                  </w:tcMar>
+                </w:tcPr>
+                <w:p/>
+              </w:tc>
+            </w:tr>
+          </w:tbl>
+          <w:p>
+            <w:pPr>
+              <w:autoSpaceDN w:val="0"/>
+              <w:autoSpaceDE w:val="0"/>
+              <w:widowControl/>
+              <w:spacing w:line="14" w:lineRule="exact" w:before="0" w:after="0"/>
+              <w:ind w:left="0" w:right="0"/>
+            </w:pPr>
+          </w:p>
+        </w:tc>
+        <w:tc>
+          <w:tcPr>
+            <w:tcW w:type="dxa" w:w="1184"/>
+            <w:tcBorders>
+              <w:top w:sz="2.2639999389648438" w:val="single" w:color="#C0C0C0"/>
+              <w:bottom w:sz="2.2639999389648438" w:val="single" w:color="#C0C0C0"/>
+            </w:tcBorders>
+            <w:tcMar>
+              <w:start w:w="0" w:type="dxa"/>
+              <w:end w:w="0" w:type="dxa"/>
+            </w:tcMar>
+          </w:tcPr>
+          <w:p>
+            <w:pPr>
+              <w:autoSpaceDN w:val="0"/>
+              <w:autoSpaceDE w:val="0"/>
+              <w:widowControl/>
+              <w:spacing w:line="208" w:lineRule="exact" w:before="122" w:after="0"/>
+              <w:ind w:left="0" w:right="0" w:firstLine="0"/>
+              <w:jc w:val="center"/>
+            </w:pPr>
             <w:r>
               <w:rPr>
-                <w:rFonts w:ascii="Arial" w:hAnsi="Arial"/>
+                <w:rFonts w:ascii="" w:hAnsi="" w:eastAsia=""/>
                 <w:b w:val="0"/>
-                <w:sz w:val="22"/>
+                <w:i w:val="0"/>
+                <w:color w:val="303030"/>
+                <w:sz w:val="18"/>
+              </w:rPr>
+              <w:t>H.Religar</w:t>
+            </w:r>
+          </w:p>
+        </w:tc>
+        <w:tc>
+          <w:tcPr>
+            <w:tcW w:type="dxa" w:w="648"/>
+            <w:tcBorders>
+              <w:top w:sz="2.2639999389648438" w:val="single" w:color="#C0C0C0"/>
+              <w:bottom w:sz="2.2639999389648438" w:val="single" w:color="#C0C0C0"/>
+            </w:tcBorders>
+            <w:tcMar>
+              <w:start w:w="0" w:type="dxa"/>
+              <w:end w:w="0" w:type="dxa"/>
+            </w:tcMar>
+          </w:tcPr>
+          <w:p>
+            <w:pPr>
+              <w:autoSpaceDN w:val="0"/>
+              <w:autoSpaceDE w:val="0"/>
+              <w:widowControl/>
+              <w:spacing w:line="208" w:lineRule="exact" w:before="122" w:after="0"/>
+              <w:ind w:left="0" w:right="0" w:firstLine="0"/>
+              <w:jc w:val="center"/>
+            </w:pPr>
+            <w:r>
+              <w:rPr>
+                <w:rFonts w:ascii="" w:hAnsi="" w:eastAsia=""/>
+                <w:b w:val="0"/>
+                <w:i w:val="0"/>
+                <w:color w:val="303030"/>
+                <w:sz w:val="18"/>
               </w:rPr>
               <w:t>{{h_religar}}</w:t>
             </w:r>
           </w:p>
         </w:tc>
-      </w:tr>
-      <w:tr>
         <w:tc>
           <w:tcPr>
-            <w:tcW w:type="dxa" w:w="5100"/>
+            <w:tcW w:type="dxa" w:w="6230"/>
+            <w:tcBorders>
+              <w:top w:sz="2.2639999389648438" w:val="single" w:color="#C0C0C0"/>
+              <w:bottom w:sz="2.2639999389648438" w:val="single" w:color="#C0C0C0"/>
+            </w:tcBorders>
+            <w:tcMar>
+              <w:start w:w="0" w:type="dxa"/>
+              <w:end w:w="0" w:type="dxa"/>
+            </w:tcMar>
           </w:tcPr>
           <w:p>
-            <w:r/>
+            <w:pPr>
+              <w:autoSpaceDN w:val="0"/>
+              <w:autoSpaceDE w:val="0"/>
+              <w:widowControl/>
+              <w:spacing w:line="208" w:lineRule="exact" w:before="122" w:after="0"/>
+              <w:ind w:left="864" w:right="0" w:firstLine="0"/>
+              <w:jc w:val="left"/>
+            </w:pPr>
             <w:r>
               <w:rPr>
-                <w:rFonts w:ascii="Arial" w:hAnsi="Arial"/>
-                <w:b/>
-                <w:sz w:val="22"/>
+                <w:rFonts w:ascii="" w:hAnsi="" w:eastAsia=""/>
+                <w:b w:val="0"/>
+                <w:i w:val="0"/>
+                <w:color w:val="303030"/>
+                <w:sz w:val="18"/>
               </w:rPr>
-              <w:t>Alimentador</w:t>
-            </w:r>
-          </w:p>
-        </w:tc>
-        <w:tc>
-          <w:tcPr>
-            <w:tcW w:type="dxa" w:w="5100"/>
-          </w:tcPr>
-          <w:p>
-            <w:r/>
-            <w:r>
-              <w:rPr>
-                <w:rFonts w:ascii="Arial" w:hAnsi="Arial"/>
-                <w:b w:val="0"/>
-                <w:sz w:val="22"/>
-              </w:rPr>
-              <w:t>{{alimentador}}</w:t>
-            </w:r>
-          </w:p>
-        </w:tc>
-      </w:tr>
-      <w:tr>
-        <w:tc>
-          <w:tcPr>
-            <w:tcW w:type="dxa" w:w="5100"/>
-          </w:tcPr>
-          <w:p>
-            <w:r/>
-            <w:r>
-              <w:rPr>
-                <w:rFonts w:ascii="Arial" w:hAnsi="Arial"/>
-                <w:b/>
-                <w:sz w:val="22"/>
-              </w:rPr>
-              <w:t>Chave</w:t>
-            </w:r>
-          </w:p>
-        </w:tc>
-        <w:tc>
-          <w:tcPr>
-            <w:tcW w:type="dxa" w:w="5100"/>
-          </w:tcPr>
-          <w:p>
-            <w:r/>
-            <w:r>
-              <w:rPr>
-                <w:rFonts w:ascii="Arial" w:hAnsi="Arial"/>
-                <w:b w:val="0"/>
-                <w:sz w:val="22"/>
-              </w:rPr>
-              <w:t>{{chave}}</w:t>
-            </w:r>
-          </w:p>
-        </w:tc>
-      </w:tr>
-      <w:tr>
-        <w:tc>
-          <w:tcPr>
-            <w:tcW w:type="dxa" w:w="5100"/>
-          </w:tcPr>
-          <w:p>
-            <w:r/>
-            <w:r>
-              <w:rPr>
-                <w:rFonts w:ascii="Arial" w:hAnsi="Arial"/>
-                <w:b/>
-                <w:sz w:val="22"/>
-              </w:rPr>
-              <w:t>Obs.</w:t>
-            </w:r>
-          </w:p>
-        </w:tc>
-        <w:tc>
-          <w:tcPr>
-            <w:tcW w:type="dxa" w:w="5100"/>
-          </w:tcPr>
-          <w:p>
-            <w:r/>
-            <w:r>
-              <w:rPr>
-                <w:rFonts w:ascii="Arial" w:hAnsi="Arial"/>
-                <w:b w:val="0"/>
-                <w:sz w:val="22"/>
-              </w:rPr>
-              <w:t>{{obs}}</w:t>
+              <w:t>Chave {{chave}}</w:t>
             </w:r>
           </w:p>
         </w:tc>
       </w:tr>
     </w:tbl>
     <w:p>
+      <w:pPr>
+        <w:autoSpaceDN w:val="0"/>
+        <w:autoSpaceDE w:val="0"/>
+        <w:widowControl/>
+        <w:spacing w:line="210" w:lineRule="exact" w:before="386" w:after="0"/>
+        <w:ind w:left="60" w:right="0" w:firstLine="0"/>
+        <w:jc w:val="left"/>
+      </w:pPr>
       <w:r>
         <w:rPr>
-          <w:rFonts w:ascii="Arial" w:hAnsi="Arial"/>
-          <w:b/>
-          <w:sz w:val="22"/>
+          <w:rFonts w:ascii="" w:hAnsi="" w:eastAsia=""/>
+          <w:b w:val="0"/>
+          <w:i w:val="0"/>
+          <w:color w:val="303030"/>
+          <w:sz w:val="18"/>
         </w:rPr>
-        <w:t>Ord.Serv. {{codigo}}       ID Obra {{id_obra}}</w:t>
-      </w:r>
-    </w:p>
-    <w:p>
-      <w:r>
-        <w:br w:type="page"/>
-      </w:r>
-    </w:p>
-    <w:p>
-      <w:r>
-        <w:rPr>
-          <w:rFonts w:ascii="Arial" w:hAnsi="Arial"/>
-          <w:sz w:val="22"/>
-        </w:rPr>
-        <w:t>{{data}}</w:t>
+        <w:t>Obs.</w:t>
       </w:r>
     </w:p>
     <w:p>
       <w:pPr>
+        <w:spacing w:line="240" w:lineRule="exact" w:before="0" w:after="0"/>
+      </w:pPr>
+      <w:r>
+        <w:t>{{obs}}</w:t>
+      </w:r>
+    </w:p>
+    <w:p>
+      <w:pPr>
+        <w:autoSpaceDN w:val="0"/>
+        <w:autoSpaceDE w:val="0"/>
+        <w:widowControl/>
+        <w:spacing w:line="240" w:lineRule="auto" w:before="464" w:after="0"/>
+        <w:ind w:left="0" w:right="0" w:firstLine="0"/>
         <w:jc w:val="center"/>
       </w:pPr>
       <w:r>
-        <w:rPr>
-          <w:rFonts w:ascii="Arial" w:hAnsi="Arial"/>
-          <w:b/>
-          <w:sz w:val="24"/>
-        </w:rPr>
-        <w:t>AVALIAÇÃO PRÉVIA DE ESTUDO E PLANEJAMENTO DAS ATIVIDADES</w:t>
+        <w:drawing>
+          <wp:inline xmlns:a="http://schemas.openxmlformats.org/drawingml/2006/main" xmlns:pic="http://schemas.openxmlformats.org/drawingml/2006/picture">
+            <wp:extent cx="6516000" cy="5940000"/>
+            <wp:docPr id="2" name="Picture 2"/>
+            <wp:cNvGraphicFramePr>
+              <a:graphicFrameLocks noChangeAspect="1"/>
+            </wp:cNvGraphicFramePr>
+            <a:graphic>
+              <a:graphicData uri="http://schemas.openxmlformats.org/drawingml/2006/picture">
+                <pic:pic>
+                  <pic:nvPicPr>
+                    <pic:cNvPr id="0" name="image.png"/>
+                    <pic:cNvPicPr/>
+                  </pic:nvPicPr>
+                  <pic:blipFill>
+                    <a:blip r:embed="rId10"/>
+                    <a:stretch>
+                      <a:fillRect/>
+                    </a:stretch>
+                  </pic:blipFill>
+                  <pic:spPr>
+                    <a:xfrm>
+                      <a:off x="0" y="0"/>
+                      <a:ext cx="6516000" cy="5940000"/>
+                    </a:xfrm>
+                    <a:prstGeom prst="rect"/>
+                  </pic:spPr>
+                </pic:pic>
+              </a:graphicData>
+            </a:graphic>
+          </wp:inline>
+        </w:drawing>
+      </w:r>
+    </w:p>
+    <w:p>
+      <w:pPr>
+        <w:sectPr>
+          <w:pgSz w:w="11906" w:h="16838"/>
+          <w:pgMar w:top="142" w:right="262" w:bottom="496" w:left="280" w:header="720" w:footer="720" w:gutter="0"/>
+          <w:cols/>
+          <w:docGrid w:linePitch="360"/>
+        </w:sectPr>
+      </w:pPr>
+    </w:p>
+    <w:tbl>
+      <w:tblPr>
+        <w:tblW w:type="auto" w:w="0"/>
+        <w:tblLayout w:type="fixed"/>
+        <w:tblLook w:firstColumn="1" w:firstRow="1" w:lastColumn="0" w:lastRow="0" w:noHBand="0" w:noVBand="1" w:val="04A0"/>
+        <w:tblInd w:w="0.0" w:type="dxa"/>
+      </w:tblPr>
+      <w:tblGrid>
+        <w:gridCol w:w="3729"/>
+        <w:gridCol w:w="3729"/>
+        <w:gridCol w:w="3729"/>
+      </w:tblGrid>
+      <w:tr>
+        <w:trPr>
+          <w:trHeight w:hRule="exact" w:val="552"/>
+        </w:trPr>
+        <w:tc>
+          <w:tcPr>
+            <w:tcW w:type="dxa" w:w="2236"/>
+            <w:tcBorders>
+              <w:bottom w:sz="2.2639999389648438" w:val="single" w:color="#000000"/>
+            </w:tcBorders>
+            <w:tcMar>
+              <w:start w:w="0" w:type="dxa"/>
+              <w:end w:w="0" w:type="dxa"/>
+            </w:tcMar>
+          </w:tcPr>
+          <w:p>
+            <w:pPr>
+              <w:autoSpaceDN w:val="0"/>
+              <w:autoSpaceDE w:val="0"/>
+              <w:widowControl/>
+              <w:spacing w:line="240" w:lineRule="auto" w:before="0" w:after="0"/>
+              <w:ind w:left="0" w:right="438" w:firstLine="0"/>
+              <w:jc w:val="right"/>
+            </w:pPr>
+            <w:r>
+              <w:drawing>
+                <wp:inline xmlns:a="http://schemas.openxmlformats.org/drawingml/2006/main" xmlns:pic="http://schemas.openxmlformats.org/drawingml/2006/picture">
+                  <wp:extent cx="534669" cy="351790"/>
+                  <wp:docPr id="3" name="Picture 3"/>
+                  <wp:cNvGraphicFramePr>
+                    <a:graphicFrameLocks noChangeAspect="1"/>
+                  </wp:cNvGraphicFramePr>
+                  <a:graphic>
+                    <a:graphicData uri="http://schemas.openxmlformats.org/drawingml/2006/picture">
+                      <pic:pic>
+                        <pic:nvPicPr>
+                          <pic:cNvPr id="0" name="image.png"/>
+                          <pic:cNvPicPr/>
+                        </pic:nvPicPr>
+                        <pic:blipFill>
+                          <a:blip r:embed="rId9"/>
+                          <a:stretch>
+                            <a:fillRect/>
+                          </a:stretch>
+                        </pic:blipFill>
+                        <pic:spPr>
+                          <a:xfrm>
+                            <a:off x="0" y="0"/>
+                            <a:ext cx="534669" cy="351790"/>
+                          </a:xfrm>
+                          <a:prstGeom prst="rect"/>
+                        </pic:spPr>
+                      </pic:pic>
+                    </a:graphicData>
+                  </a:graphic>
+                </wp:inline>
+              </w:drawing>
+            </w:r>
+          </w:p>
+        </w:tc>
+        <w:tc>
+          <w:tcPr>
+            <w:tcW w:type="dxa" w:w="7400"/>
+            <w:tcBorders>
+              <w:bottom w:sz="2.2639999389648438" w:val="single" w:color="#000000"/>
+            </w:tcBorders>
+            <w:tcMar>
+              <w:start w:w="0" w:type="dxa"/>
+              <w:end w:w="0" w:type="dxa"/>
+            </w:tcMar>
+          </w:tcPr>
+          <w:p>
+            <w:pPr>
+              <w:autoSpaceDN w:val="0"/>
+              <w:autoSpaceDE w:val="0"/>
+              <w:widowControl/>
+              <w:spacing w:line="256" w:lineRule="exact" w:before="150" w:after="0"/>
+              <w:ind w:left="438" w:right="0" w:firstLine="0"/>
+              <w:jc w:val="left"/>
+            </w:pPr>
+            <w:r>
+              <w:rPr>
+                <w:rFonts w:ascii="" w:hAnsi="" w:eastAsia=""/>
+                <w:b/>
+                <w:i w:val="0"/>
+                <w:color w:val="303030"/>
+                <w:sz w:val="22"/>
+              </w:rPr>
+              <w:t>AVALIAÇÃO PRÉVIA DE ESTUDO E PLANEJAMENTO DAS ATIVIDADES</w:t>
+            </w:r>
+          </w:p>
+        </w:tc>
+        <w:tc>
+          <w:tcPr>
+            <w:tcW w:type="dxa" w:w="1424"/>
+            <w:tcBorders>
+              <w:bottom w:sz="2.2639999389648438" w:val="single" w:color="#000000"/>
+            </w:tcBorders>
+            <w:tcMar>
+              <w:start w:w="0" w:type="dxa"/>
+              <w:end w:w="0" w:type="dxa"/>
+            </w:tcMar>
+          </w:tcPr>
+          <w:p>
+            <w:pPr>
+              <w:autoSpaceDN w:val="0"/>
+              <w:autoSpaceDE w:val="0"/>
+              <w:widowControl/>
+              <w:spacing w:line="232" w:lineRule="exact" w:before="188" w:after="0"/>
+              <w:ind w:left="212" w:right="0" w:firstLine="0"/>
+              <w:jc w:val="left"/>
+            </w:pPr>
+            <w:r>
+              <w:rPr>
+                <w:rFonts w:ascii="" w:hAnsi="" w:eastAsia=""/>
+                <w:b/>
+                <w:i w:val="0"/>
+                <w:color w:val="303030"/>
+                <w:sz w:val="20"/>
+              </w:rPr>
+              <w:t>{{data}}</w:t>
+            </w:r>
+          </w:p>
+        </w:tc>
+      </w:tr>
+    </w:tbl>
+    <w:p>
+      <w:pPr>
+        <w:autoSpaceDN w:val="0"/>
+        <w:autoSpaceDE w:val="0"/>
+        <w:widowControl/>
+        <w:spacing w:line="240" w:lineRule="auto" w:before="72" w:after="0"/>
+        <w:ind w:left="384" w:right="0" w:firstLine="0"/>
+        <w:jc w:val="left"/>
+      </w:pPr>
+      <w:r>
+        <w:drawing>
+          <wp:inline xmlns:a="http://schemas.openxmlformats.org/drawingml/2006/main" xmlns:pic="http://schemas.openxmlformats.org/drawingml/2006/picture">
+            <wp:extent cx="6516000" cy="7272000"/>
+            <wp:docPr id="4" name="Picture 4"/>
+            <wp:cNvGraphicFramePr>
+              <a:graphicFrameLocks noChangeAspect="1"/>
+            </wp:cNvGraphicFramePr>
+            <a:graphic>
+              <a:graphicData uri="http://schemas.openxmlformats.org/drawingml/2006/picture">
+                <pic:pic>
+                  <pic:nvPicPr>
+                    <pic:cNvPr id="0" name="image.png"/>
+                    <pic:cNvPicPr/>
+                  </pic:nvPicPr>
+                  <pic:blipFill>
+                    <a:blip r:embed="rId11"/>
+                    <a:stretch>
+                      <a:fillRect/>
+                    </a:stretch>
+                  </pic:blipFill>
+                  <pic:spPr>
+                    <a:xfrm>
+                      <a:off x="0" y="0"/>
+                      <a:ext cx="6516000" cy="7272000"/>
+                    </a:xfrm>
+                    <a:prstGeom prst="rect"/>
+                  </pic:spPr>
+                </pic:pic>
+              </a:graphicData>
+            </a:graphic>
+          </wp:inline>
+        </w:drawing>
       </w:r>
     </w:p>
     <w:tbl>
       <w:tblPr>
-        <w:tblStyle w:val="TableGrid"/>
         <w:tblW w:type="auto" w:w="0"/>
-        <w:jc w:val="center"/>
+        <w:tblLayout w:type="fixed"/>
         <w:tblLook w:firstColumn="1" w:firstRow="1" w:lastColumn="0" w:lastRow="0" w:noHBand="0" w:noVBand="1" w:val="04A0"/>
+        <w:tblInd w:w="106.00000000000001" w:type="dxa"/>
       </w:tblPr>
       <w:tblGrid>
-        <w:gridCol w:w="3400"/>
-        <w:gridCol w:w="3400"/>
-        <w:gridCol w:w="3400"/>
+        <w:gridCol w:w="2796"/>
+        <w:gridCol w:w="2796"/>
+        <w:gridCol w:w="2796"/>
+        <w:gridCol w:w="2796"/>
       </w:tblGrid>
       <w:tr>
+        <w:trPr>
+          <w:trHeight w:hRule="exact" w:val="370"/>
+        </w:trPr>
         <w:tc>
           <w:tcPr>
-            <w:tcW w:type="dxa" w:w="3400"/>
+            <w:tcW w:type="dxa" w:w="2690"/>
+            <w:tcBorders>
+              <w:top w:sz="2.247999906539917" w:val="single" w:color="#CCCCCC"/>
+            </w:tcBorders>
+            <w:tcMar>
+              <w:start w:w="0" w:type="dxa"/>
+              <w:end w:w="0" w:type="dxa"/>
+            </w:tcMar>
           </w:tcPr>
           <w:p>
             <w:pPr>
-              <w:jc w:val="center"/>
+              <w:autoSpaceDN w:val="0"/>
+              <w:autoSpaceDE w:val="0"/>
+              <w:widowControl/>
+              <w:spacing w:line="256" w:lineRule="exact" w:before="66" w:after="0"/>
+              <w:ind w:left="58" w:right="0" w:firstLine="0"/>
+              <w:jc w:val="left"/>
             </w:pPr>
-            <w:r/>
             <w:r>
               <w:rPr>
-                <w:rFonts w:ascii="Arial" w:hAnsi="Arial"/>
+                <w:rFonts w:ascii="" w:hAnsi="" w:eastAsia=""/>
                 <w:b/>
+                <w:i w:val="0"/>
+                <w:color w:val="303030"/>
                 <w:sz w:val="22"/>
+              </w:rPr>
+              <w:t xml:space="preserve">Membros da Equipe </w:t>
+            </w:r>
+          </w:p>
+        </w:tc>
+        <w:tc>
+          <w:tcPr>
+            <w:tcW w:type="dxa" w:w="1100"/>
+            <w:tcBorders>
+              <w:top w:sz="2.247999906539917" w:val="single" w:color="#CCCCCC"/>
+              <w:bottom w:sz="4.0" w:val="single" w:color="#2F2F2F"/>
+            </w:tcBorders>
+            <w:tcMar>
+              <w:start w:w="0" w:type="dxa"/>
+              <w:end w:w="0" w:type="dxa"/>
+            </w:tcMar>
+            <w:tcMar>
+              <w:start w:w="0" w:type="dxa"/>
+              <w:end w:w="0" w:type="dxa"/>
+            </w:tcMar>
+            <w:tcMar>
+              <w:start w:w="0" w:type="dxa"/>
+              <w:end w:w="0" w:type="dxa"/>
+            </w:tcMar>
+          </w:tcPr>
+          <w:p>
+            <w:pPr>
+              <w:autoSpaceDN w:val="0"/>
+              <w:autoSpaceDE w:val="0"/>
+              <w:widowControl/>
+              <w:spacing w:line="210" w:lineRule="exact" w:before="60" w:after="0"/>
+              <w:ind w:left="0" w:right="0" w:firstLine="0"/>
+              <w:jc w:val="right"/>
+            </w:pPr>
+            <w:r>
+              <w:rPr>
+                <w:rFonts w:ascii="" w:hAnsi="" w:eastAsia=""/>
+                <w:b/>
+                <w:i w:val="0"/>
+                <w:color w:val="303030"/>
+                <w:sz w:val="18"/>
+              </w:rPr>
+            </w:r>
+          </w:p>
+        </w:tc>
+        <w:tc>
+          <w:tcPr>
+            <w:tcW w:type="dxa" w:w="3324"/>
+            <w:tcBorders>
+              <w:top w:sz="2.247999906539917" w:val="single" w:color="#CCCCCC"/>
+            </w:tcBorders>
+            <w:tcMar>
+              <w:start w:w="0" w:type="dxa"/>
+              <w:end w:w="0" w:type="dxa"/>
+            </w:tcMar>
+          </w:tcPr>
+          <w:p>
+            <w:pPr>
+              <w:autoSpaceDN w:val="0"/>
+              <w:autoSpaceDE w:val="0"/>
+              <w:widowControl/>
+              <w:spacing w:line="210" w:lineRule="exact" w:before="60" w:after="0"/>
+              <w:ind w:left="366" w:right="0" w:firstLine="0"/>
+              <w:jc w:val="left"/>
+            </w:pPr>
+            <w:r>
+              <w:rPr>
+                <w:rFonts w:ascii="" w:hAnsi="" w:eastAsia=""/>
+                <w:b/>
+                <w:i w:val="0"/>
+                <w:color w:val="303030"/>
+                <w:sz w:val="18"/>
+              </w:rPr>
+              <w:t>O.S. Nr. : {{codigo}}</w:t>
+            </w:r>
+          </w:p>
+        </w:tc>
+        <w:tc>
+          <w:tcPr>
+            <w:tcW w:type="dxa" w:w="3946"/>
+            <w:tcBorders>
+              <w:top w:sz="2.247999906539917" w:val="single" w:color="#CCCCCC"/>
+              <w:bottom w:sz="4.0" w:val="single" w:color="#2F2F2F"/>
+            </w:tcBorders>
+            <w:tcMar>
+              <w:start w:w="0" w:type="dxa"/>
+              <w:end w:w="0" w:type="dxa"/>
+            </w:tcMar>
+            <w:tcMar>
+              <w:start w:w="0" w:type="dxa"/>
+              <w:end w:w="0" w:type="dxa"/>
+            </w:tcMar>
+            <w:tcMar>
+              <w:start w:w="0" w:type="dxa"/>
+              <w:end w:w="0" w:type="dxa"/>
+            </w:tcMar>
+          </w:tcPr>
+          <w:p>
+            <w:pPr>
+              <w:autoSpaceDN w:val="0"/>
+              <w:autoSpaceDE w:val="0"/>
+              <w:widowControl/>
+              <w:spacing w:line="186" w:lineRule="exact" w:before="452" w:after="0"/>
+              <w:ind w:left="0" w:right="0" w:firstLine="0"/>
+              <w:jc w:val="left"/>
+            </w:pPr>
+            <w:r>
+              <w:rPr>
+                <w:rFonts w:ascii="" w:hAnsi="" w:eastAsia=""/>
+                <w:b w:val="0"/>
+                <w:i w:val="0"/>
+                <w:color w:val="303030"/>
+                <w:sz w:val="16"/>
+              </w:rPr>
+              <w:t>Assinatura</w:t>
+            </w:r>
+          </w:p>
+        </w:tc>
+      </w:tr>
+      <w:tr>
+        <w:trPr>
+          <w:trHeight w:hRule="exact" w:val="360"/>
+        </w:trPr>
+        <w:tc>
+          <w:tcPr>
+            <w:tcW w:type="dxa" w:w="2690"/>
+            <w:tcBorders/>
+            <w:tcMar>
+              <w:start w:w="0" w:type="dxa"/>
+              <w:end w:w="0" w:type="dxa"/>
+            </w:tcMar>
+          </w:tcPr>
+          <w:p>
+            <w:pPr>
+              <w:autoSpaceDN w:val="0"/>
+              <w:autoSpaceDE w:val="0"/>
+              <w:widowControl/>
+              <w:spacing w:line="186" w:lineRule="exact" w:before="84" w:after="0"/>
+              <w:ind w:left="58" w:right="0" w:firstLine="0"/>
+              <w:jc w:val="left"/>
+            </w:pPr>
+            <w:r>
+              <w:rPr>
+                <w:rFonts w:ascii="" w:hAnsi="" w:eastAsia=""/>
+                <w:b w:val="0"/>
+                <w:i w:val="0"/>
+                <w:color w:val="303030"/>
+                <w:sz w:val="16"/>
               </w:rPr>
               <w:t>Nome</w:t>
             </w:r>
@@ -642,18 +1983,40 @@
         </w:tc>
         <w:tc>
           <w:tcPr>
-            <w:tcW w:type="dxa" w:w="3400"/>
+            <w:tcW w:type="dxa" w:w="2796"/>
+            <w:vMerge/>
+            <w:tcBorders>
+              <w:top w:sz="2.247999906539917" w:val="single" w:color="#CCCCCC"/>
+              <w:bottom w:sz="4.0" w:val="single" w:color="#2F2F2F"/>
+            </w:tcBorders>
+          </w:tcPr>
+          <w:p/>
+        </w:tc>
+        <w:tc>
+          <w:tcPr>
+            <w:tcW w:type="dxa" w:w="3324"/>
+            <w:tcBorders/>
+            <w:tcMar>
+              <w:start w:w="0" w:type="dxa"/>
+              <w:end w:w="0" w:type="dxa"/>
+            </w:tcMar>
           </w:tcPr>
           <w:p>
             <w:pPr>
-              <w:jc w:val="center"/>
+              <w:autoSpaceDN w:val="0"/>
+              <w:autoSpaceDE w:val="0"/>
+              <w:widowControl/>
+              <w:spacing w:line="186" w:lineRule="exact" w:before="84" w:after="0"/>
+              <w:ind w:left="36" w:right="0" w:firstLine="0"/>
+              <w:jc w:val="left"/>
             </w:pPr>
-            <w:r/>
             <w:r>
               <w:rPr>
-                <w:rFonts w:ascii="Arial" w:hAnsi="Arial"/>
-                <w:b/>
-                <w:sz w:val="22"/>
+                <w:rFonts w:ascii="" w:hAnsi="" w:eastAsia=""/>
+                <w:b w:val="0"/>
+                <w:i w:val="0"/>
+                <w:color w:val="303030"/>
+                <w:sz w:val="16"/>
               </w:rPr>
               <w:t>Cargo</w:t>
             </w:r>
@@ -661,50 +2024,12 @@
         </w:tc>
         <w:tc>
           <w:tcPr>
-            <w:tcW w:type="dxa" w:w="3400"/>
-          </w:tcPr>
-          <w:p>
-            <w:pPr>
-              <w:jc w:val="center"/>
-            </w:pPr>
-            <w:r/>
-            <w:r>
-              <w:rPr>
-                <w:rFonts w:ascii="Arial" w:hAnsi="Arial"/>
-                <w:b/>
-                <w:sz w:val="22"/>
-              </w:rPr>
-              <w:t>Assinatura</w:t>
-            </w:r>
-          </w:p>
-        </w:tc>
-      </w:tr>
-      <w:tr>
-        <w:tc>
-          <w:tcPr>
-            <w:tcW w:type="dxa" w:w="3400"/>
-          </w:tcPr>
-          <w:p>
-            <w:r/>
-            <w:r>
-              <w:rPr>
-                <w:rFonts w:ascii="Arial" w:hAnsi="Arial"/>
-                <w:b w:val="0"/>
-                <w:sz w:val="22"/>
-              </w:rPr>
-              <w:t>{%tr for m in membros %}</w:t>
-            </w:r>
-          </w:p>
-        </w:tc>
-        <w:tc>
-          <w:tcPr>
-            <w:tcW w:type="dxa" w:w="3400"/>
-          </w:tcPr>
-          <w:p/>
-        </w:tc>
-        <w:tc>
-          <w:tcPr>
-            <w:tcW w:type="dxa" w:w="3400"/>
+            <w:tcW w:type="dxa" w:w="2796"/>
+            <w:vMerge/>
+            <w:tcBorders>
+              <w:top w:sz="2.247999906539917" w:val="single" w:color="#CCCCCC"/>
+              <w:bottom w:sz="4.0" w:val="single" w:color="#2F2F2F"/>
+            </w:tcBorders>
           </w:tcPr>
           <w:p/>
         </w:tc>
@@ -712,97 +2037,104 @@
       <w:tr>
         <w:tc>
           <w:tcPr>
-            <w:tcW w:type="dxa" w:w="3400"/>
+            <w:tcW w:type="dxa" w:w="2796"/>
           </w:tcPr>
           <w:p>
-            <w:r/>
             <w:r>
-              <w:rPr>
-                <w:rFonts w:ascii="Arial" w:hAnsi="Arial"/>
-                <w:b w:val="0"/>
-                <w:sz w:val="22"/>
-              </w:rPr>
+              <w:t>{%tr for m in membros %}</w:t>
+            </w:r>
+          </w:p>
+        </w:tc>
+        <w:tc>
+          <w:tcPr>
+            <w:tcW w:type="dxa" w:w="2796"/>
+          </w:tcPr>
+          <w:p/>
+        </w:tc>
+        <w:tc>
+          <w:tcPr>
+            <w:tcW w:type="dxa" w:w="2796"/>
+          </w:tcPr>
+          <w:p/>
+        </w:tc>
+        <w:tc>
+          <w:tcPr>
+            <w:tcW w:type="dxa" w:w="2796"/>
+          </w:tcPr>
+          <w:p/>
+        </w:tc>
+      </w:tr>
+      <w:tr>
+        <w:tc>
+          <w:tcPr>
+            <w:tcW w:type="dxa" w:w="2796"/>
+          </w:tcPr>
+          <w:p>
+            <w:r>
               <w:t>{{ m.nome }}</w:t>
             </w:r>
           </w:p>
         </w:tc>
         <w:tc>
           <w:tcPr>
-            <w:tcW w:type="dxa" w:w="3400"/>
+            <w:tcW w:type="dxa" w:w="2796"/>
           </w:tcPr>
           <w:p>
-            <w:r/>
             <w:r>
-              <w:rPr>
-                <w:rFonts w:ascii="Arial" w:hAnsi="Arial"/>
-                <w:b w:val="0"/>
-                <w:sz w:val="22"/>
-              </w:rPr>
               <w:t>{{ m.cargo }}</w:t>
             </w:r>
           </w:p>
         </w:tc>
         <w:tc>
           <w:tcPr>
-            <w:tcW w:type="dxa" w:w="3400"/>
+            <w:tcW w:type="dxa" w:w="2796"/>
           </w:tcPr>
           <w:p>
             <w:r/>
-            <w:r>
-              <w:rPr>
-                <w:rFonts w:ascii="Arial" w:hAnsi="Arial"/>
-                <w:b w:val="0"/>
-                <w:sz w:val="22"/>
-              </w:rPr>
-            </w:r>
           </w:p>
+        </w:tc>
+        <w:tc>
+          <w:tcPr>
+            <w:tcW w:type="dxa" w:w="2796"/>
+          </w:tcPr>
+          <w:p/>
         </w:tc>
       </w:tr>
       <w:tr>
         <w:tc>
           <w:tcPr>
-            <w:tcW w:type="dxa" w:w="3400"/>
+            <w:tcW w:type="dxa" w:w="2796"/>
           </w:tcPr>
           <w:p>
-            <w:r/>
             <w:r>
-              <w:rPr>
-                <w:rFonts w:ascii="Arial" w:hAnsi="Arial"/>
-                <w:b w:val="0"/>
-                <w:sz w:val="22"/>
-              </w:rPr>
               <w:t>{%tr endfor %}</w:t>
             </w:r>
           </w:p>
         </w:tc>
         <w:tc>
           <w:tcPr>
-            <w:tcW w:type="dxa" w:w="3400"/>
+            <w:tcW w:type="dxa" w:w="2796"/>
           </w:tcPr>
           <w:p/>
         </w:tc>
         <w:tc>
           <w:tcPr>
-            <w:tcW w:type="dxa" w:w="3400"/>
+            <w:tcW w:type="dxa" w:w="2796"/>
+          </w:tcPr>
+          <w:p/>
+        </w:tc>
+        <w:tc>
+          <w:tcPr>
+            <w:tcW w:type="dxa" w:w="2796"/>
           </w:tcPr>
           <w:p/>
         </w:tc>
       </w:tr>
     </w:tbl>
-    <w:p>
-      <w:r>
-        <w:rPr>
-          <w:rFonts w:ascii="Arial" w:hAnsi="Arial"/>
-          <w:b/>
-          <w:sz w:val="22"/>
-        </w:rPr>
-        <w:t>O.S. Nr.: {{codigo}}</w:t>
-      </w:r>
-    </w:p>
     <w:sectPr>
-      <w:pgSz w:w="12240" w:h="15840"/>
-      <w:pgMar w:top="850" w:right="1020" w:bottom="850" w:left="1020" w:header="720" w:footer="720" w:gutter="0"/>
-      <w:cols w:space="720"/>
+      <w:pgSz w:w="11906" w:h="16838"/>
+      <w:pgMar w:top="142" w:right="156" w:bottom="140" w:left="564" w:header="720" w:footer="720" w:gutter="0"/>
+      <w:cols/>
       <w:docGrid w:linePitch="360"/>
     </w:sectPr>
   </w:body>

</xml_diff>

<commit_message>
fix: modelos de O.S reconstruidos com tabelas limpas (sem texto duplicado/sobreposto)
</commit_message>
<xml_diff>
--- a/backend/templates/OS_CONSTRUCAO.docx
+++ b/backend/templates/OS_CONSTRUCAO.docx
@@ -2,65 +2,43 @@
 <file path=word/document.xml><?xml version="1.0" encoding="utf-8"?>
 <w:document xmlns:wpc="http://schemas.microsoft.com/office/word/2010/wordprocessingCanvas" xmlns:mo="http://schemas.microsoft.com/office/mac/office/2008/main" xmlns:mc="http://schemas.openxmlformats.org/markup-compatibility/2006" xmlns:mv="urn:schemas-microsoft-com:mac:vml" xmlns:o="urn:schemas-microsoft-com:office:office" xmlns:r="http://schemas.openxmlformats.org/officeDocument/2006/relationships" xmlns:m="http://schemas.openxmlformats.org/officeDocument/2006/math" xmlns:v="urn:schemas-microsoft-com:vml" xmlns:wp14="http://schemas.microsoft.com/office/word/2010/wordprocessingDrawing" xmlns:wp="http://schemas.openxmlformats.org/drawingml/2006/wordprocessingDrawing" xmlns:w10="urn:schemas-microsoft-com:office:word" xmlns:w="http://schemas.openxmlformats.org/wordprocessingml/2006/main" xmlns:w14="http://schemas.microsoft.com/office/word/2010/wordml" xmlns:wpg="http://schemas.microsoft.com/office/word/2010/wordprocessingGroup" xmlns:wpi="http://schemas.microsoft.com/office/word/2010/wordprocessingInk" xmlns:wne="http://schemas.microsoft.com/office/word/2006/wordml" xmlns:wps="http://schemas.microsoft.com/office/word/2010/wordprocessingShape" mc:Ignorable="w14 wp14">
   <w:body>
-    <w:p>
-      <w:pPr>
-        <w:autoSpaceDN w:val="0"/>
-        <w:autoSpaceDE w:val="0"/>
-        <w:widowControl/>
-        <w:spacing w:line="142" w:lineRule="exact" w:before="0" w:after="0"/>
-        <w:ind w:left="0" w:right="0"/>
-      </w:pPr>
-    </w:p>
     <w:tbl>
       <w:tblPr>
         <w:tblW w:type="auto" w:w="0"/>
+        <w:jc w:val="center"/>
+        <w:tblLook w:firstColumn="1" w:firstRow="1" w:lastColumn="0" w:lastRow="0" w:noHBand="0" w:noVBand="1" w:val="04A0"/>
         <w:tblLayout w:type="fixed"/>
-        <w:tblLook w:firstColumn="1" w:firstRow="1" w:lastColumn="0" w:lastRow="0" w:noHBand="0" w:noVBand="1" w:val="04A0"/>
-        <w:tblInd w:w="0.0" w:type="dxa"/>
       </w:tblPr>
       <w:tblGrid>
-        <w:gridCol w:w="1420"/>
-        <w:gridCol w:w="1420"/>
-        <w:gridCol w:w="1420"/>
-        <w:gridCol w:w="1420"/>
-        <w:gridCol w:w="1420"/>
-        <w:gridCol w:w="1420"/>
-        <w:gridCol w:w="1420"/>
-        <w:gridCol w:w="1420"/>
+        <w:gridCol w:w="1474"/>
+        <w:gridCol w:w="1814"/>
+        <w:gridCol w:w="1474"/>
+        <w:gridCol w:w="1247"/>
+        <w:gridCol w:w="1247"/>
+        <w:gridCol w:w="1474"/>
+        <w:gridCol w:w="737"/>
+        <w:gridCol w:w="737"/>
       </w:tblGrid>
       <w:tr>
-        <w:trPr>
-          <w:trHeight w:hRule="exact" w:val="804"/>
-        </w:trPr>
         <w:tc>
           <w:tcPr>
-            <w:tcW w:type="dxa" w:w="2802"/>
-            <w:gridSpan w:val="2"/>
+            <w:tcW w:type="dxa" w:w="1474"/>
             <w:tcBorders>
-              <w:bottom w:sz="2.2639999389648438" w:val="single" w:color="#000000"/>
+              <w:top w:val="single" w:sz="4" w:color="2F2F2F"/>
+              <w:left w:val="single" w:sz="4" w:color="2F2F2F"/>
+              <w:bottom w:val="single" w:sz="4" w:color="2F2F2F"/>
+              <w:right w:val="single" w:sz="4" w:color="2F2F2F"/>
             </w:tcBorders>
-            <w:tcMar>
-              <w:start w:w="0" w:type="dxa"/>
-              <w:end w:w="0" w:type="dxa"/>
-            </w:tcMar>
-            <w:tcMar>
-              <w:start w:w="0" w:type="dxa"/>
-              <w:end w:w="0" w:type="dxa"/>
-            </w:tcMar>
           </w:tcPr>
           <w:p>
             <w:pPr>
-              <w:autoSpaceDN w:val="0"/>
-              <w:autoSpaceDE w:val="0"/>
-              <w:widowControl/>
-              <w:spacing w:line="240" w:lineRule="auto" w:before="0" w:after="0"/>
-              <w:ind w:left="4" w:right="0" w:firstLine="0"/>
+              <w:spacing w:before="0" w:after="0"/>
               <w:jc w:val="left"/>
             </w:pPr>
             <w:r>
               <w:drawing>
                 <wp:inline xmlns:a="http://schemas.openxmlformats.org/drawingml/2006/main" xmlns:pic="http://schemas.openxmlformats.org/drawingml/2006/picture">
-                  <wp:extent cx="1250950" cy="370840"/>
+                  <wp:extent cx="827999" cy="540000"/>
                   <wp:docPr id="1" name="Picture 1"/>
                   <wp:cNvGraphicFramePr>
                     <a:graphicFrameLocks noChangeAspect="1"/>
@@ -69,7 +47,7 @@
                     <a:graphicData uri="http://schemas.openxmlformats.org/drawingml/2006/picture">
                       <pic:pic>
                         <pic:nvPicPr>
-                          <pic:cNvPr id="0" name="image.png"/>
+                          <pic:cNvPr id="0" name="orig_MODELO_CONSTRUÇÃO_rId9.png"/>
                           <pic:cNvPicPr/>
                         </pic:nvPicPr>
                         <pic:blipFill>
@@ -81,7 +59,7 @@
                         <pic:spPr>
                           <a:xfrm>
                             <a:off x="0" y="0"/>
-                            <a:ext cx="1250950" cy="370840"/>
+                            <a:ext cx="827999" cy="540000"/>
                           </a:xfrm>
                           <a:prstGeom prst="rect"/>
                         </pic:spPr>
@@ -95,40 +73,25 @@
         </w:tc>
         <w:tc>
           <w:tcPr>
-            <w:tcW w:type="dxa" w:w="5198"/>
-            <w:gridSpan w:val="3"/>
+            <w:tcW w:type="dxa" w:w="7256"/>
+            <w:gridSpan w:val="5"/>
             <w:tcBorders>
-              <w:bottom w:sz="2.2639999389648438" w:val="single" w:color="#000000"/>
+              <w:top w:val="single" w:sz="4" w:color="2F2F2F"/>
+              <w:left w:val="single" w:sz="4" w:color="2F2F2F"/>
+              <w:bottom w:val="single" w:sz="4" w:color="2F2F2F"/>
+              <w:right w:val="single" w:sz="4" w:color="2F2F2F"/>
             </w:tcBorders>
-            <w:tcMar>
-              <w:start w:w="0" w:type="dxa"/>
-              <w:end w:w="0" w:type="dxa"/>
-            </w:tcMar>
-            <w:tcMar>
-              <w:start w:w="0" w:type="dxa"/>
-              <w:end w:w="0" w:type="dxa"/>
-            </w:tcMar>
-            <w:tcMar>
-              <w:start w:w="0" w:type="dxa"/>
-              <w:end w:w="0" w:type="dxa"/>
-            </w:tcMar>
           </w:tcPr>
           <w:p>
             <w:pPr>
-              <w:autoSpaceDN w:val="0"/>
-              <w:autoSpaceDE w:val="0"/>
-              <w:widowControl/>
-              <w:spacing w:line="418" w:lineRule="exact" w:before="72" w:after="0"/>
-              <w:ind w:left="0" w:right="838" w:firstLine="0"/>
-              <w:jc w:val="right"/>
+              <w:spacing w:before="0" w:after="0"/>
+              <w:jc w:val="center"/>
             </w:pPr>
             <w:r>
               <w:rPr>
-                <w:rFonts w:ascii="" w:hAnsi="" w:eastAsia=""/>
+                <w:rFonts w:ascii="Arial" w:hAnsi="Arial"/>
                 <w:b/>
-                <w:i w:val="0"/>
-                <w:color w:val="303030"/>
-                <w:sz w:val="36"/>
+                <w:sz w:val="32"/>
               </w:rPr>
               <w:t>Ordem de Serviço</w:t>
             </w:r>
@@ -136,81 +99,61 @@
         </w:tc>
         <w:tc>
           <w:tcPr>
-            <w:tcW w:type="dxa" w:w="1224"/>
+            <w:tcW w:type="dxa" w:w="737"/>
             <w:tcBorders>
-              <w:bottom w:sz="2.2639999389648438" w:val="single" w:color="#000000"/>
+              <w:top w:val="single" w:sz="4" w:color="2F2F2F"/>
+              <w:left w:val="single" w:sz="4" w:color="2F2F2F"/>
+              <w:bottom w:val="single" w:sz="4" w:color="2F2F2F"/>
+              <w:right w:val="single" w:sz="4" w:color="2F2F2F"/>
             </w:tcBorders>
-            <w:tcMar>
-              <w:start w:w="0" w:type="dxa"/>
-              <w:end w:w="0" w:type="dxa"/>
-            </w:tcMar>
           </w:tcPr>
-          <w:p/>
+          <w:p>
+            <w:pPr>
+              <w:spacing w:before="0" w:after="0"/>
+              <w:jc w:val="left"/>
+            </w:pPr>
+          </w:p>
         </w:tc>
         <w:tc>
           <w:tcPr>
-            <w:tcW w:type="dxa" w:w="1438"/>
+            <w:tcW w:type="dxa" w:w="737"/>
             <w:tcBorders>
-              <w:bottom w:sz="2.2639999389648438" w:val="single" w:color="#000000"/>
+              <w:top w:val="single" w:sz="4" w:color="2F2F2F"/>
+              <w:left w:val="single" w:sz="4" w:color="2F2F2F"/>
+              <w:bottom w:val="single" w:sz="4" w:color="2F2F2F"/>
+              <w:right w:val="single" w:sz="4" w:color="2F2F2F"/>
             </w:tcBorders>
-            <w:tcMar>
-              <w:start w:w="0" w:type="dxa"/>
-              <w:end w:w="0" w:type="dxa"/>
-            </w:tcMar>
           </w:tcPr>
-          <w:p/>
-        </w:tc>
-        <w:tc>
-          <w:tcPr>
-            <w:tcW w:type="dxa" w:w="682"/>
-            <w:tcBorders>
-              <w:bottom w:sz="2.2639999389648438" w:val="single" w:color="#000000"/>
-            </w:tcBorders>
-            <w:tcMar>
-              <w:start w:w="0" w:type="dxa"/>
-              <w:end w:w="0" w:type="dxa"/>
-            </w:tcMar>
-          </w:tcPr>
-          <w:p/>
+          <w:p>
+            <w:pPr>
+              <w:spacing w:before="0" w:after="0"/>
+              <w:jc w:val="left"/>
+            </w:pPr>
+          </w:p>
         </w:tc>
       </w:tr>
       <w:tr>
-        <w:trPr>
-          <w:trHeight w:hRule="exact" w:val="466"/>
-        </w:trPr>
         <w:tc>
           <w:tcPr>
-            <w:tcW w:type="dxa" w:w="2802"/>
+            <w:tcW w:type="dxa" w:w="3288"/>
             <w:gridSpan w:val="2"/>
             <w:tcBorders>
-              <w:top w:sz="2.2639999389648438" w:val="single" w:color="#000000"/>
-              <w:bottom w:sz="2.2639999389648438" w:val="single" w:color="#C0C0C0"/>
+              <w:top w:val="single" w:sz="4" w:color="2F2F2F"/>
+              <w:left w:val="single" w:sz="4" w:color="2F2F2F"/>
+              <w:bottom w:val="single" w:sz="4" w:color="2F2F2F"/>
+              <w:right w:val="single" w:sz="4" w:color="2F2F2F"/>
             </w:tcBorders>
-            <w:tcMar>
-              <w:start w:w="0" w:type="dxa"/>
-              <w:end w:w="0" w:type="dxa"/>
-            </w:tcMar>
-            <w:tcMar>
-              <w:start w:w="0" w:type="dxa"/>
-              <w:end w:w="0" w:type="dxa"/>
-            </w:tcMar>
           </w:tcPr>
           <w:p>
             <w:pPr>
-              <w:autoSpaceDN w:val="0"/>
-              <w:autoSpaceDE w:val="0"/>
-              <w:widowControl/>
-              <w:spacing w:line="280" w:lineRule="exact" w:before="182" w:after="0"/>
-              <w:ind w:left="162" w:right="0" w:firstLine="0"/>
+              <w:spacing w:before="0" w:after="0"/>
               <w:jc w:val="left"/>
             </w:pPr>
             <w:r>
               <w:rPr>
-                <w:rFonts w:ascii="" w:hAnsi="" w:eastAsia=""/>
-                <w:b w:val="0"/>
-                <w:i w:val="0"/>
-                <w:color w:val="303030"/>
-                <w:sz w:val="18"/>
+                <w:rFonts w:ascii="Arial" w:hAnsi="Arial"/>
+                <w:b/>
+                <w:sz w:val="20"/>
               </w:rPr>
               <w:t>Ord.Serv. {{codigo}}</w:t>
             </w:r>
@@ -218,33 +161,24 @@
         </w:tc>
         <w:tc>
           <w:tcPr>
-            <w:tcW w:type="dxa" w:w="1690"/>
+            <w:tcW w:type="dxa" w:w="1474"/>
             <w:tcBorders>
-              <w:top w:sz="2.2639999389648438" w:val="single" w:color="#000000"/>
-              <w:end w:sz="2.2639999389648438" w:val="single" w:color="#C0C0C0"/>
-              <w:bottom w:sz="2.2639999389648438" w:val="single" w:color="#C0C0C0"/>
+              <w:top w:val="single" w:sz="4" w:color="2F2F2F"/>
+              <w:left w:val="single" w:sz="4" w:color="2F2F2F"/>
+              <w:bottom w:val="single" w:sz="4" w:color="2F2F2F"/>
+              <w:right w:val="single" w:sz="4" w:color="2F2F2F"/>
             </w:tcBorders>
-            <w:tcMar>
-              <w:start w:w="0" w:type="dxa"/>
-              <w:end w:w="0" w:type="dxa"/>
-            </w:tcMar>
           </w:tcPr>
           <w:p>
             <w:pPr>
-              <w:autoSpaceDN w:val="0"/>
-              <w:autoSpaceDE w:val="0"/>
-              <w:widowControl/>
-              <w:spacing w:line="208" w:lineRule="exact" w:before="186" w:after="0"/>
-              <w:ind w:left="0" w:right="116" w:firstLine="0"/>
-              <w:jc w:val="right"/>
+              <w:spacing w:before="0" w:after="0"/>
+              <w:jc w:val="left"/>
             </w:pPr>
             <w:r>
               <w:rPr>
-                <w:rFonts w:ascii="" w:hAnsi="" w:eastAsia=""/>
+                <w:rFonts w:ascii="Arial" w:hAnsi="Arial"/>
                 <w:b w:val="0"/>
-                <w:i w:val="0"/>
-                <w:color w:val="303030"/>
-                <w:sz w:val="18"/>
+                <w:sz w:val="20"/>
               </w:rPr>
               <w:t>Equipe</w:t>
             </w:r>
@@ -252,34 +186,24 @@
         </w:tc>
         <w:tc>
           <w:tcPr>
-            <w:tcW w:type="dxa" w:w="2216"/>
+            <w:tcW w:type="dxa" w:w="1247"/>
             <w:tcBorders>
-              <w:start w:sz="2.2639999389648438" w:val="single" w:color="#C0C0C0"/>
-              <w:top w:sz="2.2639999389648438" w:val="single" w:color="#000000"/>
-              <w:end w:sz="2.2639999389648438" w:val="single" w:color="#C0C0C0"/>
-              <w:bottom w:sz="2.2639999389648438" w:val="single" w:color="#C0C0C0"/>
+              <w:top w:val="single" w:sz="4" w:color="2F2F2F"/>
+              <w:left w:val="single" w:sz="4" w:color="2F2F2F"/>
+              <w:bottom w:val="single" w:sz="4" w:color="2F2F2F"/>
+              <w:right w:val="single" w:sz="4" w:color="2F2F2F"/>
             </w:tcBorders>
-            <w:tcMar>
-              <w:start w:w="0" w:type="dxa"/>
-              <w:end w:w="0" w:type="dxa"/>
-            </w:tcMar>
           </w:tcPr>
           <w:p>
             <w:pPr>
-              <w:autoSpaceDN w:val="0"/>
-              <w:autoSpaceDE w:val="0"/>
-              <w:widowControl/>
-              <w:spacing w:line="208" w:lineRule="exact" w:before="186" w:after="0"/>
-              <w:ind w:left="50" w:right="0" w:firstLine="0"/>
+              <w:spacing w:before="0" w:after="0"/>
               <w:jc w:val="left"/>
             </w:pPr>
             <w:r>
               <w:rPr>
-                <w:rFonts w:ascii="" w:hAnsi="" w:eastAsia=""/>
+                <w:rFonts w:ascii="Arial" w:hAnsi="Arial"/>
                 <w:b w:val="0"/>
-                <w:i w:val="0"/>
-                <w:color w:val="303030"/>
-                <w:sz w:val="18"/>
+                <w:sz w:val="20"/>
               </w:rPr>
               <w:t>{{equipe}}</w:t>
             </w:r>
@@ -287,33 +211,24 @@
         </w:tc>
         <w:tc>
           <w:tcPr>
-            <w:tcW w:type="dxa" w:w="1292"/>
+            <w:tcW w:type="dxa" w:w="1247"/>
             <w:tcBorders>
-              <w:start w:sz="2.2639999389648438" w:val="single" w:color="#C0C0C0"/>
-              <w:top w:sz="2.2639999389648438" w:val="single" w:color="#000000"/>
-              <w:bottom w:sz="2.2639999389648438" w:val="single" w:color="#C0C0C0"/>
+              <w:top w:val="single" w:sz="4" w:color="2F2F2F"/>
+              <w:left w:val="single" w:sz="4" w:color="2F2F2F"/>
+              <w:bottom w:val="single" w:sz="4" w:color="2F2F2F"/>
+              <w:right w:val="single" w:sz="4" w:color="2F2F2F"/>
             </w:tcBorders>
-            <w:tcMar>
-              <w:start w:w="0" w:type="dxa"/>
-              <w:end w:w="0" w:type="dxa"/>
-            </w:tcMar>
           </w:tcPr>
           <w:p>
             <w:pPr>
-              <w:autoSpaceDN w:val="0"/>
-              <w:autoSpaceDE w:val="0"/>
-              <w:widowControl/>
-              <w:spacing w:line="208" w:lineRule="exact" w:before="186" w:after="0"/>
-              <w:ind w:left="288" w:right="0" w:firstLine="0"/>
+              <w:spacing w:before="0" w:after="0"/>
               <w:jc w:val="left"/>
             </w:pPr>
             <w:r>
               <w:rPr>
-                <w:rFonts w:ascii="" w:hAnsi="" w:eastAsia=""/>
+                <w:rFonts w:ascii="Arial" w:hAnsi="Arial"/>
                 <w:b w:val="0"/>
-                <w:i w:val="0"/>
-                <w:color w:val="303030"/>
-                <w:sz w:val="18"/>
+                <w:sz w:val="20"/>
               </w:rPr>
               <w:t>ID Obra</w:t>
             </w:r>
@@ -321,32 +236,24 @@
         </w:tc>
         <w:tc>
           <w:tcPr>
-            <w:tcW w:type="dxa" w:w="1224"/>
+            <w:tcW w:type="dxa" w:w="1474"/>
             <w:tcBorders>
-              <w:top w:sz="2.2639999389648438" w:val="single" w:color="#000000"/>
-              <w:bottom w:sz="2.2639999389648438" w:val="single" w:color="#C0C0C0"/>
+              <w:top w:val="single" w:sz="4" w:color="2F2F2F"/>
+              <w:left w:val="single" w:sz="4" w:color="2F2F2F"/>
+              <w:bottom w:val="single" w:sz="4" w:color="2F2F2F"/>
+              <w:right w:val="single" w:sz="4" w:color="2F2F2F"/>
             </w:tcBorders>
-            <w:tcMar>
-              <w:start w:w="0" w:type="dxa"/>
-              <w:end w:w="0" w:type="dxa"/>
-            </w:tcMar>
           </w:tcPr>
           <w:p>
             <w:pPr>
-              <w:autoSpaceDN w:val="0"/>
-              <w:autoSpaceDE w:val="0"/>
-              <w:widowControl/>
-              <w:spacing w:line="208" w:lineRule="exact" w:before="186" w:after="0"/>
-              <w:ind w:left="0" w:right="488" w:firstLine="0"/>
-              <w:jc w:val="right"/>
+              <w:spacing w:before="0" w:after="0"/>
+              <w:jc w:val="left"/>
             </w:pPr>
             <w:r>
               <w:rPr>
-                <w:rFonts w:ascii="" w:hAnsi="" w:eastAsia=""/>
+                <w:rFonts w:ascii="Arial" w:hAnsi="Arial"/>
                 <w:b w:val="0"/>
-                <w:i w:val="0"/>
-                <w:color w:val="303030"/>
-                <w:sz w:val="18"/>
+                <w:sz w:val="20"/>
               </w:rPr>
               <w:t>{{id_obra}}</w:t>
             </w:r>
@@ -354,32 +261,24 @@
         </w:tc>
         <w:tc>
           <w:tcPr>
-            <w:tcW w:type="dxa" w:w="1438"/>
+            <w:tcW w:type="dxa" w:w="737"/>
             <w:tcBorders>
-              <w:top w:sz="2.2639999389648438" w:val="single" w:color="#000000"/>
-              <w:bottom w:sz="2.2639999389648438" w:val="single" w:color="#C0C0C0"/>
+              <w:top w:val="single" w:sz="4" w:color="2F2F2F"/>
+              <w:left w:val="single" w:sz="4" w:color="2F2F2F"/>
+              <w:bottom w:val="single" w:sz="4" w:color="2F2F2F"/>
+              <w:right w:val="single" w:sz="4" w:color="2F2F2F"/>
             </w:tcBorders>
-            <w:tcMar>
-              <w:start w:w="0" w:type="dxa"/>
-              <w:end w:w="0" w:type="dxa"/>
-            </w:tcMar>
           </w:tcPr>
           <w:p>
             <w:pPr>
-              <w:autoSpaceDN w:val="0"/>
-              <w:autoSpaceDE w:val="0"/>
-              <w:widowControl/>
-              <w:spacing w:line="208" w:lineRule="exact" w:before="186" w:after="0"/>
-              <w:ind w:left="0" w:right="198" w:firstLine="0"/>
-              <w:jc w:val="right"/>
+              <w:spacing w:before="0" w:after="0"/>
+              <w:jc w:val="left"/>
             </w:pPr>
             <w:r>
               <w:rPr>
-                <w:rFonts w:ascii="" w:hAnsi="" w:eastAsia=""/>
+                <w:rFonts w:ascii="Arial" w:hAnsi="Arial"/>
                 <w:b w:val="0"/>
-                <w:i w:val="0"/>
-                <w:color w:val="303030"/>
-                <w:sz w:val="18"/>
+                <w:sz w:val="20"/>
               </w:rPr>
               <w:t>Agência</w:t>
             </w:r>
@@ -387,32 +286,24 @@
         </w:tc>
         <w:tc>
           <w:tcPr>
-            <w:tcW w:type="dxa" w:w="682"/>
+            <w:tcW w:type="dxa" w:w="737"/>
             <w:tcBorders>
-              <w:top w:sz="2.2639999389648438" w:val="single" w:color="#000000"/>
-              <w:bottom w:sz="2.2639999389648438" w:val="single" w:color="#C0C0C0"/>
+              <w:top w:val="single" w:sz="4" w:color="2F2F2F"/>
+              <w:left w:val="single" w:sz="4" w:color="2F2F2F"/>
+              <w:bottom w:val="single" w:sz="4" w:color="2F2F2F"/>
+              <w:right w:val="single" w:sz="4" w:color="2F2F2F"/>
             </w:tcBorders>
-            <w:tcMar>
-              <w:start w:w="0" w:type="dxa"/>
-              <w:end w:w="0" w:type="dxa"/>
-            </w:tcMar>
           </w:tcPr>
           <w:p>
             <w:pPr>
-              <w:autoSpaceDN w:val="0"/>
-              <w:autoSpaceDE w:val="0"/>
-              <w:widowControl/>
-              <w:spacing w:line="208" w:lineRule="exact" w:before="186" w:after="0"/>
-              <w:ind w:left="18" w:right="0" w:firstLine="0"/>
+              <w:spacing w:before="0" w:after="0"/>
               <w:jc w:val="left"/>
             </w:pPr>
             <w:r>
               <w:rPr>
-                <w:rFonts w:ascii="" w:hAnsi="" w:eastAsia=""/>
+                <w:rFonts w:ascii="Arial" w:hAnsi="Arial"/>
                 <w:b w:val="0"/>
-                <w:i w:val="0"/>
-                <w:color w:val="303030"/>
-                <w:sz w:val="18"/>
+                <w:sz w:val="20"/>
               </w:rPr>
               <w:t>{{agencia}}</w:t>
             </w:r>
@@ -420,38 +311,26 @@
         </w:tc>
       </w:tr>
       <w:tr>
-        <w:trPr>
-          <w:trHeight w:hRule="exact" w:val="510"/>
-        </w:trPr>
         <w:tc>
           <w:tcPr>
-            <w:tcW w:type="dxa" w:w="968"/>
+            <w:tcW w:type="dxa" w:w="1474"/>
             <w:tcBorders>
-              <w:top w:sz="2.2639999389648438" w:val="single" w:color="#C0C0C0"/>
-              <w:end w:sz="2.2639999389648438" w:val="single" w:color="#C0C0C0"/>
-              <w:bottom w:sz="2.2639999389648438" w:val="single" w:color="#C0C0C0"/>
+              <w:top w:val="single" w:sz="4" w:color="2F2F2F"/>
+              <w:left w:val="single" w:sz="4" w:color="2F2F2F"/>
+              <w:bottom w:val="single" w:sz="4" w:color="2F2F2F"/>
+              <w:right w:val="single" w:sz="4" w:color="2F2F2F"/>
             </w:tcBorders>
-            <w:tcMar>
-              <w:start w:w="0" w:type="dxa"/>
-              <w:end w:w="0" w:type="dxa"/>
-            </w:tcMar>
           </w:tcPr>
           <w:p>
             <w:pPr>
-              <w:autoSpaceDN w:val="0"/>
-              <w:autoSpaceDE w:val="0"/>
-              <w:widowControl/>
-              <w:spacing w:line="208" w:lineRule="exact" w:before="234" w:after="0"/>
-              <w:ind w:left="0" w:right="148" w:firstLine="0"/>
-              <w:jc w:val="right"/>
+              <w:spacing w:before="0" w:after="0"/>
+              <w:jc w:val="left"/>
             </w:pPr>
             <w:r>
               <w:rPr>
-                <w:rFonts w:ascii="" w:hAnsi="" w:eastAsia=""/>
+                <w:rFonts w:ascii="Arial" w:hAnsi="Arial"/>
                 <w:b w:val="0"/>
-                <w:i w:val="0"/>
-                <w:color w:val="303030"/>
-                <w:sz w:val="18"/>
+                <w:sz w:val="20"/>
               </w:rPr>
               <w:t>Data</w:t>
             </w:r>
@@ -459,33 +338,24 @@
         </w:tc>
         <w:tc>
           <w:tcPr>
-            <w:tcW w:type="dxa" w:w="1834"/>
+            <w:tcW w:type="dxa" w:w="1814"/>
             <w:tcBorders>
-              <w:start w:sz="2.2639999389648438" w:val="single" w:color="#C0C0C0"/>
-              <w:top w:sz="2.2639999389648438" w:val="single" w:color="#C0C0C0"/>
-              <w:bottom w:sz="2.2639999389648438" w:val="single" w:color="#C0C0C0"/>
+              <w:top w:val="single" w:sz="4" w:color="2F2F2F"/>
+              <w:left w:val="single" w:sz="4" w:color="2F2F2F"/>
+              <w:bottom w:val="single" w:sz="4" w:color="2F2F2F"/>
+              <w:right w:val="single" w:sz="4" w:color="2F2F2F"/>
             </w:tcBorders>
-            <w:tcMar>
-              <w:start w:w="0" w:type="dxa"/>
-              <w:end w:w="0" w:type="dxa"/>
-            </w:tcMar>
           </w:tcPr>
           <w:p>
             <w:pPr>
-              <w:autoSpaceDN w:val="0"/>
-              <w:autoSpaceDE w:val="0"/>
-              <w:widowControl/>
-              <w:spacing w:line="208" w:lineRule="exact" w:before="234" w:after="0"/>
-              <w:ind w:left="52" w:right="0" w:firstLine="0"/>
+              <w:spacing w:before="0" w:after="0"/>
               <w:jc w:val="left"/>
             </w:pPr>
             <w:r>
               <w:rPr>
-                <w:rFonts w:ascii="" w:hAnsi="" w:eastAsia=""/>
+                <w:rFonts w:ascii="Arial" w:hAnsi="Arial"/>
                 <w:b w:val="0"/>
-                <w:i w:val="0"/>
-                <w:color w:val="303030"/>
-                <w:sz w:val="18"/>
+                <w:sz w:val="20"/>
               </w:rPr>
               <w:t>{{data}}</w:t>
             </w:r>
@@ -493,33 +363,24 @@
         </w:tc>
         <w:tc>
           <w:tcPr>
-            <w:tcW w:type="dxa" w:w="1690"/>
+            <w:tcW w:type="dxa" w:w="1474"/>
             <w:tcBorders>
-              <w:top w:sz="2.2639999389648438" w:val="single" w:color="#C0C0C0"/>
-              <w:end w:sz="2.2639999389648438" w:val="single" w:color="#C0C0C0"/>
-              <w:bottom w:sz="2.2639999389648438" w:val="single" w:color="#C0C0C0"/>
+              <w:top w:val="single" w:sz="4" w:color="2F2F2F"/>
+              <w:left w:val="single" w:sz="4" w:color="2F2F2F"/>
+              <w:bottom w:val="single" w:sz="4" w:color="2F2F2F"/>
+              <w:right w:val="single" w:sz="4" w:color="2F2F2F"/>
             </w:tcBorders>
-            <w:tcMar>
-              <w:start w:w="0" w:type="dxa"/>
-              <w:end w:w="0" w:type="dxa"/>
-            </w:tcMar>
           </w:tcPr>
           <w:p>
             <w:pPr>
-              <w:autoSpaceDN w:val="0"/>
-              <w:autoSpaceDE w:val="0"/>
-              <w:widowControl/>
-              <w:spacing w:line="208" w:lineRule="exact" w:before="234" w:after="0"/>
-              <w:ind w:left="0" w:right="114" w:firstLine="0"/>
-              <w:jc w:val="right"/>
+              <w:spacing w:before="0" w:after="0"/>
+              <w:jc w:val="left"/>
             </w:pPr>
             <w:r>
               <w:rPr>
-                <w:rFonts w:ascii="" w:hAnsi="" w:eastAsia=""/>
+                <w:rFonts w:ascii="Arial" w:hAnsi="Arial"/>
                 <w:b w:val="0"/>
-                <w:i w:val="0"/>
-                <w:color w:val="303030"/>
-                <w:sz w:val="18"/>
+                <w:sz w:val="20"/>
               </w:rPr>
               <w:t>Encarregado</w:t>
             </w:r>
@@ -527,38 +388,25 @@
         </w:tc>
         <w:tc>
           <w:tcPr>
-            <w:tcW w:type="dxa" w:w="3508"/>
+            <w:tcW w:type="dxa" w:w="2494"/>
             <w:gridSpan w:val="2"/>
             <w:tcBorders>
-              <w:start w:sz="2.2639999389648438" w:val="single" w:color="#C0C0C0"/>
-              <w:top w:sz="2.2639999389648438" w:val="single" w:color="#C0C0C0"/>
-              <w:bottom w:sz="2.2639999389648438" w:val="single" w:color="#C0C0C0"/>
+              <w:top w:val="single" w:sz="4" w:color="2F2F2F"/>
+              <w:left w:val="single" w:sz="4" w:color="2F2F2F"/>
+              <w:bottom w:val="single" w:sz="4" w:color="2F2F2F"/>
+              <w:right w:val="single" w:sz="4" w:color="2F2F2F"/>
             </w:tcBorders>
-            <w:tcMar>
-              <w:start w:w="0" w:type="dxa"/>
-              <w:end w:w="0" w:type="dxa"/>
-            </w:tcMar>
-            <w:tcMar>
-              <w:start w:w="0" w:type="dxa"/>
-              <w:end w:w="0" w:type="dxa"/>
-            </w:tcMar>
           </w:tcPr>
           <w:p>
             <w:pPr>
-              <w:autoSpaceDN w:val="0"/>
-              <w:autoSpaceDE w:val="0"/>
-              <w:widowControl/>
-              <w:spacing w:line="208" w:lineRule="exact" w:before="234" w:after="0"/>
-              <w:ind w:left="50" w:right="0" w:firstLine="0"/>
+              <w:spacing w:before="0" w:after="0"/>
               <w:jc w:val="left"/>
             </w:pPr>
             <w:r>
               <w:rPr>
-                <w:rFonts w:ascii="" w:hAnsi="" w:eastAsia=""/>
+                <w:rFonts w:ascii="Arial" w:hAnsi="Arial"/>
                 <w:b w:val="0"/>
-                <w:i w:val="0"/>
-                <w:color w:val="303030"/>
-                <w:sz w:val="18"/>
+                <w:sz w:val="20"/>
               </w:rPr>
               <w:t>{{encarregado}}</w:t>
             </w:r>
@@ -566,83 +414,77 @@
         </w:tc>
         <w:tc>
           <w:tcPr>
-            <w:tcW w:type="dxa" w:w="1224"/>
+            <w:tcW w:type="dxa" w:w="1474"/>
             <w:tcBorders>
-              <w:top w:sz="2.2639999389648438" w:val="single" w:color="#C0C0C0"/>
-              <w:bottom w:sz="2.2639999389648438" w:val="single" w:color="#C0C0C0"/>
+              <w:top w:val="single" w:sz="4" w:color="2F2F2F"/>
+              <w:left w:val="single" w:sz="4" w:color="2F2F2F"/>
+              <w:bottom w:val="single" w:sz="4" w:color="2F2F2F"/>
+              <w:right w:val="single" w:sz="4" w:color="2F2F2F"/>
             </w:tcBorders>
-            <w:tcMar>
-              <w:start w:w="0" w:type="dxa"/>
-              <w:end w:w="0" w:type="dxa"/>
-            </w:tcMar>
           </w:tcPr>
-          <w:p/>
+          <w:p>
+            <w:pPr>
+              <w:spacing w:before="0" w:after="0"/>
+              <w:jc w:val="left"/>
+            </w:pPr>
+          </w:p>
         </w:tc>
         <w:tc>
           <w:tcPr>
-            <w:tcW w:type="dxa" w:w="1438"/>
+            <w:tcW w:type="dxa" w:w="737"/>
             <w:tcBorders>
-              <w:top w:sz="2.2639999389648438" w:val="single" w:color="#C0C0C0"/>
-              <w:bottom w:sz="2.2639999389648438" w:val="single" w:color="#C0C0C0"/>
+              <w:top w:val="single" w:sz="4" w:color="2F2F2F"/>
+              <w:left w:val="single" w:sz="4" w:color="2F2F2F"/>
+              <w:bottom w:val="single" w:sz="4" w:color="2F2F2F"/>
+              <w:right w:val="single" w:sz="4" w:color="2F2F2F"/>
             </w:tcBorders>
-            <w:tcMar>
-              <w:start w:w="0" w:type="dxa"/>
-              <w:end w:w="0" w:type="dxa"/>
-            </w:tcMar>
           </w:tcPr>
-          <w:p/>
+          <w:p>
+            <w:pPr>
+              <w:spacing w:before="0" w:after="0"/>
+              <w:jc w:val="left"/>
+            </w:pPr>
+          </w:p>
         </w:tc>
         <w:tc>
           <w:tcPr>
-            <w:tcW w:type="dxa" w:w="682"/>
+            <w:tcW w:type="dxa" w:w="737"/>
             <w:tcBorders>
-              <w:top w:sz="2.2639999389648438" w:val="single" w:color="#C0C0C0"/>
-              <w:bottom w:sz="2.2639999389648438" w:val="single" w:color="#C0C0C0"/>
+              <w:top w:val="single" w:sz="4" w:color="2F2F2F"/>
+              <w:left w:val="single" w:sz="4" w:color="2F2F2F"/>
+              <w:bottom w:val="single" w:sz="4" w:color="2F2F2F"/>
+              <w:right w:val="single" w:sz="4" w:color="2F2F2F"/>
             </w:tcBorders>
-            <w:tcMar>
-              <w:start w:w="0" w:type="dxa"/>
-              <w:end w:w="0" w:type="dxa"/>
-            </w:tcMar>
           </w:tcPr>
-          <w:p/>
+          <w:p>
+            <w:pPr>
+              <w:spacing w:before="0" w:after="0"/>
+              <w:jc w:val="left"/>
+            </w:pPr>
+          </w:p>
         </w:tc>
       </w:tr>
       <w:tr>
-        <w:trPr>
-          <w:trHeight w:hRule="exact" w:val="460"/>
-        </w:trPr>
         <w:tc>
           <w:tcPr>
-            <w:tcW w:type="dxa" w:w="2802"/>
+            <w:tcW w:type="dxa" w:w="1474"/>
             <w:tcBorders>
-              <w:top w:sz="2.2639999389648438" w:val="single" w:color="#C0C0C0"/>
-              <w:bottom w:sz="2.2639999389648438" w:val="single" w:color="#C0C0C0"/>
+              <w:top w:val="single" w:sz="4" w:color="2F2F2F"/>
+              <w:left w:val="single" w:sz="4" w:color="2F2F2F"/>
+              <w:bottom w:val="single" w:sz="4" w:color="2F2F2F"/>
+              <w:right w:val="single" w:sz="4" w:color="2F2F2F"/>
             </w:tcBorders>
-            <w:tcMar>
-              <w:start w:w="0" w:type="dxa"/>
-              <w:end w:w="0" w:type="dxa"/>
-            </w:tcMar>
-            <w:tcMar>
-              <w:start w:w="0" w:type="dxa"/>
-              <w:end w:w="0" w:type="dxa"/>
-            </w:tcMar>
           </w:tcPr>
           <w:p>
             <w:pPr>
-              <w:autoSpaceDN w:val="0"/>
-              <w:autoSpaceDE w:val="0"/>
-              <w:widowControl/>
-              <w:spacing w:line="210" w:lineRule="exact" w:before="184" w:after="0"/>
-              <w:ind w:left="434" w:right="0" w:firstLine="0"/>
+              <w:spacing w:before="0" w:after="0"/>
               <w:jc w:val="left"/>
             </w:pPr>
             <w:r>
               <w:rPr>
-                <w:rFonts w:ascii="" w:hAnsi="" w:eastAsia=""/>
+                <w:rFonts w:ascii="Arial" w:hAnsi="Arial"/>
                 <w:b w:val="0"/>
-                <w:i w:val="0"/>
-                <w:color w:val="303030"/>
-                <w:sz w:val="18"/>
+                <w:sz w:val="20"/>
               </w:rPr>
               <w:t>Obra</w:t>
             </w:r>
@@ -650,63 +492,75 @@
         </w:tc>
         <w:tc>
           <w:tcPr>
-            <w:tcW w:type="dxa" w:w="2802"/>
+            <w:tcW w:type="dxa" w:w="1814"/>
             <w:tcBorders>
-              <w:top w:sz="2.2639999389648438" w:val="single" w:color="#C0C0C0"/>
-              <w:bottom w:sz="2.2639999389648438" w:val="single" w:color="#C0C0C0"/>
+              <w:top w:val="single" w:sz="4" w:color="2F2F2F"/>
+              <w:left w:val="single" w:sz="4" w:color="2F2F2F"/>
+              <w:bottom w:val="single" w:sz="4" w:color="2F2F2F"/>
+              <w:right w:val="single" w:sz="4" w:color="2F2F2F"/>
             </w:tcBorders>
-            <w:tcMar>
-              <w:start w:w="0" w:type="dxa"/>
-              <w:end w:w="0" w:type="dxa"/>
-            </w:tcMar>
-            <w:tcMar>
-              <w:start w:w="0" w:type="dxa"/>
-              <w:end w:w="0" w:type="dxa"/>
-            </w:tcMar>
           </w:tcPr>
           <w:p>
+            <w:pPr>
+              <w:spacing w:before="0" w:after="0"/>
+              <w:jc w:val="left"/>
+            </w:pPr>
             <w:r>
+              <w:rPr>
+                <w:rFonts w:ascii="Arial" w:hAnsi="Arial"/>
+                <w:b w:val="0"/>
+                <w:sz w:val="20"/>
+              </w:rPr>
               <w:t>{{obra}}</w:t>
             </w:r>
           </w:p>
         </w:tc>
         <w:tc>
           <w:tcPr>
-            <w:tcW w:type="dxa" w:w="5198"/>
+            <w:tcW w:type="dxa" w:w="3968"/>
             <w:gridSpan w:val="3"/>
             <w:tcBorders>
-              <w:top w:sz="2.2639999389648438" w:val="single" w:color="#C0C0C0"/>
-              <w:bottom w:sz="2.2639999389648438" w:val="single" w:color="#C0C0C0"/>
+              <w:top w:val="single" w:sz="4" w:color="2F2F2F"/>
+              <w:left w:val="single" w:sz="4" w:color="2F2F2F"/>
+              <w:bottom w:val="single" w:sz="4" w:color="2F2F2F"/>
+              <w:right w:val="single" w:sz="4" w:color="2F2F2F"/>
             </w:tcBorders>
-            <w:tcMar>
-              <w:start w:w="0" w:type="dxa"/>
-              <w:end w:w="0" w:type="dxa"/>
-            </w:tcMar>
-            <w:tcMar>
-              <w:start w:w="0" w:type="dxa"/>
-              <w:end w:w="0" w:type="dxa"/>
-            </w:tcMar>
-            <w:tcMar>
-              <w:start w:w="0" w:type="dxa"/>
-              <w:end w:w="0" w:type="dxa"/>
-            </w:tcMar>
           </w:tcPr>
           <w:p>
             <w:pPr>
-              <w:autoSpaceDN w:val="0"/>
-              <w:autoSpaceDE w:val="0"/>
-              <w:widowControl/>
-              <w:spacing w:line="210" w:lineRule="exact" w:before="184" w:after="0"/>
-              <w:ind w:left="0" w:right="100" w:firstLine="0"/>
-              <w:jc w:val="right"/>
+              <w:spacing w:before="0" w:after="0"/>
+              <w:jc w:val="left"/>
             </w:pPr>
             <w:r>
               <w:rPr>
-                <w:rFonts w:ascii="" w:hAnsi="" w:eastAsia=""/>
+                <w:rFonts w:ascii="Arial" w:hAnsi="Arial"/>
+                <w:b/>
+                <w:sz w:val="20"/>
+              </w:rPr>
+              <w:t>Atividade</w:t>
+            </w:r>
+          </w:p>
+        </w:tc>
+        <w:tc>
+          <w:tcPr>
+            <w:tcW w:type="dxa" w:w="1474"/>
+            <w:tcBorders>
+              <w:top w:val="single" w:sz="4" w:color="2F2F2F"/>
+              <w:left w:val="single" w:sz="4" w:color="2F2F2F"/>
+              <w:bottom w:val="single" w:sz="4" w:color="2F2F2F"/>
+              <w:right w:val="single" w:sz="4" w:color="2F2F2F"/>
+            </w:tcBorders>
+          </w:tcPr>
+          <w:p>
+            <w:pPr>
+              <w:spacing w:before="0" w:after="0"/>
+              <w:jc w:val="left"/>
+            </w:pPr>
+            <w:r>
+              <w:rPr>
+                <w:rFonts w:ascii="Arial" w:hAnsi="Arial"/>
                 <w:b w:val="0"/>
-                <w:i w:val="0"/>
-                <w:color w:val="303030"/>
-                <w:sz w:val="18"/>
+                <w:sz w:val="20"/>
               </w:rPr>
               <w:t>{{atividade}}</w:t>
             </w:r>
@@ -714,102 +568,60 @@
         </w:tc>
         <w:tc>
           <w:tcPr>
-            <w:tcW w:type="dxa" w:w="1224"/>
+            <w:tcW w:type="dxa" w:w="737"/>
             <w:tcBorders>
-              <w:top w:sz="2.2639999389648438" w:val="single" w:color="#C0C0C0"/>
-              <w:bottom w:sz="2.2639999389648438" w:val="single" w:color="#C0C0C0"/>
+              <w:top w:val="single" w:sz="4" w:color="2F2F2F"/>
+              <w:left w:val="single" w:sz="4" w:color="2F2F2F"/>
+              <w:bottom w:val="single" w:sz="4" w:color="2F2F2F"/>
+              <w:right w:val="single" w:sz="4" w:color="2F2F2F"/>
             </w:tcBorders>
-            <w:tcMar>
-              <w:start w:w="0" w:type="dxa"/>
-              <w:end w:w="0" w:type="dxa"/>
-            </w:tcMar>
           </w:tcPr>
           <w:p>
             <w:pPr>
-              <w:autoSpaceDN w:val="0"/>
-              <w:autoSpaceDE w:val="0"/>
-              <w:widowControl/>
-              <w:spacing w:line="210" w:lineRule="exact" w:before="184" w:after="0"/>
-              <w:ind w:left="118" w:right="0" w:firstLine="0"/>
+              <w:spacing w:before="0" w:after="0"/>
+              <w:jc w:val="left"/>
+            </w:pPr>
+          </w:p>
+        </w:tc>
+        <w:tc>
+          <w:tcPr>
+            <w:tcW w:type="dxa" w:w="737"/>
+            <w:tcBorders>
+              <w:top w:val="single" w:sz="4" w:color="2F2F2F"/>
+              <w:left w:val="single" w:sz="4" w:color="2F2F2F"/>
+              <w:bottom w:val="single" w:sz="4" w:color="2F2F2F"/>
+              <w:right w:val="single" w:sz="4" w:color="2F2F2F"/>
+            </w:tcBorders>
+          </w:tcPr>
+          <w:p>
+            <w:pPr>
+              <w:spacing w:before="0" w:after="0"/>
+              <w:jc w:val="left"/>
+            </w:pPr>
+          </w:p>
+        </w:tc>
+      </w:tr>
+      <w:tr>
+        <w:tc>
+          <w:tcPr>
+            <w:tcW w:type="dxa" w:w="1474"/>
+            <w:tcBorders>
+              <w:top w:val="single" w:sz="4" w:color="2F2F2F"/>
+              <w:left w:val="single" w:sz="4" w:color="2F2F2F"/>
+              <w:bottom w:val="single" w:sz="4" w:color="2F2F2F"/>
+              <w:right w:val="single" w:sz="4" w:color="2F2F2F"/>
+            </w:tcBorders>
+          </w:tcPr>
+          <w:p>
+            <w:pPr>
+              <w:spacing w:before="0" w:after="0"/>
               <w:jc w:val="left"/>
             </w:pPr>
             <w:r>
               <w:rPr>
-                <w:rFonts w:ascii="" w:hAnsi="" w:eastAsia=""/>
+                <w:rFonts w:ascii="Arial" w:hAnsi="Arial"/>
                 <w:b w:val="0"/>
-                <w:i w:val="0"/>
-                <w:color w:val="303030"/>
-                <w:sz w:val="18"/>
-              </w:rPr>
-              <w:t>CONSTRUÇÃO</w:t>
-            </w:r>
-          </w:p>
-        </w:tc>
-        <w:tc>
-          <w:tcPr>
-            <w:tcW w:type="dxa" w:w="1438"/>
-            <w:tcBorders>
-              <w:top w:sz="2.2639999389648438" w:val="single" w:color="#C0C0C0"/>
-              <w:bottom w:sz="2.2639999389648438" w:val="single" w:color="#C0C0C0"/>
-            </w:tcBorders>
-            <w:tcMar>
-              <w:start w:w="0" w:type="dxa"/>
-              <w:end w:w="0" w:type="dxa"/>
-            </w:tcMar>
-          </w:tcPr>
-          <w:p/>
-        </w:tc>
-        <w:tc>
-          <w:tcPr>
-            <w:tcW w:type="dxa" w:w="682"/>
-            <w:tcBorders>
-              <w:top w:sz="2.2639999389648438" w:val="single" w:color="#C0C0C0"/>
-              <w:bottom w:sz="2.2639999389648438" w:val="single" w:color="#C0C0C0"/>
-            </w:tcBorders>
-            <w:tcMar>
-              <w:start w:w="0" w:type="dxa"/>
-              <w:end w:w="0" w:type="dxa"/>
-            </w:tcMar>
-          </w:tcPr>
-          <w:p/>
-        </w:tc>
-      </w:tr>
-      <w:tr>
-        <w:trPr>
-          <w:trHeight w:hRule="exact" w:val="420"/>
-        </w:trPr>
-        <w:tc>
-          <w:tcPr>
-            <w:tcW w:type="dxa" w:w="2802"/>
-            <w:tcBorders>
-              <w:top w:sz="2.2639999389648438" w:val="single" w:color="#C0C0C0"/>
-              <w:bottom w:sz="2.2639999389648438" w:val="single" w:color="#C0C0C0"/>
-            </w:tcBorders>
-            <w:tcMar>
-              <w:start w:w="0" w:type="dxa"/>
-              <w:end w:w="0" w:type="dxa"/>
-            </w:tcMar>
-            <w:tcMar>
-              <w:start w:w="0" w:type="dxa"/>
-              <w:end w:w="0" w:type="dxa"/>
-            </w:tcMar>
-          </w:tcPr>
-          <w:p>
-            <w:pPr>
-              <w:autoSpaceDN w:val="0"/>
-              <w:autoSpaceDE w:val="0"/>
-              <w:widowControl/>
-              <w:spacing w:line="210" w:lineRule="exact" w:before="144" w:after="0"/>
-              <w:ind w:left="396" w:right="0" w:firstLine="0"/>
-              <w:jc w:val="left"/>
-            </w:pPr>
-            <w:r>
-              <w:rPr>
-                <w:rFonts w:ascii="" w:hAnsi="" w:eastAsia=""/>
-                <w:b w:val="0"/>
-                <w:i w:val="0"/>
-                <w:color w:val="303030"/>
-                <w:sz w:val="18"/>
+                <w:sz w:val="20"/>
               </w:rPr>
               <w:t>Local</w:t>
             </w:r>
@@ -817,63 +629,75 @@
         </w:tc>
         <w:tc>
           <w:tcPr>
-            <w:tcW w:type="dxa" w:w="2802"/>
+            <w:tcW w:type="dxa" w:w="1814"/>
             <w:tcBorders>
-              <w:top w:sz="2.2639999389648438" w:val="single" w:color="#C0C0C0"/>
-              <w:bottom w:sz="2.2639999389648438" w:val="single" w:color="#C0C0C0"/>
+              <w:top w:val="single" w:sz="4" w:color="2F2F2F"/>
+              <w:left w:val="single" w:sz="4" w:color="2F2F2F"/>
+              <w:bottom w:val="single" w:sz="4" w:color="2F2F2F"/>
+              <w:right w:val="single" w:sz="4" w:color="2F2F2F"/>
             </w:tcBorders>
-            <w:tcMar>
-              <w:start w:w="0" w:type="dxa"/>
-              <w:end w:w="0" w:type="dxa"/>
-            </w:tcMar>
-            <w:tcMar>
-              <w:start w:w="0" w:type="dxa"/>
-              <w:end w:w="0" w:type="dxa"/>
-            </w:tcMar>
           </w:tcPr>
           <w:p>
+            <w:pPr>
+              <w:spacing w:before="0" w:after="0"/>
+              <w:jc w:val="left"/>
+            </w:pPr>
             <w:r>
+              <w:rPr>
+                <w:rFonts w:ascii="Arial" w:hAnsi="Arial"/>
+                <w:b w:val="0"/>
+                <w:sz w:val="20"/>
+              </w:rPr>
               <w:t>{{local}}</w:t>
             </w:r>
           </w:p>
         </w:tc>
         <w:tc>
           <w:tcPr>
-            <w:tcW w:type="dxa" w:w="5198"/>
+            <w:tcW w:type="dxa" w:w="3968"/>
             <w:gridSpan w:val="3"/>
             <w:tcBorders>
-              <w:top w:sz="2.2639999389648438" w:val="single" w:color="#C0C0C0"/>
-              <w:bottom w:sz="2.2639999389648438" w:val="single" w:color="#C0C0C0"/>
+              <w:top w:val="single" w:sz="4" w:color="2F2F2F"/>
+              <w:left w:val="single" w:sz="4" w:color="2F2F2F"/>
+              <w:bottom w:val="single" w:sz="4" w:color="2F2F2F"/>
+              <w:right w:val="single" w:sz="4" w:color="2F2F2F"/>
             </w:tcBorders>
-            <w:tcMar>
-              <w:start w:w="0" w:type="dxa"/>
-              <w:end w:w="0" w:type="dxa"/>
-            </w:tcMar>
-            <w:tcMar>
-              <w:start w:w="0" w:type="dxa"/>
-              <w:end w:w="0" w:type="dxa"/>
-            </w:tcMar>
-            <w:tcMar>
-              <w:start w:w="0" w:type="dxa"/>
-              <w:end w:w="0" w:type="dxa"/>
-            </w:tcMar>
           </w:tcPr>
           <w:p>
             <w:pPr>
-              <w:autoSpaceDN w:val="0"/>
-              <w:autoSpaceDE w:val="0"/>
-              <w:widowControl/>
-              <w:spacing w:line="210" w:lineRule="exact" w:before="144" w:after="0"/>
-              <w:ind w:left="0" w:right="98" w:firstLine="0"/>
-              <w:jc w:val="right"/>
+              <w:spacing w:before="0" w:after="0"/>
+              <w:jc w:val="left"/>
             </w:pPr>
             <w:r>
               <w:rPr>
-                <w:rFonts w:ascii="" w:hAnsi="" w:eastAsia=""/>
+                <w:rFonts w:ascii="Arial" w:hAnsi="Arial"/>
+                <w:b/>
+                <w:sz w:val="20"/>
+              </w:rPr>
+              <w:t>Município</w:t>
+            </w:r>
+          </w:p>
+        </w:tc>
+        <w:tc>
+          <w:tcPr>
+            <w:tcW w:type="dxa" w:w="1474"/>
+            <w:tcBorders>
+              <w:top w:val="single" w:sz="4" w:color="2F2F2F"/>
+              <w:left w:val="single" w:sz="4" w:color="2F2F2F"/>
+              <w:bottom w:val="single" w:sz="4" w:color="2F2F2F"/>
+              <w:right w:val="single" w:sz="4" w:color="2F2F2F"/>
+            </w:tcBorders>
+          </w:tcPr>
+          <w:p>
+            <w:pPr>
+              <w:spacing w:before="0" w:after="0"/>
+              <w:jc w:val="left"/>
+            </w:pPr>
+            <w:r>
+              <w:rPr>
+                <w:rFonts w:ascii="Arial" w:hAnsi="Arial"/>
                 <w:b w:val="0"/>
-                <w:i w:val="0"/>
-                <w:color w:val="303030"/>
-                <w:sz w:val="18"/>
+                <w:sz w:val="20"/>
               </w:rPr>
               <w:t>{{municipio}}</w:t>
             </w:r>
@@ -881,270 +705,161 @@
         </w:tc>
         <w:tc>
           <w:tcPr>
-            <w:tcW w:type="dxa" w:w="1224"/>
+            <w:tcW w:type="dxa" w:w="737"/>
             <w:tcBorders>
-              <w:top w:sz="2.2639999389648438" w:val="single" w:color="#C0C0C0"/>
-              <w:bottom w:sz="2.2639999389648438" w:val="single" w:color="#C0C0C0"/>
+              <w:top w:val="single" w:sz="4" w:color="2F2F2F"/>
+              <w:left w:val="single" w:sz="4" w:color="2F2F2F"/>
+              <w:bottom w:val="single" w:sz="4" w:color="2F2F2F"/>
+              <w:right w:val="single" w:sz="4" w:color="2F2F2F"/>
             </w:tcBorders>
-            <w:tcMar>
-              <w:start w:w="0" w:type="dxa"/>
-              <w:end w:w="0" w:type="dxa"/>
-            </w:tcMar>
           </w:tcPr>
           <w:p>
             <w:pPr>
-              <w:autoSpaceDN w:val="0"/>
-              <w:autoSpaceDE w:val="0"/>
-              <w:widowControl/>
-              <w:spacing w:line="210" w:lineRule="exact" w:before="144" w:after="0"/>
-              <w:ind w:left="118" w:right="0" w:firstLine="0"/>
+              <w:spacing w:before="0" w:after="0"/>
+              <w:jc w:val="left"/>
+            </w:pPr>
+          </w:p>
+        </w:tc>
+        <w:tc>
+          <w:tcPr>
+            <w:tcW w:type="dxa" w:w="737"/>
+            <w:tcBorders>
+              <w:top w:val="single" w:sz="4" w:color="2F2F2F"/>
+              <w:left w:val="single" w:sz="4" w:color="2F2F2F"/>
+              <w:bottom w:val="single" w:sz="4" w:color="2F2F2F"/>
+              <w:right w:val="single" w:sz="4" w:color="2F2F2F"/>
+            </w:tcBorders>
+          </w:tcPr>
+          <w:p>
+            <w:pPr>
+              <w:spacing w:before="0" w:after="0"/>
+              <w:jc w:val="left"/>
+            </w:pPr>
+          </w:p>
+        </w:tc>
+      </w:tr>
+    </w:tbl>
+    <w:tbl>
+      <w:tblPr>
+        <w:tblW w:type="auto" w:w="0"/>
+        <w:jc w:val="center"/>
+        <w:tblLook w:firstColumn="1" w:firstRow="1" w:lastColumn="0" w:lastRow="0" w:noHBand="0" w:noVBand="1" w:val="04A0"/>
+        <w:tblLayout w:type="fixed"/>
+      </w:tblPr>
+      <w:tblGrid>
+        <w:gridCol w:w="1360"/>
+        <w:gridCol w:w="907"/>
+        <w:gridCol w:w="1360"/>
+        <w:gridCol w:w="567"/>
+        <w:gridCol w:w="1587"/>
+        <w:gridCol w:w="1247"/>
+        <w:gridCol w:w="1587"/>
+        <w:gridCol w:w="1587"/>
+      </w:tblGrid>
+      <w:tr>
+        <w:tc>
+          <w:tcPr>
+            <w:tcW w:type="dxa" w:w="1360"/>
+            <w:tcBorders>
+              <w:top w:val="single" w:sz="4" w:color="2F2F2F"/>
+              <w:left w:val="single" w:sz="4" w:color="2F2F2F"/>
+              <w:bottom w:val="single" w:sz="4" w:color="2F2F2F"/>
+              <w:right w:val="single" w:sz="4" w:color="2F2F2F"/>
+            </w:tcBorders>
+          </w:tcPr>
+          <w:p>
+            <w:pPr>
+              <w:spacing w:before="0" w:after="0"/>
               <w:jc w:val="left"/>
             </w:pPr>
             <w:r>
               <w:rPr>
-                <w:rFonts w:ascii="" w:hAnsi="" w:eastAsia=""/>
+                <w:rFonts w:ascii="Arial" w:hAnsi="Arial"/>
                 <w:b w:val="0"/>
-                <w:i w:val="0"/>
-                <w:color w:val="303030"/>
                 <w:sz w:val="18"/>
               </w:rPr>
-              <w:t>Concórdia</w:t>
+              <w:t>BT Energ.</w:t>
             </w:r>
           </w:p>
         </w:tc>
         <w:tc>
           <w:tcPr>
-            <w:tcW w:type="dxa" w:w="1438"/>
+            <w:tcW w:type="dxa" w:w="907"/>
             <w:tcBorders>
-              <w:top w:sz="2.2639999389648438" w:val="single" w:color="#C0C0C0"/>
-              <w:bottom w:sz="2.2639999389648438" w:val="single" w:color="#C0C0C0"/>
+              <w:top w:val="single" w:sz="4" w:color="2F2F2F"/>
+              <w:left w:val="single" w:sz="4" w:color="2F2F2F"/>
+              <w:bottom w:val="single" w:sz="4" w:color="2F2F2F"/>
+              <w:right w:val="single" w:sz="4" w:color="2F2F2F"/>
             </w:tcBorders>
-            <w:tcMar>
-              <w:start w:w="0" w:type="dxa"/>
-              <w:end w:w="0" w:type="dxa"/>
-            </w:tcMar>
-          </w:tcPr>
-          <w:p/>
-        </w:tc>
-        <w:tc>
-          <w:tcPr>
-            <w:tcW w:type="dxa" w:w="682"/>
-            <w:tcBorders>
-              <w:top w:sz="2.2639999389648438" w:val="single" w:color="#C0C0C0"/>
-              <w:bottom w:sz="2.2639999389648438" w:val="single" w:color="#C0C0C0"/>
-            </w:tcBorders>
-            <w:tcMar>
-              <w:start w:w="0" w:type="dxa"/>
-              <w:end w:w="0" w:type="dxa"/>
-            </w:tcMar>
-          </w:tcPr>
-          <w:p/>
-        </w:tc>
-      </w:tr>
-    </w:tbl>
-    <w:p>
-      <w:pPr>
-        <w:autoSpaceDN w:val="0"/>
-        <w:autoSpaceDE w:val="0"/>
-        <w:widowControl/>
-        <w:spacing w:line="208" w:lineRule="exact" w:before="478" w:after="360"/>
-        <w:ind w:left="76" w:right="0" w:firstLine="0"/>
-        <w:jc w:val="left"/>
-      </w:pPr>
-      <w:r>
-        <w:rPr>
-          <w:rFonts w:ascii="" w:hAnsi="" w:eastAsia=""/>
-          <w:b w:val="0"/>
-          <w:i w:val="0"/>
-          <w:color w:val="303030"/>
-          <w:sz w:val="18"/>
-        </w:rPr>
-        <w:t xml:space="preserve">Serviço a Executar </w:t>
-      </w:r>
-    </w:p>
-    <w:p>
-      <w:pPr>
-        <w:spacing w:line="240" w:lineRule="exact" w:before="0" w:after="0"/>
-      </w:pPr>
-      <w:r>
-        <w:t>{{servico}}</w:t>
-      </w:r>
-    </w:p>
-    <w:tbl>
-      <w:tblPr>
-        <w:tblW w:type="auto" w:w="0"/>
-        <w:tblLayout w:type="fixed"/>
-        <w:tblLook w:firstColumn="1" w:firstRow="1" w:lastColumn="0" w:lastRow="0" w:noHBand="0" w:noVBand="1" w:val="04A0"/>
-        <w:tblInd w:w="20.0" w:type="dxa"/>
-      </w:tblPr>
-      <w:tblGrid>
-        <w:gridCol w:w="1623"/>
-        <w:gridCol w:w="1623"/>
-        <w:gridCol w:w="1623"/>
-        <w:gridCol w:w="1623"/>
-        <w:gridCol w:w="1623"/>
-        <w:gridCol w:w="1623"/>
-        <w:gridCol w:w="1623"/>
-      </w:tblGrid>
-      <w:tr>
-        <w:trPr>
-          <w:trHeight w:hRule="exact" w:val="424"/>
-        </w:trPr>
-        <w:tc>
-          <w:tcPr>
-            <w:tcW w:type="dxa" w:w="960"/>
-            <w:tcBorders>
-              <w:top w:sz="2.2639999389648438" w:val="single" w:color="#C0C0C0"/>
-              <w:bottom w:sz="2.2639999389648438" w:val="single" w:color="#C0C0C0"/>
-            </w:tcBorders>
-            <w:tcMar>
-              <w:start w:w="0" w:type="dxa"/>
-              <w:end w:w="0" w:type="dxa"/>
-            </w:tcMar>
           </w:tcPr>
           <w:p>
             <w:pPr>
-              <w:autoSpaceDN w:val="0"/>
-              <w:autoSpaceDE w:val="0"/>
-              <w:widowControl/>
-              <w:spacing w:line="208" w:lineRule="exact" w:before="146" w:after="0"/>
-              <w:ind w:left="0" w:right="0" w:firstLine="0"/>
-              <w:jc w:val="center"/>
+              <w:spacing w:before="0" w:after="0"/>
+              <w:jc w:val="left"/>
             </w:pPr>
             <w:r>
               <w:rPr>
-                <w:rFonts w:ascii="" w:hAnsi="" w:eastAsia=""/>
+                <w:rFonts w:ascii="Arial" w:hAnsi="Arial"/>
                 <w:b w:val="0"/>
-                <w:i w:val="0"/>
-                <w:color w:val="303030"/>
                 <w:sz w:val="18"/>
               </w:rPr>
-              <w:t xml:space="preserve">BT Energ. </w:t>
+              <w:t>{% if bt %}X{% endif %}</w:t>
             </w:r>
           </w:p>
         </w:tc>
         <w:tc>
           <w:tcPr>
-            <w:tcW w:type="dxa" w:w="480"/>
+            <w:tcW w:type="dxa" w:w="1360"/>
             <w:tcBorders>
-              <w:top w:sz="2.2639999389648438" w:val="single" w:color="#C0C0C0"/>
-              <w:bottom w:sz="2.2639999389648438" w:val="single" w:color="#C0C0C0"/>
+              <w:top w:val="single" w:sz="4" w:color="2F2F2F"/>
+              <w:left w:val="single" w:sz="4" w:color="2F2F2F"/>
+              <w:bottom w:val="single" w:sz="4" w:color="2F2F2F"/>
+              <w:right w:val="single" w:sz="4" w:color="2F2F2F"/>
             </w:tcBorders>
-            <w:tcMar>
-              <w:start w:w="0" w:type="dxa"/>
-              <w:end w:w="0" w:type="dxa"/>
-            </w:tcMar>
           </w:tcPr>
           <w:p>
             <w:pPr>
-              <w:autoSpaceDN w:val="0"/>
-              <w:autoSpaceDE w:val="0"/>
-              <w:widowControl/>
-              <w:spacing w:line="124" w:lineRule="exact" w:before="0" w:after="0"/>
-              <w:ind w:left="0" w:right="0"/>
-            </w:pPr>
-            <w:r>
-              <w:t>{% if bt %}X{% endif %}</w:t>
-            </w:r>
-          </w:p>
-          <w:tbl>
-            <w:tblPr>
-              <w:tblW w:type="auto" w:w="0"/>
-              <w:tblLayout w:type="fixed"/>
-              <w:tblLook w:firstColumn="1" w:firstRow="1" w:lastColumn="0" w:lastRow="0" w:noHBand="0" w:noVBand="1" w:val="04A0"/>
-              <w:tblInd w:w="124.00000000000006" w:type="dxa"/>
-            </w:tblPr>
-            <w:tblGrid>
-              <w:gridCol w:w="480"/>
-            </w:tblGrid>
-            <w:tr>
-              <w:trPr>
-                <w:trHeight w:hRule="exact" w:val="176"/>
-              </w:trPr>
-              <w:tc>
-                <w:tcPr>
-                  <w:tcW w:type="dxa" w:w="196"/>
-                  <w:tcBorders>
-                    <w:start w:sz="22.351999282836914" w:val="single" w:color="#939393"/>
-                    <w:top w:sz="22.351999282836914" w:val="single" w:color="#939393"/>
-                    <w:end w:sz="22.351999282836914" w:val="single" w:color="#939393"/>
-                    <w:bottom w:sz="22.351999282836914" w:val="single" w:color="#939393"/>
-                  </w:tcBorders>
-                  <w:shd w:fill="ffffff"/>
-                  <w:tcMar>
-                    <w:start w:w="0" w:type="dxa"/>
-                    <w:end w:w="0" w:type="dxa"/>
-                  </w:tcMar>
-                </w:tcPr>
-                <w:p/>
-              </w:tc>
-            </w:tr>
-          </w:tbl>
-          <w:p>
-            <w:pPr>
-              <w:autoSpaceDN w:val="0"/>
-              <w:autoSpaceDE w:val="0"/>
-              <w:widowControl/>
-              <w:spacing w:line="14" w:lineRule="exact" w:before="0" w:after="0"/>
-              <w:ind w:left="0" w:right="0"/>
+              <w:spacing w:before="0" w:after="0"/>
+              <w:jc w:val="left"/>
             </w:pPr>
           </w:p>
         </w:tc>
         <w:tc>
           <w:tcPr>
-            <w:tcW w:type="dxa" w:w="1000"/>
+            <w:tcW w:type="dxa" w:w="567"/>
             <w:tcBorders>
-              <w:top w:sz="2.2639999389648438" w:val="single" w:color="#C0C0C0"/>
-              <w:bottom w:sz="2.2639999389648438" w:val="single" w:color="#C0C0C0"/>
+              <w:top w:val="single" w:sz="4" w:color="2F2F2F"/>
+              <w:left w:val="single" w:sz="4" w:color="2F2F2F"/>
+              <w:bottom w:val="single" w:sz="4" w:color="2F2F2F"/>
+              <w:right w:val="single" w:sz="4" w:color="2F2F2F"/>
             </w:tcBorders>
-            <w:tcMar>
-              <w:start w:w="0" w:type="dxa"/>
-              <w:end w:w="0" w:type="dxa"/>
-            </w:tcMar>
           </w:tcPr>
-          <w:p/>
+          <w:p>
+            <w:pPr>
+              <w:spacing w:before="0" w:after="0"/>
+              <w:jc w:val="left"/>
+            </w:pPr>
+          </w:p>
         </w:tc>
         <w:tc>
           <w:tcPr>
-            <w:tcW w:type="dxa" w:w="500"/>
+            <w:tcW w:type="dxa" w:w="1587"/>
             <w:tcBorders>
-              <w:top w:sz="2.2639999389648438" w:val="single" w:color="#C0C0C0"/>
-              <w:bottom w:sz="2.2639999389648438" w:val="single" w:color="#C0C0C0"/>
+              <w:top w:val="single" w:sz="4" w:color="2F2F2F"/>
+              <w:left w:val="single" w:sz="4" w:color="2F2F2F"/>
+              <w:bottom w:val="single" w:sz="4" w:color="2F2F2F"/>
+              <w:right w:val="single" w:sz="4" w:color="2F2F2F"/>
             </w:tcBorders>
-            <w:tcMar>
-              <w:start w:w="0" w:type="dxa"/>
-              <w:end w:w="0" w:type="dxa"/>
-            </w:tcMar>
-          </w:tcPr>
-          <w:p/>
-        </w:tc>
-        <w:tc>
-          <w:tcPr>
-            <w:tcW w:type="dxa" w:w="1184"/>
-            <w:tcBorders>
-              <w:top w:sz="2.2639999389648438" w:val="single" w:color="#C0C0C0"/>
-              <w:bottom w:sz="2.2639999389648438" w:val="single" w:color="#C0C0C0"/>
-            </w:tcBorders>
-            <w:tcMar>
-              <w:start w:w="0" w:type="dxa"/>
-              <w:end w:w="0" w:type="dxa"/>
-            </w:tcMar>
           </w:tcPr>
           <w:p>
             <w:pPr>
-              <w:autoSpaceDN w:val="0"/>
-              <w:autoSpaceDE w:val="0"/>
-              <w:widowControl/>
-              <w:spacing w:line="208" w:lineRule="exact" w:before="158" w:after="0"/>
-              <w:ind w:left="124" w:right="0" w:firstLine="0"/>
+              <w:spacing w:before="0" w:after="0"/>
               <w:jc w:val="left"/>
             </w:pPr>
             <w:r>
               <w:rPr>
-                <w:rFonts w:ascii="" w:hAnsi="" w:eastAsia=""/>
+                <w:rFonts w:ascii="Arial" w:hAnsi="Arial"/>
                 <w:b w:val="0"/>
-                <w:i w:val="0"/>
-                <w:color w:val="303030"/>
                 <w:sz w:val="18"/>
               </w:rPr>
               <w:t>H.Desligar</w:t>
@@ -1153,31 +868,23 @@
         </w:tc>
         <w:tc>
           <w:tcPr>
-            <w:tcW w:type="dxa" w:w="648"/>
+            <w:tcW w:type="dxa" w:w="1247"/>
             <w:tcBorders>
-              <w:top w:sz="2.2639999389648438" w:val="single" w:color="#C0C0C0"/>
-              <w:bottom w:sz="2.2639999389648438" w:val="single" w:color="#C0C0C0"/>
+              <w:top w:val="single" w:sz="4" w:color="2F2F2F"/>
+              <w:left w:val="single" w:sz="4" w:color="2F2F2F"/>
+              <w:bottom w:val="single" w:sz="4" w:color="2F2F2F"/>
+              <w:right w:val="single" w:sz="4" w:color="2F2F2F"/>
             </w:tcBorders>
-            <w:tcMar>
-              <w:start w:w="0" w:type="dxa"/>
-              <w:end w:w="0" w:type="dxa"/>
-            </w:tcMar>
           </w:tcPr>
           <w:p>
             <w:pPr>
-              <w:autoSpaceDN w:val="0"/>
-              <w:autoSpaceDE w:val="0"/>
-              <w:widowControl/>
-              <w:spacing w:line="208" w:lineRule="exact" w:before="146" w:after="0"/>
-              <w:ind w:left="0" w:right="0" w:firstLine="0"/>
-              <w:jc w:val="center"/>
+              <w:spacing w:before="0" w:after="0"/>
+              <w:jc w:val="left"/>
             </w:pPr>
             <w:r>
               <w:rPr>
-                <w:rFonts w:ascii="" w:hAnsi="" w:eastAsia=""/>
+                <w:rFonts w:ascii="Arial" w:hAnsi="Arial"/>
                 <w:b w:val="0"/>
-                <w:i w:val="0"/>
-                <w:color w:val="303030"/>
                 <w:sz w:val="18"/>
               </w:rPr>
               <w:t>{{h_desligar}}</w:t>
@@ -1186,266 +893,167 @@
         </w:tc>
         <w:tc>
           <w:tcPr>
-            <w:tcW w:type="dxa" w:w="6230"/>
+            <w:tcW w:type="dxa" w:w="1587"/>
             <w:tcBorders>
-              <w:top w:sz="2.2639999389648438" w:val="single" w:color="#C0C0C0"/>
-              <w:bottom w:sz="2.2639999389648438" w:val="single" w:color="#C0C0C0"/>
+              <w:top w:val="single" w:sz="4" w:color="2F2F2F"/>
+              <w:left w:val="single" w:sz="4" w:color="2F2F2F"/>
+              <w:bottom w:val="single" w:sz="4" w:color="2F2F2F"/>
+              <w:right w:val="single" w:sz="4" w:color="2F2F2F"/>
             </w:tcBorders>
-            <w:tcMar>
-              <w:start w:w="0" w:type="dxa"/>
-              <w:end w:w="0" w:type="dxa"/>
-            </w:tcMar>
           </w:tcPr>
           <w:p>
             <w:pPr>
-              <w:autoSpaceDN w:val="0"/>
-              <w:autoSpaceDE w:val="0"/>
-              <w:widowControl/>
-              <w:spacing w:line="208" w:lineRule="exact" w:before="158" w:after="0"/>
-              <w:ind w:left="364" w:right="0" w:firstLine="0"/>
+              <w:spacing w:before="0" w:after="0"/>
               <w:jc w:val="left"/>
             </w:pPr>
             <w:r>
               <w:rPr>
-                <w:rFonts w:ascii="" w:hAnsi="" w:eastAsia=""/>
+                <w:rFonts w:ascii="Arial" w:hAnsi="Arial"/>
                 <w:b w:val="0"/>
-                <w:i w:val="0"/>
-                <w:color w:val="303030"/>
                 <w:sz w:val="18"/>
               </w:rPr>
-              <w:t>Alimentador {{alimentador}}</w:t>
+              <w:t>Alimentador</w:t>
+            </w:r>
+          </w:p>
+        </w:tc>
+        <w:tc>
+          <w:tcPr>
+            <w:tcW w:type="dxa" w:w="1587"/>
+            <w:tcBorders>
+              <w:top w:val="single" w:sz="4" w:color="2F2F2F"/>
+              <w:left w:val="single" w:sz="4" w:color="2F2F2F"/>
+              <w:bottom w:val="single" w:sz="4" w:color="2F2F2F"/>
+              <w:right w:val="single" w:sz="4" w:color="2F2F2F"/>
+            </w:tcBorders>
+          </w:tcPr>
+          <w:p>
+            <w:pPr>
+              <w:spacing w:before="0" w:after="0"/>
+              <w:jc w:val="left"/>
+            </w:pPr>
+            <w:r>
+              <w:rPr>
+                <w:rFonts w:ascii="Arial" w:hAnsi="Arial"/>
+                <w:b w:val="0"/>
+                <w:sz w:val="18"/>
+              </w:rPr>
+              <w:t>{{alimentador}}</w:t>
             </w:r>
           </w:p>
         </w:tc>
       </w:tr>
       <w:tr>
-        <w:trPr>
-          <w:trHeight w:hRule="exact" w:val="400"/>
-        </w:trPr>
         <w:tc>
           <w:tcPr>
-            <w:tcW w:type="dxa" w:w="960"/>
+            <w:tcW w:type="dxa" w:w="1360"/>
             <w:tcBorders>
-              <w:top w:sz="2.2639999389648438" w:val="single" w:color="#C0C0C0"/>
-              <w:bottom w:sz="2.2639999389648438" w:val="single" w:color="#C0C0C0"/>
+              <w:top w:val="single" w:sz="4" w:color="2F2F2F"/>
+              <w:left w:val="single" w:sz="4" w:color="2F2F2F"/>
+              <w:bottom w:val="single" w:sz="4" w:color="2F2F2F"/>
+              <w:right w:val="single" w:sz="4" w:color="2F2F2F"/>
             </w:tcBorders>
-            <w:tcMar>
-              <w:start w:w="0" w:type="dxa"/>
-              <w:end w:w="0" w:type="dxa"/>
-            </w:tcMar>
           </w:tcPr>
           <w:p>
             <w:pPr>
-              <w:autoSpaceDN w:val="0"/>
-              <w:autoSpaceDE w:val="0"/>
-              <w:widowControl/>
-              <w:spacing w:line="208" w:lineRule="exact" w:before="122" w:after="0"/>
-              <w:ind w:left="0" w:right="0" w:firstLine="0"/>
-              <w:jc w:val="center"/>
+              <w:spacing w:before="0" w:after="0"/>
+              <w:jc w:val="left"/>
             </w:pPr>
             <w:r>
               <w:rPr>
-                <w:rFonts w:ascii="" w:hAnsi="" w:eastAsia=""/>
+                <w:rFonts w:ascii="Arial" w:hAnsi="Arial"/>
                 <w:b w:val="0"/>
-                <w:i w:val="0"/>
-                <w:color w:val="303030"/>
                 <w:sz w:val="18"/>
               </w:rPr>
-              <w:t xml:space="preserve">AT Energ. </w:t>
+              <w:t>AT Energ.</w:t>
             </w:r>
           </w:p>
         </w:tc>
         <w:tc>
           <w:tcPr>
-            <w:tcW w:type="dxa" w:w="480"/>
+            <w:tcW w:type="dxa" w:w="907"/>
             <w:tcBorders>
-              <w:top w:sz="2.2639999389648438" w:val="single" w:color="#C0C0C0"/>
-              <w:bottom w:sz="2.2639999389648438" w:val="single" w:color="#C0C0C0"/>
+              <w:top w:val="single" w:sz="4" w:color="2F2F2F"/>
+              <w:left w:val="single" w:sz="4" w:color="2F2F2F"/>
+              <w:bottom w:val="single" w:sz="4" w:color="2F2F2F"/>
+              <w:right w:val="single" w:sz="4" w:color="2F2F2F"/>
             </w:tcBorders>
-            <w:tcMar>
-              <w:start w:w="0" w:type="dxa"/>
-              <w:end w:w="0" w:type="dxa"/>
-            </w:tcMar>
           </w:tcPr>
           <w:p>
             <w:pPr>
-              <w:autoSpaceDN w:val="0"/>
-              <w:autoSpaceDE w:val="0"/>
-              <w:widowControl/>
-              <w:spacing w:line="102" w:lineRule="exact" w:before="0" w:after="0"/>
-              <w:ind w:left="0" w:right="0"/>
+              <w:spacing w:before="0" w:after="0"/>
+              <w:jc w:val="left"/>
             </w:pPr>
             <w:r>
+              <w:rPr>
+                <w:rFonts w:ascii="Arial" w:hAnsi="Arial"/>
+                <w:b w:val="0"/>
+                <w:sz w:val="18"/>
+              </w:rPr>
               <w:t>{% if at %}X{% endif %}</w:t>
             </w:r>
           </w:p>
-          <w:tbl>
-            <w:tblPr>
-              <w:tblW w:type="auto" w:w="0"/>
-              <w:tblLayout w:type="fixed"/>
-              <w:tblLook w:firstColumn="1" w:firstRow="1" w:lastColumn="0" w:lastRow="0" w:noHBand="0" w:noVBand="1" w:val="04A0"/>
-              <w:tblInd w:w="124.00000000000006" w:type="dxa"/>
-            </w:tblPr>
-            <w:tblGrid>
-              <w:gridCol w:w="480"/>
-            </w:tblGrid>
-            <w:tr>
-              <w:trPr>
-                <w:trHeight w:hRule="exact" w:val="176"/>
-              </w:trPr>
-              <w:tc>
-                <w:tcPr>
-                  <w:tcW w:type="dxa" w:w="196"/>
-                  <w:tcBorders>
-                    <w:start w:sz="22.351999282836914" w:val="single" w:color="#939393"/>
-                    <w:top w:sz="22.351999282836914" w:val="single" w:color="#939393"/>
-                    <w:end w:sz="22.351999282836914" w:val="single" w:color="#939393"/>
-                    <w:bottom w:sz="22.351999282836914" w:val="single" w:color="#939393"/>
-                  </w:tcBorders>
-                  <w:shd w:fill="ffffff"/>
-                  <w:tcMar>
-                    <w:start w:w="0" w:type="dxa"/>
-                    <w:end w:w="0" w:type="dxa"/>
-                  </w:tcMar>
-                </w:tcPr>
-                <w:p/>
-              </w:tc>
-            </w:tr>
-          </w:tbl>
+        </w:tc>
+        <w:tc>
+          <w:tcPr>
+            <w:tcW w:type="dxa" w:w="1360"/>
+            <w:tcBorders>
+              <w:top w:val="single" w:sz="4" w:color="2F2F2F"/>
+              <w:left w:val="single" w:sz="4" w:color="2F2F2F"/>
+              <w:bottom w:val="single" w:sz="4" w:color="2F2F2F"/>
+              <w:right w:val="single" w:sz="4" w:color="2F2F2F"/>
+            </w:tcBorders>
+          </w:tcPr>
           <w:p>
             <w:pPr>
-              <w:autoSpaceDN w:val="0"/>
-              <w:autoSpaceDE w:val="0"/>
-              <w:widowControl/>
-              <w:spacing w:line="14" w:lineRule="exact" w:before="0" w:after="0"/>
-              <w:ind w:left="0" w:right="0"/>
+              <w:spacing w:before="0" w:after="0"/>
+              <w:jc w:val="left"/>
+            </w:pPr>
+            <w:r>
+              <w:rPr>
+                <w:rFonts w:ascii="Arial" w:hAnsi="Arial"/>
+                <w:b w:val="0"/>
+                <w:sz w:val="18"/>
+              </w:rPr>
+              <w:t>Bloqueio</w:t>
+            </w:r>
+          </w:p>
+        </w:tc>
+        <w:tc>
+          <w:tcPr>
+            <w:tcW w:type="dxa" w:w="567"/>
+            <w:tcBorders>
+              <w:top w:val="single" w:sz="4" w:color="2F2F2F"/>
+              <w:left w:val="single" w:sz="4" w:color="2F2F2F"/>
+              <w:bottom w:val="single" w:sz="4" w:color="2F2F2F"/>
+              <w:right w:val="single" w:sz="4" w:color="2F2F2F"/>
+            </w:tcBorders>
+          </w:tcPr>
+          <w:p>
+            <w:pPr>
+              <w:spacing w:before="0" w:after="0"/>
+              <w:jc w:val="left"/>
             </w:pPr>
           </w:p>
         </w:tc>
         <w:tc>
           <w:tcPr>
-            <w:tcW w:type="dxa" w:w="1000"/>
+            <w:tcW w:type="dxa" w:w="1587"/>
             <w:tcBorders>
-              <w:top w:sz="2.2639999389648438" w:val="single" w:color="#C0C0C0"/>
-              <w:bottom w:sz="2.2639999389648438" w:val="single" w:color="#C0C0C0"/>
+              <w:top w:val="single" w:sz="4" w:color="2F2F2F"/>
+              <w:left w:val="single" w:sz="4" w:color="2F2F2F"/>
+              <w:bottom w:val="single" w:sz="4" w:color="2F2F2F"/>
+              <w:right w:val="single" w:sz="4" w:color="2F2F2F"/>
             </w:tcBorders>
-            <w:tcMar>
-              <w:start w:w="0" w:type="dxa"/>
-              <w:end w:w="0" w:type="dxa"/>
-            </w:tcMar>
           </w:tcPr>
           <w:p>
             <w:pPr>
-              <w:autoSpaceDN w:val="0"/>
-              <w:autoSpaceDE w:val="0"/>
-              <w:widowControl/>
-              <w:spacing w:line="208" w:lineRule="exact" w:before="122" w:after="0"/>
-              <w:ind w:left="0" w:right="0" w:firstLine="0"/>
-              <w:jc w:val="center"/>
+              <w:spacing w:before="0" w:after="0"/>
+              <w:jc w:val="left"/>
             </w:pPr>
             <w:r>
               <w:rPr>
-                <w:rFonts w:ascii="" w:hAnsi="" w:eastAsia=""/>
+                <w:rFonts w:ascii="Arial" w:hAnsi="Arial"/>
                 <w:b w:val="0"/>
-                <w:i w:val="0"/>
-                <w:color w:val="303030"/>
-                <w:sz w:val="18"/>
-              </w:rPr>
-              <w:t xml:space="preserve">Bloqueio </w:t>
-            </w:r>
-          </w:p>
-        </w:tc>
-        <w:tc>
-          <w:tcPr>
-            <w:tcW w:type="dxa" w:w="500"/>
-            <w:tcBorders>
-              <w:top w:sz="2.2639999389648438" w:val="single" w:color="#C0C0C0"/>
-              <w:bottom w:sz="2.2639999389648438" w:val="single" w:color="#C0C0C0"/>
-            </w:tcBorders>
-            <w:tcMar>
-              <w:start w:w="0" w:type="dxa"/>
-              <w:end w:w="0" w:type="dxa"/>
-            </w:tcMar>
-          </w:tcPr>
-          <w:p>
-            <w:pPr>
-              <w:autoSpaceDN w:val="0"/>
-              <w:autoSpaceDE w:val="0"/>
-              <w:widowControl/>
-              <w:spacing w:line="102" w:lineRule="exact" w:before="0" w:after="0"/>
-              <w:ind w:left="0" w:right="0"/>
-            </w:pPr>
-          </w:p>
-          <w:tbl>
-            <w:tblPr>
-              <w:tblW w:type="auto" w:w="0"/>
-              <w:tblLayout w:type="fixed"/>
-              <w:tblLook w:firstColumn="1" w:firstRow="1" w:lastColumn="0" w:lastRow="0" w:noHBand="0" w:noVBand="1" w:val="04A0"/>
-              <w:tblInd w:w="166.00000000000023" w:type="dxa"/>
-            </w:tblPr>
-            <w:tblGrid>
-              <w:gridCol w:w="500"/>
-            </w:tblGrid>
-            <w:tr>
-              <w:trPr>
-                <w:trHeight w:hRule="exact" w:val="176"/>
-              </w:trPr>
-              <w:tc>
-                <w:tcPr>
-                  <w:tcW w:type="dxa" w:w="196"/>
-                  <w:tcBorders>
-                    <w:start w:sz="22.351999282836914" w:val="single" w:color="#939393"/>
-                    <w:top w:sz="22.351999282836914" w:val="single" w:color="#939393"/>
-                    <w:end w:sz="22.351999282836914" w:val="single" w:color="#939393"/>
-                    <w:bottom w:sz="22.351999282836914" w:val="single" w:color="#939393"/>
-                  </w:tcBorders>
-                  <w:shd w:fill="ffffff"/>
-                  <w:tcMar>
-                    <w:start w:w="0" w:type="dxa"/>
-                    <w:end w:w="0" w:type="dxa"/>
-                  </w:tcMar>
-                </w:tcPr>
-                <w:p/>
-              </w:tc>
-            </w:tr>
-          </w:tbl>
-          <w:p>
-            <w:pPr>
-              <w:autoSpaceDN w:val="0"/>
-              <w:autoSpaceDE w:val="0"/>
-              <w:widowControl/>
-              <w:spacing w:line="14" w:lineRule="exact" w:before="0" w:after="0"/>
-              <w:ind w:left="0" w:right="0"/>
-            </w:pPr>
-          </w:p>
-        </w:tc>
-        <w:tc>
-          <w:tcPr>
-            <w:tcW w:type="dxa" w:w="1184"/>
-            <w:tcBorders>
-              <w:top w:sz="2.2639999389648438" w:val="single" w:color="#C0C0C0"/>
-              <w:bottom w:sz="2.2639999389648438" w:val="single" w:color="#C0C0C0"/>
-            </w:tcBorders>
-            <w:tcMar>
-              <w:start w:w="0" w:type="dxa"/>
-              <w:end w:w="0" w:type="dxa"/>
-            </w:tcMar>
-          </w:tcPr>
-          <w:p>
-            <w:pPr>
-              <w:autoSpaceDN w:val="0"/>
-              <w:autoSpaceDE w:val="0"/>
-              <w:widowControl/>
-              <w:spacing w:line="208" w:lineRule="exact" w:before="122" w:after="0"/>
-              <w:ind w:left="0" w:right="0" w:firstLine="0"/>
-              <w:jc w:val="center"/>
-            </w:pPr>
-            <w:r>
-              <w:rPr>
-                <w:rFonts w:ascii="" w:hAnsi="" w:eastAsia=""/>
-                <w:b w:val="0"/>
-                <w:i w:val="0"/>
-                <w:color w:val="303030"/>
                 <w:sz w:val="18"/>
               </w:rPr>
               <w:t>H.Religar</w:t>
@@ -1454,31 +1062,23 @@
         </w:tc>
         <w:tc>
           <w:tcPr>
-            <w:tcW w:type="dxa" w:w="648"/>
+            <w:tcW w:type="dxa" w:w="1247"/>
             <w:tcBorders>
-              <w:top w:sz="2.2639999389648438" w:val="single" w:color="#C0C0C0"/>
-              <w:bottom w:sz="2.2639999389648438" w:val="single" w:color="#C0C0C0"/>
+              <w:top w:val="single" w:sz="4" w:color="2F2F2F"/>
+              <w:left w:val="single" w:sz="4" w:color="2F2F2F"/>
+              <w:bottom w:val="single" w:sz="4" w:color="2F2F2F"/>
+              <w:right w:val="single" w:sz="4" w:color="2F2F2F"/>
             </w:tcBorders>
-            <w:tcMar>
-              <w:start w:w="0" w:type="dxa"/>
-              <w:end w:w="0" w:type="dxa"/>
-            </w:tcMar>
           </w:tcPr>
           <w:p>
             <w:pPr>
-              <w:autoSpaceDN w:val="0"/>
-              <w:autoSpaceDE w:val="0"/>
-              <w:widowControl/>
-              <w:spacing w:line="208" w:lineRule="exact" w:before="122" w:after="0"/>
-              <w:ind w:left="0" w:right="0" w:firstLine="0"/>
-              <w:jc w:val="center"/>
+              <w:spacing w:before="0" w:after="0"/>
+              <w:jc w:val="left"/>
             </w:pPr>
             <w:r>
               <w:rPr>
-                <w:rFonts w:ascii="" w:hAnsi="" w:eastAsia=""/>
+                <w:rFonts w:ascii="Arial" w:hAnsi="Arial"/>
                 <w:b w:val="0"/>
-                <w:i w:val="0"/>
-                <w:color w:val="303030"/>
                 <w:sz w:val="18"/>
               </w:rPr>
               <w:t>{{h_religar}}</w:t>
@@ -1487,34 +1087,51 @@
         </w:tc>
         <w:tc>
           <w:tcPr>
-            <w:tcW w:type="dxa" w:w="6230"/>
+            <w:tcW w:type="dxa" w:w="1587"/>
             <w:tcBorders>
-              <w:top w:sz="2.2639999389648438" w:val="single" w:color="#C0C0C0"/>
-              <w:bottom w:sz="2.2639999389648438" w:val="single" w:color="#C0C0C0"/>
+              <w:top w:val="single" w:sz="4" w:color="2F2F2F"/>
+              <w:left w:val="single" w:sz="4" w:color="2F2F2F"/>
+              <w:bottom w:val="single" w:sz="4" w:color="2F2F2F"/>
+              <w:right w:val="single" w:sz="4" w:color="2F2F2F"/>
             </w:tcBorders>
-            <w:tcMar>
-              <w:start w:w="0" w:type="dxa"/>
-              <w:end w:w="0" w:type="dxa"/>
-            </w:tcMar>
           </w:tcPr>
           <w:p>
             <w:pPr>
-              <w:autoSpaceDN w:val="0"/>
-              <w:autoSpaceDE w:val="0"/>
-              <w:widowControl/>
-              <w:spacing w:line="208" w:lineRule="exact" w:before="122" w:after="0"/>
-              <w:ind w:left="864" w:right="0" w:firstLine="0"/>
+              <w:spacing w:before="0" w:after="0"/>
               <w:jc w:val="left"/>
             </w:pPr>
             <w:r>
               <w:rPr>
-                <w:rFonts w:ascii="" w:hAnsi="" w:eastAsia=""/>
+                <w:rFonts w:ascii="Arial" w:hAnsi="Arial"/>
                 <w:b w:val="0"/>
-                <w:i w:val="0"/>
-                <w:color w:val="303030"/>
                 <w:sz w:val="18"/>
               </w:rPr>
-              <w:t>Chave {{chave}}</w:t>
+              <w:t>Chave</w:t>
+            </w:r>
+          </w:p>
+        </w:tc>
+        <w:tc>
+          <w:tcPr>
+            <w:tcW w:type="dxa" w:w="1587"/>
+            <w:tcBorders>
+              <w:top w:val="single" w:sz="4" w:color="2F2F2F"/>
+              <w:left w:val="single" w:sz="4" w:color="2F2F2F"/>
+              <w:bottom w:val="single" w:sz="4" w:color="2F2F2F"/>
+              <w:right w:val="single" w:sz="4" w:color="2F2F2F"/>
+            </w:tcBorders>
+          </w:tcPr>
+          <w:p>
+            <w:pPr>
+              <w:spacing w:before="0" w:after="0"/>
+              <w:jc w:val="left"/>
+            </w:pPr>
+            <w:r>
+              <w:rPr>
+                <w:rFonts w:ascii="Arial" w:hAnsi="Arial"/>
+                <w:b w:val="0"/>
+                <w:sz w:val="18"/>
+              </w:rPr>
+              <w:t>{{chave}}</w:t>
             </w:r>
           </w:p>
         </w:tc>
@@ -1522,40 +1139,63 @@
     </w:tbl>
     <w:p>
       <w:pPr>
-        <w:autoSpaceDN w:val="0"/>
-        <w:autoSpaceDE w:val="0"/>
-        <w:widowControl/>
-        <w:spacing w:line="210" w:lineRule="exact" w:before="386" w:after="0"/>
-        <w:ind w:left="60" w:right="0" w:firstLine="0"/>
+        <w:spacing w:before="120" w:after="0"/>
         <w:jc w:val="left"/>
       </w:pPr>
       <w:r>
         <w:rPr>
-          <w:rFonts w:ascii="" w:hAnsi="" w:eastAsia=""/>
+          <w:rFonts w:ascii="Arial" w:hAnsi="Arial"/>
+          <w:b/>
+          <w:sz w:val="20"/>
+        </w:rPr>
+        <w:t>Serviço a Executar</w:t>
+      </w:r>
+    </w:p>
+    <w:p>
+      <w:pPr>
+        <w:spacing w:before="0" w:after="40"/>
+        <w:jc w:val="left"/>
+      </w:pPr>
+      <w:r>
+        <w:rPr>
+          <w:rFonts w:ascii="Arial" w:hAnsi="Arial"/>
           <w:b w:val="0"/>
-          <w:i w:val="0"/>
-          <w:color w:val="303030"/>
-          <w:sz w:val="18"/>
+          <w:sz w:val="20"/>
+        </w:rPr>
+        <w:t>{{servico}}</w:t>
+      </w:r>
+    </w:p>
+    <w:p>
+      <w:pPr>
+        <w:spacing w:before="80" w:after="0"/>
+        <w:jc w:val="left"/>
+      </w:pPr>
+      <w:r>
+        <w:rPr>
+          <w:rFonts w:ascii="Arial" w:hAnsi="Arial"/>
+          <w:b/>
+          <w:sz w:val="20"/>
         </w:rPr>
         <w:t>Obs.</w:t>
       </w:r>
     </w:p>
     <w:p>
       <w:pPr>
-        <w:spacing w:line="240" w:lineRule="exact" w:before="0" w:after="0"/>
+        <w:spacing w:before="0" w:after="80"/>
+        <w:jc w:val="left"/>
       </w:pPr>
       <w:r>
+        <w:rPr>
+          <w:rFonts w:ascii="Arial" w:hAnsi="Arial"/>
+          <w:b w:val="0"/>
+          <w:sz w:val="20"/>
+        </w:rPr>
         <w:t>{{obs}}</w:t>
       </w:r>
     </w:p>
     <w:p>
       <w:pPr>
-        <w:autoSpaceDN w:val="0"/>
-        <w:autoSpaceDE w:val="0"/>
-        <w:widowControl/>
-        <w:spacing w:line="240" w:lineRule="auto" w:before="464" w:after="0"/>
-        <w:ind w:left="0" w:right="0" w:firstLine="0"/>
-        <w:jc w:val="center"/>
+        <w:jc w:val="left"/>
       </w:pPr>
       <w:r>
         <w:drawing>
@@ -1569,7 +1209,7 @@
               <a:graphicData uri="http://schemas.openxmlformats.org/drawingml/2006/picture">
                 <pic:pic>
                   <pic:nvPicPr>
-                    <pic:cNvPr id="0" name="image.png"/>
+                    <pic:cNvPr id="0" name="orig_MODELO_CONSTRUÇÃO_rId10.png"/>
                     <pic:cNvPicPr/>
                   </pic:nvPicPr>
                   <pic:blipFill>
@@ -1594,166 +1234,14 @@
     </w:p>
     <w:p>
       <w:pPr>
-        <w:sectPr>
-          <w:pgSz w:w="11906" w:h="16838"/>
-          <w:pgMar w:top="142" w:right="262" w:bottom="496" w:left="280" w:header="720" w:footer="720" w:gutter="0"/>
-          <w:cols/>
-          <w:docGrid w:linePitch="360"/>
-        </w:sectPr>
-      </w:pPr>
-    </w:p>
-    <w:tbl>
-      <w:tblPr>
-        <w:tblW w:type="auto" w:w="0"/>
-        <w:tblLayout w:type="fixed"/>
-        <w:tblLook w:firstColumn="1" w:firstRow="1" w:lastColumn="0" w:lastRow="0" w:noHBand="0" w:noVBand="1" w:val="04A0"/>
-        <w:tblInd w:w="0.0" w:type="dxa"/>
-      </w:tblPr>
-      <w:tblGrid>
-        <w:gridCol w:w="3729"/>
-        <w:gridCol w:w="3729"/>
-        <w:gridCol w:w="3729"/>
-      </w:tblGrid>
-      <w:tr>
-        <w:trPr>
-          <w:trHeight w:hRule="exact" w:val="552"/>
-        </w:trPr>
-        <w:tc>
-          <w:tcPr>
-            <w:tcW w:type="dxa" w:w="2236"/>
-            <w:tcBorders>
-              <w:bottom w:sz="2.2639999389648438" w:val="single" w:color="#000000"/>
-            </w:tcBorders>
-            <w:tcMar>
-              <w:start w:w="0" w:type="dxa"/>
-              <w:end w:w="0" w:type="dxa"/>
-            </w:tcMar>
-          </w:tcPr>
-          <w:p>
-            <w:pPr>
-              <w:autoSpaceDN w:val="0"/>
-              <w:autoSpaceDE w:val="0"/>
-              <w:widowControl/>
-              <w:spacing w:line="240" w:lineRule="auto" w:before="0" w:after="0"/>
-              <w:ind w:left="0" w:right="438" w:firstLine="0"/>
-              <w:jc w:val="right"/>
-            </w:pPr>
-            <w:r>
-              <w:drawing>
-                <wp:inline xmlns:a="http://schemas.openxmlformats.org/drawingml/2006/main" xmlns:pic="http://schemas.openxmlformats.org/drawingml/2006/picture">
-                  <wp:extent cx="534669" cy="351790"/>
-                  <wp:docPr id="3" name="Picture 3"/>
-                  <wp:cNvGraphicFramePr>
-                    <a:graphicFrameLocks noChangeAspect="1"/>
-                  </wp:cNvGraphicFramePr>
-                  <a:graphic>
-                    <a:graphicData uri="http://schemas.openxmlformats.org/drawingml/2006/picture">
-                      <pic:pic>
-                        <pic:nvPicPr>
-                          <pic:cNvPr id="0" name="image.png"/>
-                          <pic:cNvPicPr/>
-                        </pic:nvPicPr>
-                        <pic:blipFill>
-                          <a:blip r:embed="rId9"/>
-                          <a:stretch>
-                            <a:fillRect/>
-                          </a:stretch>
-                        </pic:blipFill>
-                        <pic:spPr>
-                          <a:xfrm>
-                            <a:off x="0" y="0"/>
-                            <a:ext cx="534669" cy="351790"/>
-                          </a:xfrm>
-                          <a:prstGeom prst="rect"/>
-                        </pic:spPr>
-                      </pic:pic>
-                    </a:graphicData>
-                  </a:graphic>
-                </wp:inline>
-              </w:drawing>
-            </w:r>
-          </w:p>
-        </w:tc>
-        <w:tc>
-          <w:tcPr>
-            <w:tcW w:type="dxa" w:w="7400"/>
-            <w:tcBorders>
-              <w:bottom w:sz="2.2639999389648438" w:val="single" w:color="#000000"/>
-            </w:tcBorders>
-            <w:tcMar>
-              <w:start w:w="0" w:type="dxa"/>
-              <w:end w:w="0" w:type="dxa"/>
-            </w:tcMar>
-          </w:tcPr>
-          <w:p>
-            <w:pPr>
-              <w:autoSpaceDN w:val="0"/>
-              <w:autoSpaceDE w:val="0"/>
-              <w:widowControl/>
-              <w:spacing w:line="256" w:lineRule="exact" w:before="150" w:after="0"/>
-              <w:ind w:left="438" w:right="0" w:firstLine="0"/>
-              <w:jc w:val="left"/>
-            </w:pPr>
-            <w:r>
-              <w:rPr>
-                <w:rFonts w:ascii="" w:hAnsi="" w:eastAsia=""/>
-                <w:b/>
-                <w:i w:val="0"/>
-                <w:color w:val="303030"/>
-                <w:sz w:val="22"/>
-              </w:rPr>
-              <w:t>AVALIAÇÃO PRÉVIA DE ESTUDO E PLANEJAMENTO DAS ATIVIDADES</w:t>
-            </w:r>
-          </w:p>
-        </w:tc>
-        <w:tc>
-          <w:tcPr>
-            <w:tcW w:type="dxa" w:w="1424"/>
-            <w:tcBorders>
-              <w:bottom w:sz="2.2639999389648438" w:val="single" w:color="#000000"/>
-            </w:tcBorders>
-            <w:tcMar>
-              <w:start w:w="0" w:type="dxa"/>
-              <w:end w:w="0" w:type="dxa"/>
-            </w:tcMar>
-          </w:tcPr>
-          <w:p>
-            <w:pPr>
-              <w:autoSpaceDN w:val="0"/>
-              <w:autoSpaceDE w:val="0"/>
-              <w:widowControl/>
-              <w:spacing w:line="232" w:lineRule="exact" w:before="188" w:after="0"/>
-              <w:ind w:left="212" w:right="0" w:firstLine="0"/>
-              <w:jc w:val="left"/>
-            </w:pPr>
-            <w:r>
-              <w:rPr>
-                <w:rFonts w:ascii="" w:hAnsi="" w:eastAsia=""/>
-                <w:b/>
-                <w:i w:val="0"/>
-                <w:color w:val="303030"/>
-                <w:sz w:val="20"/>
-              </w:rPr>
-              <w:t>{{data}}</w:t>
-            </w:r>
-          </w:p>
-        </w:tc>
-      </w:tr>
-    </w:tbl>
-    <w:p>
-      <w:pPr>
-        <w:autoSpaceDN w:val="0"/>
-        <w:autoSpaceDE w:val="0"/>
-        <w:widowControl/>
-        <w:spacing w:line="240" w:lineRule="auto" w:before="72" w:after="0"/>
-        <w:ind w:left="384" w:right="0" w:firstLine="0"/>
+        <w:pageBreakBefore/>
         <w:jc w:val="left"/>
       </w:pPr>
       <w:r>
         <w:drawing>
           <wp:inline xmlns:a="http://schemas.openxmlformats.org/drawingml/2006/main" xmlns:pic="http://schemas.openxmlformats.org/drawingml/2006/picture">
             <wp:extent cx="6516000" cy="7272000"/>
-            <wp:docPr id="4" name="Picture 4"/>
+            <wp:docPr id="3" name="Picture 3"/>
             <wp:cNvGraphicFramePr>
               <a:graphicFrameLocks noChangeAspect="1"/>
             </wp:cNvGraphicFramePr>
@@ -1761,7 +1249,7 @@
               <a:graphicData uri="http://schemas.openxmlformats.org/drawingml/2006/picture">
                 <pic:pic>
                   <pic:nvPicPr>
-                    <pic:cNvPr id="0" name="image.png"/>
+                    <pic:cNvPr id="0" name="orig_MODELO_CONSTRUÇÃO_rId11.png"/>
                     <pic:cNvPicPr/>
                   </pic:nvPicPr>
                   <pic:blipFill>
@@ -1787,160 +1275,255 @@
     <w:tbl>
       <w:tblPr>
         <w:tblW w:type="auto" w:w="0"/>
+        <w:jc w:val="center"/>
+        <w:tblLook w:firstColumn="1" w:firstRow="1" w:lastColumn="0" w:lastRow="0" w:noHBand="0" w:noVBand="1" w:val="04A0"/>
         <w:tblLayout w:type="fixed"/>
-        <w:tblLook w:firstColumn="1" w:firstRow="1" w:lastColumn="0" w:lastRow="0" w:noHBand="0" w:noVBand="1" w:val="04A0"/>
-        <w:tblInd w:w="106.00000000000001" w:type="dxa"/>
       </w:tblPr>
       <w:tblGrid>
-        <w:gridCol w:w="2796"/>
-        <w:gridCol w:w="2796"/>
-        <w:gridCol w:w="2796"/>
-        <w:gridCol w:w="2796"/>
+        <w:gridCol w:w="1417"/>
+        <w:gridCol w:w="7371"/>
+        <w:gridCol w:w="1417"/>
       </w:tblGrid>
       <w:tr>
-        <w:trPr>
-          <w:trHeight w:hRule="exact" w:val="370"/>
-        </w:trPr>
         <w:tc>
           <w:tcPr>
-            <w:tcW w:type="dxa" w:w="2690"/>
+            <w:tcW w:type="dxa" w:w="1417"/>
             <w:tcBorders>
-              <w:top w:sz="2.247999906539917" w:val="single" w:color="#CCCCCC"/>
+              <w:top w:val="single" w:sz="4" w:color="2F2F2F"/>
+              <w:left w:val="single" w:sz="4" w:color="2F2F2F"/>
+              <w:bottom w:val="single" w:sz="4" w:color="2F2F2F"/>
+              <w:right w:val="single" w:sz="4" w:color="2F2F2F"/>
             </w:tcBorders>
-            <w:tcMar>
-              <w:start w:w="0" w:type="dxa"/>
-              <w:end w:w="0" w:type="dxa"/>
-            </w:tcMar>
           </w:tcPr>
           <w:p>
             <w:pPr>
-              <w:autoSpaceDN w:val="0"/>
-              <w:autoSpaceDE w:val="0"/>
-              <w:widowControl/>
-              <w:spacing w:line="256" w:lineRule="exact" w:before="66" w:after="0"/>
-              <w:ind w:left="58" w:right="0" w:firstLine="0"/>
+              <w:spacing w:before="0" w:after="0"/>
               <w:jc w:val="left"/>
             </w:pPr>
             <w:r>
-              <w:rPr>
-                <w:rFonts w:ascii="" w:hAnsi="" w:eastAsia=""/>
-                <w:b/>
-                <w:i w:val="0"/>
-                <w:color w:val="303030"/>
-                <w:sz w:val="22"/>
-              </w:rPr>
-              <w:t xml:space="preserve">Membros da Equipe </w:t>
+              <w:drawing>
+                <wp:inline xmlns:a="http://schemas.openxmlformats.org/drawingml/2006/main" xmlns:pic="http://schemas.openxmlformats.org/drawingml/2006/picture">
+                  <wp:extent cx="503999" cy="342000"/>
+                  <wp:docPr id="4" name="Picture 4"/>
+                  <wp:cNvGraphicFramePr>
+                    <a:graphicFrameLocks noChangeAspect="1"/>
+                  </wp:cNvGraphicFramePr>
+                  <a:graphic>
+                    <a:graphicData uri="http://schemas.openxmlformats.org/drawingml/2006/picture">
+                      <pic:pic>
+                        <pic:nvPicPr>
+                          <pic:cNvPr id="0" name="orig_MODELO_CONSTRUÇÃO_rId9.png"/>
+                          <pic:cNvPicPr/>
+                        </pic:nvPicPr>
+                        <pic:blipFill>
+                          <a:blip r:embed="rId9"/>
+                          <a:stretch>
+                            <a:fillRect/>
+                          </a:stretch>
+                        </pic:blipFill>
+                        <pic:spPr>
+                          <a:xfrm>
+                            <a:off x="0" y="0"/>
+                            <a:ext cx="503999" cy="342000"/>
+                          </a:xfrm>
+                          <a:prstGeom prst="rect"/>
+                        </pic:spPr>
+                      </pic:pic>
+                    </a:graphicData>
+                  </a:graphic>
+                </wp:inline>
+              </w:drawing>
             </w:r>
           </w:p>
         </w:tc>
         <w:tc>
           <w:tcPr>
-            <w:tcW w:type="dxa" w:w="1100"/>
+            <w:tcW w:type="dxa" w:w="7371"/>
             <w:tcBorders>
-              <w:top w:sz="2.247999906539917" w:val="single" w:color="#CCCCCC"/>
-              <w:bottom w:sz="4.0" w:val="single" w:color="#2F2F2F"/>
+              <w:top w:val="single" w:sz="4" w:color="2F2F2F"/>
+              <w:left w:val="single" w:sz="4" w:color="2F2F2F"/>
+              <w:bottom w:val="single" w:sz="4" w:color="2F2F2F"/>
+              <w:right w:val="single" w:sz="4" w:color="2F2F2F"/>
             </w:tcBorders>
-            <w:tcMar>
-              <w:start w:w="0" w:type="dxa"/>
-              <w:end w:w="0" w:type="dxa"/>
-            </w:tcMar>
-            <w:tcMar>
-              <w:start w:w="0" w:type="dxa"/>
-              <w:end w:w="0" w:type="dxa"/>
-            </w:tcMar>
-            <w:tcMar>
-              <w:start w:w="0" w:type="dxa"/>
-              <w:end w:w="0" w:type="dxa"/>
-            </w:tcMar>
           </w:tcPr>
           <w:p>
             <w:pPr>
-              <w:autoSpaceDN w:val="0"/>
-              <w:autoSpaceDE w:val="0"/>
-              <w:widowControl/>
-              <w:spacing w:line="210" w:lineRule="exact" w:before="60" w:after="0"/>
-              <w:ind w:left="0" w:right="0" w:firstLine="0"/>
-              <w:jc w:val="right"/>
+              <w:spacing w:before="0" w:after="0"/>
+              <w:jc w:val="center"/>
             </w:pPr>
             <w:r>
               <w:rPr>
-                <w:rFonts w:ascii="" w:hAnsi="" w:eastAsia=""/>
+                <w:rFonts w:ascii="Arial" w:hAnsi="Arial"/>
                 <w:b/>
-                <w:i w:val="0"/>
-                <w:color w:val="303030"/>
-                <w:sz w:val="18"/>
+                <w:sz w:val="22"/>
               </w:rPr>
+              <w:t>AVALIAÇÃO PRÉVIA DE ESTUDO E PLANEJAMENTO DAS ATIVIDADES</w:t>
             </w:r>
           </w:p>
         </w:tc>
         <w:tc>
           <w:tcPr>
-            <w:tcW w:type="dxa" w:w="3324"/>
+            <w:tcW w:type="dxa" w:w="1417"/>
             <w:tcBorders>
-              <w:top w:sz="2.247999906539917" w:val="single" w:color="#CCCCCC"/>
+              <w:top w:val="single" w:sz="4" w:color="2F2F2F"/>
+              <w:left w:val="single" w:sz="4" w:color="2F2F2F"/>
+              <w:bottom w:val="single" w:sz="4" w:color="2F2F2F"/>
+              <w:right w:val="single" w:sz="4" w:color="2F2F2F"/>
             </w:tcBorders>
-            <w:tcMar>
-              <w:start w:w="0" w:type="dxa"/>
-              <w:end w:w="0" w:type="dxa"/>
-            </w:tcMar>
           </w:tcPr>
           <w:p>
             <w:pPr>
-              <w:autoSpaceDN w:val="0"/>
-              <w:autoSpaceDE w:val="0"/>
-              <w:widowControl/>
-              <w:spacing w:line="210" w:lineRule="exact" w:before="60" w:after="0"/>
-              <w:ind w:left="366" w:right="0" w:firstLine="0"/>
+              <w:spacing w:before="0" w:after="0"/>
+              <w:jc w:val="center"/>
+            </w:pPr>
+            <w:r>
+              <w:rPr>
+                <w:rFonts w:ascii="Arial" w:hAnsi="Arial"/>
+                <w:b w:val="0"/>
+                <w:sz w:val="20"/>
+              </w:rPr>
+              <w:t>{{data}}</w:t>
+            </w:r>
+          </w:p>
+        </w:tc>
+      </w:tr>
+    </w:tbl>
+    <w:tbl>
+      <w:tblPr>
+        <w:tblW w:type="auto" w:w="0"/>
+        <w:jc w:val="center"/>
+        <w:tblLook w:firstColumn="1" w:firstRow="1" w:lastColumn="0" w:lastRow="0" w:noHBand="0" w:noVBand="1" w:val="04A0"/>
+        <w:tblLayout w:type="fixed"/>
+      </w:tblPr>
+      <w:tblGrid>
+        <w:gridCol w:w="3969"/>
+        <w:gridCol w:w="2835"/>
+        <w:gridCol w:w="3402"/>
+      </w:tblGrid>
+      <w:tr>
+        <w:tc>
+          <w:tcPr>
+            <w:tcW w:type="dxa" w:w="6804"/>
+            <w:gridSpan w:val="2"/>
+            <w:tcBorders>
+              <w:top w:val="single" w:sz="4" w:color="2F2F2F"/>
+              <w:left w:val="single" w:sz="4" w:color="2F2F2F"/>
+              <w:bottom w:val="single" w:sz="4" w:color="2F2F2F"/>
+              <w:right w:val="single" w:sz="4" w:color="2F2F2F"/>
+            </w:tcBorders>
+          </w:tcPr>
+          <w:p>
+            <w:pPr>
+              <w:spacing w:before="0" w:after="0"/>
               <w:jc w:val="left"/>
             </w:pPr>
             <w:r>
               <w:rPr>
-                <w:rFonts w:ascii="" w:hAnsi="" w:eastAsia=""/>
+                <w:rFonts w:ascii="Arial" w:hAnsi="Arial"/>
                 <w:b/>
-                <w:i w:val="0"/>
-                <w:color w:val="303030"/>
-                <w:sz w:val="18"/>
+                <w:sz w:val="20"/>
+              </w:rPr>
+              <w:t>Membros da Equipe</w:t>
+            </w:r>
+          </w:p>
+        </w:tc>
+        <w:tc>
+          <w:tcPr>
+            <w:tcW w:type="dxa" w:w="3402"/>
+            <w:tcBorders>
+              <w:top w:val="single" w:sz="4" w:color="2F2F2F"/>
+              <w:left w:val="single" w:sz="4" w:color="2F2F2F"/>
+              <w:bottom w:val="single" w:sz="4" w:color="2F2F2F"/>
+              <w:right w:val="single" w:sz="4" w:color="2F2F2F"/>
+            </w:tcBorders>
+          </w:tcPr>
+          <w:p>
+            <w:pPr>
+              <w:spacing w:before="0" w:after="0"/>
+              <w:jc w:val="left"/>
+            </w:pPr>
+            <w:r>
+              <w:rPr>
+                <w:rFonts w:ascii="Arial" w:hAnsi="Arial"/>
+                <w:b/>
+                <w:sz w:val="20"/>
               </w:rPr>
               <w:t>O.S. Nr. : {{codigo}}</w:t>
             </w:r>
           </w:p>
         </w:tc>
+      </w:tr>
+      <w:tr>
         <w:tc>
           <w:tcPr>
-            <w:tcW w:type="dxa" w:w="3946"/>
+            <w:tcW w:type="dxa" w:w="3969"/>
             <w:tcBorders>
-              <w:top w:sz="2.247999906539917" w:val="single" w:color="#CCCCCC"/>
-              <w:bottom w:sz="4.0" w:val="single" w:color="#2F2F2F"/>
+              <w:top w:val="single" w:sz="4" w:color="2F2F2F"/>
+              <w:left w:val="single" w:sz="4" w:color="2F2F2F"/>
+              <w:bottom w:val="single" w:sz="4" w:color="2F2F2F"/>
+              <w:right w:val="single" w:sz="4" w:color="2F2F2F"/>
             </w:tcBorders>
-            <w:tcMar>
-              <w:start w:w="0" w:type="dxa"/>
-              <w:end w:w="0" w:type="dxa"/>
-            </w:tcMar>
-            <w:tcMar>
-              <w:start w:w="0" w:type="dxa"/>
-              <w:end w:w="0" w:type="dxa"/>
-            </w:tcMar>
-            <w:tcMar>
-              <w:start w:w="0" w:type="dxa"/>
-              <w:end w:w="0" w:type="dxa"/>
-            </w:tcMar>
           </w:tcPr>
           <w:p>
             <w:pPr>
-              <w:autoSpaceDN w:val="0"/>
-              <w:autoSpaceDE w:val="0"/>
-              <w:widowControl/>
-              <w:spacing w:line="186" w:lineRule="exact" w:before="452" w:after="0"/>
-              <w:ind w:left="0" w:right="0" w:firstLine="0"/>
+              <w:spacing w:before="0" w:after="0"/>
               <w:jc w:val="left"/>
             </w:pPr>
             <w:r>
               <w:rPr>
-                <w:rFonts w:ascii="" w:hAnsi="" w:eastAsia=""/>
-                <w:b w:val="0"/>
-                <w:i w:val="0"/>
-                <w:color w:val="303030"/>
-                <w:sz w:val="16"/>
+                <w:rFonts w:ascii="Arial" w:hAnsi="Arial"/>
+                <w:b/>
+                <w:sz w:val="20"/>
+              </w:rPr>
+              <w:t>Nome</w:t>
+            </w:r>
+          </w:p>
+        </w:tc>
+        <w:tc>
+          <w:tcPr>
+            <w:tcW w:type="dxa" w:w="2835"/>
+            <w:tcBorders>
+              <w:top w:val="single" w:sz="4" w:color="2F2F2F"/>
+              <w:left w:val="single" w:sz="4" w:color="2F2F2F"/>
+              <w:bottom w:val="single" w:sz="4" w:color="2F2F2F"/>
+              <w:right w:val="single" w:sz="4" w:color="2F2F2F"/>
+            </w:tcBorders>
+          </w:tcPr>
+          <w:p>
+            <w:pPr>
+              <w:spacing w:before="0" w:after="0"/>
+              <w:jc w:val="left"/>
+            </w:pPr>
+            <w:r>
+              <w:rPr>
+                <w:rFonts w:ascii="Arial" w:hAnsi="Arial"/>
+                <w:b/>
+                <w:sz w:val="20"/>
+              </w:rPr>
+              <w:t>Cargo</w:t>
+            </w:r>
+          </w:p>
+        </w:tc>
+        <w:tc>
+          <w:tcPr>
+            <w:tcW w:type="dxa" w:w="3402"/>
+            <w:tcBorders>
+              <w:top w:val="single" w:sz="4" w:color="2F2F2F"/>
+              <w:left w:val="single" w:sz="4" w:color="2F2F2F"/>
+              <w:bottom w:val="single" w:sz="4" w:color="2F2F2F"/>
+              <w:right w:val="single" w:sz="4" w:color="2F2F2F"/>
+            </w:tcBorders>
+          </w:tcPr>
+          <w:p>
+            <w:pPr>
+              <w:spacing w:before="0" w:after="0"/>
+              <w:jc w:val="left"/>
+            </w:pPr>
+            <w:r>
+              <w:rPr>
+                <w:rFonts w:ascii="Arial" w:hAnsi="Arial"/>
+                <w:b/>
+                <w:sz w:val="20"/>
               </w:rPr>
               <w:t>Assinatura</w:t>
             </w:r>
@@ -1949,192 +1532,209 @@
       </w:tr>
       <w:tr>
         <w:trPr>
-          <w:trHeight w:hRule="exact" w:val="360"/>
+          <w:trHeight w:val="113" w:hRule="exact"/>
         </w:trPr>
         <w:tc>
           <w:tcPr>
-            <w:tcW w:type="dxa" w:w="2690"/>
-            <w:tcBorders/>
-            <w:tcMar>
-              <w:start w:w="0" w:type="dxa"/>
-              <w:end w:w="0" w:type="dxa"/>
-            </w:tcMar>
+            <w:tcW w:type="dxa" w:w="3969"/>
+            <w:tcBorders>
+              <w:top w:val="single" w:sz="4" w:color="2F2F2F"/>
+              <w:left w:val="single" w:sz="4" w:color="2F2F2F"/>
+              <w:bottom w:val="single" w:sz="4" w:color="2F2F2F"/>
+              <w:right w:val="single" w:sz="4" w:color="2F2F2F"/>
+            </w:tcBorders>
           </w:tcPr>
           <w:p>
             <w:pPr>
-              <w:autoSpaceDN w:val="0"/>
-              <w:autoSpaceDE w:val="0"/>
-              <w:widowControl/>
-              <w:spacing w:line="186" w:lineRule="exact" w:before="84" w:after="0"/>
-              <w:ind w:left="58" w:right="0" w:firstLine="0"/>
+              <w:spacing w:before="0" w:after="0"/>
               <w:jc w:val="left"/>
             </w:pPr>
             <w:r>
               <w:rPr>
-                <w:rFonts w:ascii="" w:hAnsi="" w:eastAsia=""/>
+                <w:rFonts w:ascii="Arial" w:hAnsi="Arial"/>
                 <w:b w:val="0"/>
-                <w:i w:val="0"/>
-                <w:color w:val="303030"/>
-                <w:sz w:val="16"/>
+                <w:sz w:val="20"/>
               </w:rPr>
-              <w:t>Nome</w:t>
-            </w:r>
-          </w:p>
-        </w:tc>
-        <w:tc>
-          <w:tcPr>
-            <w:tcW w:type="dxa" w:w="2796"/>
-            <w:vMerge/>
-            <w:tcBorders>
-              <w:top w:sz="2.247999906539917" w:val="single" w:color="#CCCCCC"/>
-              <w:bottom w:sz="4.0" w:val="single" w:color="#2F2F2F"/>
-            </w:tcBorders>
-          </w:tcPr>
-          <w:p/>
-        </w:tc>
-        <w:tc>
-          <w:tcPr>
-            <w:tcW w:type="dxa" w:w="3324"/>
-            <w:tcBorders/>
-            <w:tcMar>
-              <w:start w:w="0" w:type="dxa"/>
-              <w:end w:w="0" w:type="dxa"/>
-            </w:tcMar>
-          </w:tcPr>
-          <w:p>
-            <w:pPr>
-              <w:autoSpaceDN w:val="0"/>
-              <w:autoSpaceDE w:val="0"/>
-              <w:widowControl/>
-              <w:spacing w:line="186" w:lineRule="exact" w:before="84" w:after="0"/>
-              <w:ind w:left="36" w:right="0" w:firstLine="0"/>
-              <w:jc w:val="left"/>
-            </w:pPr>
-            <w:r>
-              <w:rPr>
-                <w:rFonts w:ascii="" w:hAnsi="" w:eastAsia=""/>
-                <w:b w:val="0"/>
-                <w:i w:val="0"/>
-                <w:color w:val="303030"/>
-                <w:sz w:val="16"/>
-              </w:rPr>
-              <w:t>Cargo</w:t>
-            </w:r>
-          </w:p>
-        </w:tc>
-        <w:tc>
-          <w:tcPr>
-            <w:tcW w:type="dxa" w:w="2796"/>
-            <w:vMerge/>
-            <w:tcBorders>
-              <w:top w:sz="2.247999906539917" w:val="single" w:color="#CCCCCC"/>
-              <w:bottom w:sz="4.0" w:val="single" w:color="#2F2F2F"/>
-            </w:tcBorders>
-          </w:tcPr>
-          <w:p/>
-        </w:tc>
-      </w:tr>
-      <w:tr>
-        <w:tc>
-          <w:tcPr>
-            <w:tcW w:type="dxa" w:w="2796"/>
-          </w:tcPr>
-          <w:p>
-            <w:r>
               <w:t>{%tr for m in membros %}</w:t>
             </w:r>
           </w:p>
         </w:tc>
         <w:tc>
           <w:tcPr>
-            <w:tcW w:type="dxa" w:w="2796"/>
+            <w:tcW w:type="dxa" w:w="2835"/>
+            <w:tcBorders>
+              <w:top w:val="single" w:sz="4" w:color="2F2F2F"/>
+              <w:left w:val="single" w:sz="4" w:color="2F2F2F"/>
+              <w:bottom w:val="single" w:sz="4" w:color="2F2F2F"/>
+              <w:right w:val="single" w:sz="4" w:color="2F2F2F"/>
+            </w:tcBorders>
           </w:tcPr>
-          <w:p/>
+          <w:p>
+            <w:pPr>
+              <w:spacing w:before="0" w:after="0"/>
+              <w:jc w:val="left"/>
+            </w:pPr>
+          </w:p>
         </w:tc>
         <w:tc>
           <w:tcPr>
-            <w:tcW w:type="dxa" w:w="2796"/>
+            <w:tcW w:type="dxa" w:w="3402"/>
+            <w:tcBorders>
+              <w:top w:val="single" w:sz="4" w:color="2F2F2F"/>
+              <w:left w:val="single" w:sz="4" w:color="2F2F2F"/>
+              <w:bottom w:val="single" w:sz="4" w:color="2F2F2F"/>
+              <w:right w:val="single" w:sz="4" w:color="2F2F2F"/>
+            </w:tcBorders>
           </w:tcPr>
-          <w:p/>
-        </w:tc>
-        <w:tc>
-          <w:tcPr>
-            <w:tcW w:type="dxa" w:w="2796"/>
-          </w:tcPr>
-          <w:p/>
+          <w:p>
+            <w:pPr>
+              <w:spacing w:before="0" w:after="0"/>
+              <w:jc w:val="left"/>
+            </w:pPr>
+          </w:p>
         </w:tc>
       </w:tr>
       <w:tr>
+        <w:trPr>
+          <w:trHeight w:val="328" w:hRule="exact"/>
+        </w:trPr>
         <w:tc>
           <w:tcPr>
-            <w:tcW w:type="dxa" w:w="2796"/>
+            <w:tcW w:type="dxa" w:w="3969"/>
+            <w:tcBorders>
+              <w:top w:val="single" w:sz="4" w:color="2F2F2F"/>
+              <w:left w:val="single" w:sz="4" w:color="2F2F2F"/>
+              <w:bottom w:val="single" w:sz="4" w:color="2F2F2F"/>
+              <w:right w:val="single" w:sz="4" w:color="2F2F2F"/>
+            </w:tcBorders>
           </w:tcPr>
           <w:p>
+            <w:pPr>
+              <w:spacing w:before="0" w:after="0"/>
+              <w:jc w:val="left"/>
+            </w:pPr>
             <w:r>
+              <w:rPr>
+                <w:rFonts w:ascii="Arial" w:hAnsi="Arial"/>
+                <w:b w:val="0"/>
+                <w:sz w:val="20"/>
+              </w:rPr>
               <w:t>{{ m.nome }}</w:t>
             </w:r>
           </w:p>
         </w:tc>
         <w:tc>
           <w:tcPr>
-            <w:tcW w:type="dxa" w:w="2796"/>
+            <w:tcW w:type="dxa" w:w="2835"/>
+            <w:tcBorders>
+              <w:top w:val="single" w:sz="4" w:color="2F2F2F"/>
+              <w:left w:val="single" w:sz="4" w:color="2F2F2F"/>
+              <w:bottom w:val="single" w:sz="4" w:color="2F2F2F"/>
+              <w:right w:val="single" w:sz="4" w:color="2F2F2F"/>
+            </w:tcBorders>
           </w:tcPr>
           <w:p>
+            <w:pPr>
+              <w:spacing w:before="0" w:after="0"/>
+              <w:jc w:val="left"/>
+            </w:pPr>
             <w:r>
+              <w:rPr>
+                <w:rFonts w:ascii="Arial" w:hAnsi="Arial"/>
+                <w:b w:val="0"/>
+                <w:sz w:val="20"/>
+              </w:rPr>
               <w:t>{{ m.cargo }}</w:t>
             </w:r>
           </w:p>
         </w:tc>
         <w:tc>
           <w:tcPr>
-            <w:tcW w:type="dxa" w:w="2796"/>
+            <w:tcW w:type="dxa" w:w="3402"/>
+            <w:tcBorders>
+              <w:top w:val="single" w:sz="4" w:color="2F2F2F"/>
+              <w:left w:val="single" w:sz="4" w:color="2F2F2F"/>
+              <w:bottom w:val="single" w:sz="4" w:color="2F2F2F"/>
+              <w:right w:val="single" w:sz="4" w:color="2F2F2F"/>
+            </w:tcBorders>
           </w:tcPr>
           <w:p>
-            <w:r/>
+            <w:pPr>
+              <w:spacing w:before="0" w:after="0"/>
+              <w:jc w:val="left"/>
+            </w:pPr>
           </w:p>
-        </w:tc>
-        <w:tc>
-          <w:tcPr>
-            <w:tcW w:type="dxa" w:w="2796"/>
-          </w:tcPr>
-          <w:p/>
         </w:tc>
       </w:tr>
       <w:tr>
+        <w:trPr>
+          <w:trHeight w:val="113" w:hRule="exact"/>
+        </w:trPr>
         <w:tc>
           <w:tcPr>
-            <w:tcW w:type="dxa" w:w="2796"/>
+            <w:tcW w:type="dxa" w:w="3969"/>
+            <w:tcBorders>
+              <w:top w:val="single" w:sz="4" w:color="2F2F2F"/>
+              <w:left w:val="single" w:sz="4" w:color="2F2F2F"/>
+              <w:bottom w:val="single" w:sz="4" w:color="2F2F2F"/>
+              <w:right w:val="single" w:sz="4" w:color="2F2F2F"/>
+            </w:tcBorders>
           </w:tcPr>
           <w:p>
+            <w:pPr>
+              <w:spacing w:before="0" w:after="0"/>
+              <w:jc w:val="left"/>
+            </w:pPr>
             <w:r>
+              <w:rPr>
+                <w:rFonts w:ascii="Arial" w:hAnsi="Arial"/>
+                <w:b w:val="0"/>
+                <w:sz w:val="20"/>
+              </w:rPr>
               <w:t>{%tr endfor %}</w:t>
             </w:r>
           </w:p>
         </w:tc>
         <w:tc>
           <w:tcPr>
-            <w:tcW w:type="dxa" w:w="2796"/>
+            <w:tcW w:type="dxa" w:w="2835"/>
+            <w:tcBorders>
+              <w:top w:val="single" w:sz="4" w:color="2F2F2F"/>
+              <w:left w:val="single" w:sz="4" w:color="2F2F2F"/>
+              <w:bottom w:val="single" w:sz="4" w:color="2F2F2F"/>
+              <w:right w:val="single" w:sz="4" w:color="2F2F2F"/>
+            </w:tcBorders>
           </w:tcPr>
-          <w:p/>
+          <w:p>
+            <w:pPr>
+              <w:spacing w:before="0" w:after="0"/>
+              <w:jc w:val="left"/>
+            </w:pPr>
+          </w:p>
         </w:tc>
         <w:tc>
           <w:tcPr>
-            <w:tcW w:type="dxa" w:w="2796"/>
+            <w:tcW w:type="dxa" w:w="3402"/>
+            <w:tcBorders>
+              <w:top w:val="single" w:sz="4" w:color="2F2F2F"/>
+              <w:left w:val="single" w:sz="4" w:color="2F2F2F"/>
+              <w:bottom w:val="single" w:sz="4" w:color="2F2F2F"/>
+              <w:right w:val="single" w:sz="4" w:color="2F2F2F"/>
+            </w:tcBorders>
           </w:tcPr>
-          <w:p/>
-        </w:tc>
-        <w:tc>
-          <w:tcPr>
-            <w:tcW w:type="dxa" w:w="2796"/>
-          </w:tcPr>
-          <w:p/>
+          <w:p>
+            <w:pPr>
+              <w:spacing w:before="0" w:after="0"/>
+              <w:jc w:val="left"/>
+            </w:pPr>
+          </w:p>
         </w:tc>
       </w:tr>
     </w:tbl>
     <w:sectPr>
       <w:pgSz w:w="11906" w:h="16838"/>
-      <w:pgMar w:top="142" w:right="156" w:bottom="140" w:left="564" w:header="720" w:footer="720" w:gutter="0"/>
-      <w:cols/>
+      <w:pgMar w:top="680" w:right="850" w:bottom="680" w:left="850" w:header="720" w:footer="720" w:gutter="0"/>
+      <w:cols w:space="720"/>
       <w:docGrid w:linePitch="360"/>
     </w:sectPr>
   </w:body>

</xml_diff>